<commit_message>
Add branding assets and regenerate branded ajreport (04/10/2026)
- Add assets/branding/ (5 logos/badges extracted from the client Google Doc):
  aptech_logo.png (Operisoft large, per content-swap convention),
  operisoft_logo_large.png (Aptech banner), operisoft_logo_header.png,
  aws_partner_badge.png, aws_partner_cluster.png
- Regenerate ajreport_20261004.docx/.pdf: now fully branded (cover logos +
  per-page header). No more 'branding asset not found' warnings.
</commit_message>
<xml_diff>
--- a/ajreport_20261004.docx
+++ b/ajreport_20261004.docx
@@ -4,6 +4,46 @@
   <w:body>
     <w:p/>
     <w:p/>
+    <w:p>
+      <w:pPr>
+        <w:spacing w:before="0" w:after="120" w:line="240" w:lineRule="auto"/>
+        <w:jc w:val="center"/>
+      </w:pPr>
+      <w:r>
+        <w:drawing>
+          <wp:inline xmlns:a="http://schemas.openxmlformats.org/drawingml/2006/main" xmlns:pic="http://schemas.openxmlformats.org/drawingml/2006/picture">
+            <wp:extent cx="2743200" cy="1249767"/>
+            <wp:docPr id="1" name="Picture 1"/>
+            <wp:cNvGraphicFramePr>
+              <a:graphicFrameLocks noChangeAspect="1"/>
+            </wp:cNvGraphicFramePr>
+            <a:graphic>
+              <a:graphicData uri="http://schemas.openxmlformats.org/drawingml/2006/picture">
+                <pic:pic>
+                  <pic:nvPicPr>
+                    <pic:cNvPr id="0" name="aptech_logo.png"/>
+                    <pic:cNvPicPr/>
+                  </pic:nvPicPr>
+                  <pic:blipFill>
+                    <a:blip r:embed="rId10"/>
+                    <a:stretch>
+                      <a:fillRect/>
+                    </a:stretch>
+                  </pic:blipFill>
+                  <pic:spPr>
+                    <a:xfrm>
+                      <a:off x="0" y="0"/>
+                      <a:ext cx="2743200" cy="1249767"/>
+                    </a:xfrm>
+                    <a:prstGeom prst="rect"/>
+                  </pic:spPr>
+                </pic:pic>
+              </a:graphicData>
+            </a:graphic>
+          </wp:inline>
+        </w:drawing>
+      </w:r>
+    </w:p>
     <w:p>
       <w:pPr>
         <w:spacing w:before="120" w:after="120" w:line="240" w:lineRule="auto"/>
@@ -36,6 +76,46 @@
     </w:p>
     <w:p>
       <w:pPr>
+        <w:spacing w:before="0" w:after="120" w:line="240" w:lineRule="auto"/>
+        <w:jc w:val="center"/>
+      </w:pPr>
+      <w:r>
+        <w:drawing>
+          <wp:inline xmlns:a="http://schemas.openxmlformats.org/drawingml/2006/main" xmlns:pic="http://schemas.openxmlformats.org/drawingml/2006/picture">
+            <wp:extent cx="2377440" cy="968587"/>
+            <wp:docPr id="2" name="Picture 2"/>
+            <wp:cNvGraphicFramePr>
+              <a:graphicFrameLocks noChangeAspect="1"/>
+            </wp:cNvGraphicFramePr>
+            <a:graphic>
+              <a:graphicData uri="http://schemas.openxmlformats.org/drawingml/2006/picture">
+                <pic:pic>
+                  <pic:nvPicPr>
+                    <pic:cNvPr id="0" name="operisoft_logo_large.png"/>
+                    <pic:cNvPicPr/>
+                  </pic:nvPicPr>
+                  <pic:blipFill>
+                    <a:blip r:embed="rId11"/>
+                    <a:stretch>
+                      <a:fillRect/>
+                    </a:stretch>
+                  </pic:blipFill>
+                  <pic:spPr>
+                    <a:xfrm>
+                      <a:off x="0" y="0"/>
+                      <a:ext cx="2377440" cy="968587"/>
+                    </a:xfrm>
+                    <a:prstGeom prst="rect"/>
+                  </pic:spPr>
+                </pic:pic>
+              </a:graphicData>
+            </a:graphic>
+          </wp:inline>
+        </w:drawing>
+      </w:r>
+    </w:p>
+    <w:p>
+      <w:pPr>
         <w:spacing w:before="120" w:after="40"/>
         <w:jc w:val="center"/>
       </w:pPr>
@@ -77,6 +157,46 @@
           <w:sz w:val="22"/>
         </w:rPr>
         <w:t>04/10/2026</w:t>
+      </w:r>
+    </w:p>
+    <w:p>
+      <w:pPr>
+        <w:spacing w:before="0" w:after="120" w:line="240" w:lineRule="auto"/>
+        <w:jc w:val="center"/>
+      </w:pPr>
+      <w:r>
+        <w:drawing>
+          <wp:inline xmlns:a="http://schemas.openxmlformats.org/drawingml/2006/main" xmlns:pic="http://schemas.openxmlformats.org/drawingml/2006/picture">
+            <wp:extent cx="2377440" cy="977030"/>
+            <wp:docPr id="3" name="Picture 3"/>
+            <wp:cNvGraphicFramePr>
+              <a:graphicFrameLocks noChangeAspect="1"/>
+            </wp:cNvGraphicFramePr>
+            <a:graphic>
+              <a:graphicData uri="http://schemas.openxmlformats.org/drawingml/2006/picture">
+                <pic:pic>
+                  <pic:nvPicPr>
+                    <pic:cNvPr id="0" name="aws_partner_badge.png"/>
+                    <pic:cNvPicPr/>
+                  </pic:nvPicPr>
+                  <pic:blipFill>
+                    <a:blip r:embed="rId12"/>
+                    <a:stretch>
+                      <a:fillRect/>
+                    </a:stretch>
+                  </pic:blipFill>
+                  <pic:spPr>
+                    <a:xfrm>
+                      <a:off x="0" y="0"/>
+                      <a:ext cx="2377440" cy="977030"/>
+                    </a:xfrm>
+                    <a:prstGeom prst="rect"/>
+                  </pic:spPr>
+                </pic:pic>
+              </a:graphicData>
+            </a:graphic>
+          </wp:inline>
+        </w:drawing>
       </w:r>
     </w:p>
     <w:p>
@@ -3804,7 +3924,7 @@
         <w:drawing>
           <wp:inline xmlns:a="http://schemas.openxmlformats.org/drawingml/2006/main" xmlns:pic="http://schemas.openxmlformats.org/drawingml/2006/picture">
             <wp:extent cx="6309360" cy="2474259"/>
-            <wp:docPr id="1" name="Picture 1"/>
+            <wp:docPr id="4" name="Picture 4"/>
             <wp:cNvGraphicFramePr>
               <a:graphicFrameLocks noChangeAspect="1"/>
             </wp:cNvGraphicFramePr>
@@ -3816,7 +3936,7 @@
                     <pic:cNvPicPr/>
                   </pic:nvPicPr>
                   <pic:blipFill>
-                    <a:blip r:embed="rId10"/>
+                    <a:blip r:embed="rId13"/>
                     <a:stretch>
                       <a:fillRect/>
                     </a:stretch>
@@ -3844,7 +3964,7 @@
         <w:drawing>
           <wp:inline xmlns:a="http://schemas.openxmlformats.org/drawingml/2006/main" xmlns:pic="http://schemas.openxmlformats.org/drawingml/2006/picture">
             <wp:extent cx="6309360" cy="2152605"/>
-            <wp:docPr id="2" name="Picture 2"/>
+            <wp:docPr id="5" name="Picture 5"/>
             <wp:cNvGraphicFramePr>
               <a:graphicFrameLocks noChangeAspect="1"/>
             </wp:cNvGraphicFramePr>
@@ -3856,7 +3976,7 @@
                     <pic:cNvPicPr/>
                   </pic:nvPicPr>
                   <pic:blipFill>
-                    <a:blip r:embed="rId11"/>
+                    <a:blip r:embed="rId14"/>
                     <a:stretch>
                       <a:fillRect/>
                     </a:stretch>
@@ -4376,7 +4496,7 @@
         <w:drawing>
           <wp:inline xmlns:a="http://schemas.openxmlformats.org/drawingml/2006/main" xmlns:pic="http://schemas.openxmlformats.org/drawingml/2006/picture">
             <wp:extent cx="6309360" cy="2474259"/>
-            <wp:docPr id="3" name="Picture 3"/>
+            <wp:docPr id="6" name="Picture 6"/>
             <wp:cNvGraphicFramePr>
               <a:graphicFrameLocks noChangeAspect="1"/>
             </wp:cNvGraphicFramePr>
@@ -4388,7 +4508,7 @@
                     <pic:cNvPicPr/>
                   </pic:nvPicPr>
                   <pic:blipFill>
-                    <a:blip r:embed="rId12"/>
+                    <a:blip r:embed="rId15"/>
                     <a:stretch>
                       <a:fillRect/>
                     </a:stretch>
@@ -4416,7 +4536,7 @@
         <w:drawing>
           <wp:inline xmlns:a="http://schemas.openxmlformats.org/drawingml/2006/main" xmlns:pic="http://schemas.openxmlformats.org/drawingml/2006/picture">
             <wp:extent cx="6309360" cy="2313432"/>
-            <wp:docPr id="4" name="Picture 4"/>
+            <wp:docPr id="7" name="Picture 7"/>
             <wp:cNvGraphicFramePr>
               <a:graphicFrameLocks noChangeAspect="1"/>
             </wp:cNvGraphicFramePr>
@@ -4428,7 +4548,7 @@
                     <pic:cNvPicPr/>
                   </pic:nvPicPr>
                   <pic:blipFill>
-                    <a:blip r:embed="rId13"/>
+                    <a:blip r:embed="rId16"/>
                     <a:stretch>
                       <a:fillRect/>
                     </a:stretch>
@@ -5057,7 +5177,7 @@
         <w:drawing>
           <wp:inline xmlns:a="http://schemas.openxmlformats.org/drawingml/2006/main" xmlns:pic="http://schemas.openxmlformats.org/drawingml/2006/picture">
             <wp:extent cx="6309360" cy="2474259"/>
-            <wp:docPr id="5" name="Picture 5"/>
+            <wp:docPr id="8" name="Picture 8"/>
             <wp:cNvGraphicFramePr>
               <a:graphicFrameLocks noChangeAspect="1"/>
             </wp:cNvGraphicFramePr>
@@ -5069,7 +5189,7 @@
                     <pic:cNvPicPr/>
                   </pic:nvPicPr>
                   <pic:blipFill>
-                    <a:blip r:embed="rId14"/>
+                    <a:blip r:embed="rId17"/>
                     <a:stretch>
                       <a:fillRect/>
                     </a:stretch>
@@ -5097,7 +5217,7 @@
         <w:drawing>
           <wp:inline xmlns:a="http://schemas.openxmlformats.org/drawingml/2006/main" xmlns:pic="http://schemas.openxmlformats.org/drawingml/2006/picture">
             <wp:extent cx="6309360" cy="2313432"/>
-            <wp:docPr id="6" name="Picture 6"/>
+            <wp:docPr id="9" name="Picture 9"/>
             <wp:cNvGraphicFramePr>
               <a:graphicFrameLocks noChangeAspect="1"/>
             </wp:cNvGraphicFramePr>
@@ -5109,7 +5229,7 @@
                     <pic:cNvPicPr/>
                   </pic:nvPicPr>
                   <pic:blipFill>
-                    <a:blip r:embed="rId15"/>
+                    <a:blip r:embed="rId18"/>
                     <a:stretch>
                       <a:fillRect/>
                     </a:stretch>
@@ -5339,7 +5459,7 @@
         <w:drawing>
           <wp:inline xmlns:a="http://schemas.openxmlformats.org/drawingml/2006/main" xmlns:pic="http://schemas.openxmlformats.org/drawingml/2006/picture">
             <wp:extent cx="6309360" cy="2474259"/>
-            <wp:docPr id="7" name="Picture 7"/>
+            <wp:docPr id="10" name="Picture 10"/>
             <wp:cNvGraphicFramePr>
               <a:graphicFrameLocks noChangeAspect="1"/>
             </wp:cNvGraphicFramePr>
@@ -5351,7 +5471,7 @@
                     <pic:cNvPicPr/>
                   </pic:nvPicPr>
                   <pic:blipFill>
-                    <a:blip r:embed="rId16"/>
+                    <a:blip r:embed="rId19"/>
                     <a:stretch>
                       <a:fillRect/>
                     </a:stretch>
@@ -5379,7 +5499,7 @@
         <w:drawing>
           <wp:inline xmlns:a="http://schemas.openxmlformats.org/drawingml/2006/main" xmlns:pic="http://schemas.openxmlformats.org/drawingml/2006/picture">
             <wp:extent cx="6309360" cy="2795912"/>
-            <wp:docPr id="8" name="Picture 8"/>
+            <wp:docPr id="11" name="Picture 11"/>
             <wp:cNvGraphicFramePr>
               <a:graphicFrameLocks noChangeAspect="1"/>
             </wp:cNvGraphicFramePr>
@@ -5391,7 +5511,7 @@
                     <pic:cNvPicPr/>
                   </pic:nvPicPr>
                   <pic:blipFill>
-                    <a:blip r:embed="rId17"/>
+                    <a:blip r:embed="rId20"/>
                     <a:stretch>
                       <a:fillRect/>
                     </a:stretch>
@@ -5911,7 +6031,7 @@
         <w:drawing>
           <wp:inline xmlns:a="http://schemas.openxmlformats.org/drawingml/2006/main" xmlns:pic="http://schemas.openxmlformats.org/drawingml/2006/picture">
             <wp:extent cx="5986210" cy="2347533"/>
-            <wp:docPr id="9" name="Picture 9"/>
+            <wp:docPr id="12" name="Picture 12"/>
             <wp:cNvGraphicFramePr>
               <a:graphicFrameLocks noChangeAspect="1"/>
             </wp:cNvGraphicFramePr>
@@ -5923,7 +6043,7 @@
                     <pic:cNvPicPr/>
                   </pic:nvPicPr>
                   <pic:blipFill>
-                    <a:blip r:embed="rId18"/>
+                    <a:blip r:embed="rId21"/>
                     <a:stretch>
                       <a:fillRect/>
                     </a:stretch>
@@ -5951,7 +6071,7 @@
         <w:drawing>
           <wp:inline xmlns:a="http://schemas.openxmlformats.org/drawingml/2006/main" xmlns:pic="http://schemas.openxmlformats.org/drawingml/2006/picture">
             <wp:extent cx="5986210" cy="3110482"/>
-            <wp:docPr id="10" name="Picture 10"/>
+            <wp:docPr id="13" name="Picture 13"/>
             <wp:cNvGraphicFramePr>
               <a:graphicFrameLocks noChangeAspect="1"/>
             </wp:cNvGraphicFramePr>
@@ -5963,7 +6083,7 @@
                     <pic:cNvPicPr/>
                   </pic:nvPicPr>
                   <pic:blipFill>
-                    <a:blip r:embed="rId19"/>
+                    <a:blip r:embed="rId22"/>
                     <a:stretch>
                       <a:fillRect/>
                     </a:stretch>
@@ -6426,7 +6546,7 @@
         <w:drawing>
           <wp:inline xmlns:a="http://schemas.openxmlformats.org/drawingml/2006/main" xmlns:pic="http://schemas.openxmlformats.org/drawingml/2006/picture">
             <wp:extent cx="6309360" cy="2474259"/>
-            <wp:docPr id="11" name="Picture 11"/>
+            <wp:docPr id="14" name="Picture 14"/>
             <wp:cNvGraphicFramePr>
               <a:graphicFrameLocks noChangeAspect="1"/>
             </wp:cNvGraphicFramePr>
@@ -6438,7 +6558,7 @@
                     <pic:cNvPicPr/>
                   </pic:nvPicPr>
                   <pic:blipFill>
-                    <a:blip r:embed="rId20"/>
+                    <a:blip r:embed="rId23"/>
                     <a:stretch>
                       <a:fillRect/>
                     </a:stretch>
@@ -6466,7 +6586,7 @@
         <w:drawing>
           <wp:inline xmlns:a="http://schemas.openxmlformats.org/drawingml/2006/main" xmlns:pic="http://schemas.openxmlformats.org/drawingml/2006/picture">
             <wp:extent cx="6309360" cy="2152605"/>
-            <wp:docPr id="12" name="Picture 12"/>
+            <wp:docPr id="15" name="Picture 15"/>
             <wp:cNvGraphicFramePr>
               <a:graphicFrameLocks noChangeAspect="1"/>
             </wp:cNvGraphicFramePr>
@@ -6478,7 +6598,7 @@
                     <pic:cNvPicPr/>
                   </pic:nvPicPr>
                   <pic:blipFill>
-                    <a:blip r:embed="rId21"/>
+                    <a:blip r:embed="rId24"/>
                     <a:stretch>
                       <a:fillRect/>
                     </a:stretch>
@@ -6708,7 +6828,7 @@
         <w:drawing>
           <wp:inline xmlns:a="http://schemas.openxmlformats.org/drawingml/2006/main" xmlns:pic="http://schemas.openxmlformats.org/drawingml/2006/picture">
             <wp:extent cx="6309360" cy="2474259"/>
-            <wp:docPr id="13" name="Picture 13"/>
+            <wp:docPr id="16" name="Picture 16"/>
             <wp:cNvGraphicFramePr>
               <a:graphicFrameLocks noChangeAspect="1"/>
             </wp:cNvGraphicFramePr>
@@ -6720,7 +6840,7 @@
                     <pic:cNvPicPr/>
                   </pic:nvPicPr>
                   <pic:blipFill>
-                    <a:blip r:embed="rId22"/>
+                    <a:blip r:embed="rId25"/>
                     <a:stretch>
                       <a:fillRect/>
                     </a:stretch>
@@ -6748,7 +6868,7 @@
         <w:drawing>
           <wp:inline xmlns:a="http://schemas.openxmlformats.org/drawingml/2006/main" xmlns:pic="http://schemas.openxmlformats.org/drawingml/2006/picture">
             <wp:extent cx="6309360" cy="2152605"/>
-            <wp:docPr id="14" name="Picture 14"/>
+            <wp:docPr id="17" name="Picture 17"/>
             <wp:cNvGraphicFramePr>
               <a:graphicFrameLocks noChangeAspect="1"/>
             </wp:cNvGraphicFramePr>
@@ -6760,7 +6880,7 @@
                     <pic:cNvPicPr/>
                   </pic:nvPicPr>
                   <pic:blipFill>
-                    <a:blip r:embed="rId23"/>
+                    <a:blip r:embed="rId26"/>
                     <a:stretch>
                       <a:fillRect/>
                     </a:stretch>
@@ -7306,7 +7426,7 @@
         <w:drawing>
           <wp:inline xmlns:a="http://schemas.openxmlformats.org/drawingml/2006/main" xmlns:pic="http://schemas.openxmlformats.org/drawingml/2006/picture">
             <wp:extent cx="6309360" cy="2474259"/>
-            <wp:docPr id="15" name="Picture 15"/>
+            <wp:docPr id="18" name="Picture 18"/>
             <wp:cNvGraphicFramePr>
               <a:graphicFrameLocks noChangeAspect="1"/>
             </wp:cNvGraphicFramePr>
@@ -7318,7 +7438,7 @@
                     <pic:cNvPicPr/>
                   </pic:nvPicPr>
                   <pic:blipFill>
-                    <a:blip r:embed="rId24"/>
+                    <a:blip r:embed="rId27"/>
                     <a:stretch>
                       <a:fillRect/>
                     </a:stretch>
@@ -7346,7 +7466,7 @@
         <w:drawing>
           <wp:inline xmlns:a="http://schemas.openxmlformats.org/drawingml/2006/main" xmlns:pic="http://schemas.openxmlformats.org/drawingml/2006/picture">
             <wp:extent cx="6309360" cy="1670125"/>
-            <wp:docPr id="16" name="Picture 16"/>
+            <wp:docPr id="19" name="Picture 19"/>
             <wp:cNvGraphicFramePr>
               <a:graphicFrameLocks noChangeAspect="1"/>
             </wp:cNvGraphicFramePr>
@@ -7358,7 +7478,7 @@
                     <pic:cNvPicPr/>
                   </pic:nvPicPr>
                   <pic:blipFill>
-                    <a:blip r:embed="rId25"/>
+                    <a:blip r:embed="rId28"/>
                     <a:stretch>
                       <a:fillRect/>
                     </a:stretch>
@@ -7961,7 +8081,7 @@
         <w:drawing>
           <wp:inline xmlns:a="http://schemas.openxmlformats.org/drawingml/2006/main" xmlns:pic="http://schemas.openxmlformats.org/drawingml/2006/picture">
             <wp:extent cx="6309360" cy="2474259"/>
-            <wp:docPr id="17" name="Picture 17"/>
+            <wp:docPr id="20" name="Picture 20"/>
             <wp:cNvGraphicFramePr>
               <a:graphicFrameLocks noChangeAspect="1"/>
             </wp:cNvGraphicFramePr>
@@ -7973,7 +8093,7 @@
                     <pic:cNvPicPr/>
                   </pic:nvPicPr>
                   <pic:blipFill>
-                    <a:blip r:embed="rId26"/>
+                    <a:blip r:embed="rId29"/>
                     <a:stretch>
                       <a:fillRect/>
                     </a:stretch>
@@ -8001,7 +8121,7 @@
         <w:drawing>
           <wp:inline xmlns:a="http://schemas.openxmlformats.org/drawingml/2006/main" xmlns:pic="http://schemas.openxmlformats.org/drawingml/2006/picture">
             <wp:extent cx="6309360" cy="1991778"/>
-            <wp:docPr id="18" name="Picture 18"/>
+            <wp:docPr id="21" name="Picture 21"/>
             <wp:cNvGraphicFramePr>
               <a:graphicFrameLocks noChangeAspect="1"/>
             </wp:cNvGraphicFramePr>
@@ -8013,7 +8133,7 @@
                     <pic:cNvPicPr/>
                   </pic:nvPicPr>
                   <pic:blipFill>
-                    <a:blip r:embed="rId27"/>
+                    <a:blip r:embed="rId30"/>
                     <a:stretch>
                       <a:fillRect/>
                     </a:stretch>
@@ -8269,7 +8389,7 @@
         <w:drawing>
           <wp:inline xmlns:a="http://schemas.openxmlformats.org/drawingml/2006/main" xmlns:pic="http://schemas.openxmlformats.org/drawingml/2006/picture">
             <wp:extent cx="6309360" cy="2474259"/>
-            <wp:docPr id="19" name="Picture 19"/>
+            <wp:docPr id="22" name="Picture 22"/>
             <wp:cNvGraphicFramePr>
               <a:graphicFrameLocks noChangeAspect="1"/>
             </wp:cNvGraphicFramePr>
@@ -8281,7 +8401,7 @@
                     <pic:cNvPicPr/>
                   </pic:nvPicPr>
                   <pic:blipFill>
-                    <a:blip r:embed="rId28"/>
+                    <a:blip r:embed="rId31"/>
                     <a:stretch>
                       <a:fillRect/>
                     </a:stretch>
@@ -8309,7 +8429,7 @@
         <w:drawing>
           <wp:inline xmlns:a="http://schemas.openxmlformats.org/drawingml/2006/main" xmlns:pic="http://schemas.openxmlformats.org/drawingml/2006/picture">
             <wp:extent cx="6309360" cy="1670125"/>
-            <wp:docPr id="20" name="Picture 20"/>
+            <wp:docPr id="23" name="Picture 23"/>
             <wp:cNvGraphicFramePr>
               <a:graphicFrameLocks noChangeAspect="1"/>
             </wp:cNvGraphicFramePr>
@@ -8321,7 +8441,7 @@
                     <pic:cNvPicPr/>
                   </pic:nvPicPr>
                   <pic:blipFill>
-                    <a:blip r:embed="rId29"/>
+                    <a:blip r:embed="rId32"/>
                     <a:stretch>
                       <a:fillRect/>
                     </a:stretch>
@@ -8758,7 +8878,7 @@
         <w:drawing>
           <wp:inline xmlns:a="http://schemas.openxmlformats.org/drawingml/2006/main" xmlns:pic="http://schemas.openxmlformats.org/drawingml/2006/picture">
             <wp:extent cx="6068533" cy="2379817"/>
-            <wp:docPr id="21" name="Picture 21"/>
+            <wp:docPr id="24" name="Picture 24"/>
             <wp:cNvGraphicFramePr>
               <a:graphicFrameLocks noChangeAspect="1"/>
             </wp:cNvGraphicFramePr>
@@ -8770,7 +8890,7 @@
                     <pic:cNvPicPr/>
                   </pic:nvPicPr>
                   <pic:blipFill>
-                    <a:blip r:embed="rId30"/>
+                    <a:blip r:embed="rId33"/>
                     <a:stretch>
                       <a:fillRect/>
                     </a:stretch>
@@ -8798,7 +8918,7 @@
         <w:drawing>
           <wp:inline xmlns:a="http://schemas.openxmlformats.org/drawingml/2006/main" xmlns:pic="http://schemas.openxmlformats.org/drawingml/2006/picture">
             <wp:extent cx="6068533" cy="2998569"/>
-            <wp:docPr id="22" name="Picture 22"/>
+            <wp:docPr id="25" name="Picture 25"/>
             <wp:cNvGraphicFramePr>
               <a:graphicFrameLocks noChangeAspect="1"/>
             </wp:cNvGraphicFramePr>
@@ -8810,7 +8930,7 @@
                     <pic:cNvPicPr/>
                   </pic:nvPicPr>
                   <pic:blipFill>
-                    <a:blip r:embed="rId31"/>
+                    <a:blip r:embed="rId34"/>
                     <a:stretch>
                       <a:fillRect/>
                     </a:stretch>
@@ -9330,7 +9450,7 @@
         <w:drawing>
           <wp:inline xmlns:a="http://schemas.openxmlformats.org/drawingml/2006/main" xmlns:pic="http://schemas.openxmlformats.org/drawingml/2006/picture">
             <wp:extent cx="6309360" cy="2474259"/>
-            <wp:docPr id="23" name="Picture 23"/>
+            <wp:docPr id="26" name="Picture 26"/>
             <wp:cNvGraphicFramePr>
               <a:graphicFrameLocks noChangeAspect="1"/>
             </wp:cNvGraphicFramePr>
@@ -9342,7 +9462,7 @@
                     <pic:cNvPicPr/>
                   </pic:nvPicPr>
                   <pic:blipFill>
-                    <a:blip r:embed="rId32"/>
+                    <a:blip r:embed="rId35"/>
                     <a:stretch>
                       <a:fillRect/>
                     </a:stretch>
@@ -9370,7 +9490,7 @@
         <w:drawing>
           <wp:inline xmlns:a="http://schemas.openxmlformats.org/drawingml/2006/main" xmlns:pic="http://schemas.openxmlformats.org/drawingml/2006/picture">
             <wp:extent cx="6309360" cy="2313432"/>
-            <wp:docPr id="24" name="Picture 24"/>
+            <wp:docPr id="27" name="Picture 27"/>
             <wp:cNvGraphicFramePr>
               <a:graphicFrameLocks noChangeAspect="1"/>
             </wp:cNvGraphicFramePr>
@@ -9382,7 +9502,7 @@
                     <pic:cNvPicPr/>
                   </pic:nvPicPr>
                   <pic:blipFill>
-                    <a:blip r:embed="rId33"/>
+                    <a:blip r:embed="rId36"/>
                     <a:stretch>
                       <a:fillRect/>
                     </a:stretch>
@@ -9612,7 +9732,7 @@
         <w:drawing>
           <wp:inline xmlns:a="http://schemas.openxmlformats.org/drawingml/2006/main" xmlns:pic="http://schemas.openxmlformats.org/drawingml/2006/picture">
             <wp:extent cx="6198686" cy="2430857"/>
-            <wp:docPr id="25" name="Picture 25"/>
+            <wp:docPr id="28" name="Picture 28"/>
             <wp:cNvGraphicFramePr>
               <a:graphicFrameLocks noChangeAspect="1"/>
             </wp:cNvGraphicFramePr>
@@ -9624,7 +9744,7 @@
                     <pic:cNvPicPr/>
                   </pic:nvPicPr>
                   <pic:blipFill>
-                    <a:blip r:embed="rId34"/>
+                    <a:blip r:embed="rId37"/>
                     <a:stretch>
                       <a:fillRect/>
                     </a:stretch>
@@ -9652,7 +9772,7 @@
         <w:drawing>
           <wp:inline xmlns:a="http://schemas.openxmlformats.org/drawingml/2006/main" xmlns:pic="http://schemas.openxmlformats.org/drawingml/2006/picture">
             <wp:extent cx="6198686" cy="2746868"/>
-            <wp:docPr id="26" name="Picture 26"/>
+            <wp:docPr id="29" name="Picture 29"/>
             <wp:cNvGraphicFramePr>
               <a:graphicFrameLocks noChangeAspect="1"/>
             </wp:cNvGraphicFramePr>
@@ -9664,7 +9784,7 @@
                     <pic:cNvPicPr/>
                   </pic:nvPicPr>
                   <pic:blipFill>
-                    <a:blip r:embed="rId35"/>
+                    <a:blip r:embed="rId38"/>
                     <a:stretch>
                       <a:fillRect/>
                     </a:stretch>
@@ -10210,7 +10330,7 @@
         <w:drawing>
           <wp:inline xmlns:a="http://schemas.openxmlformats.org/drawingml/2006/main" xmlns:pic="http://schemas.openxmlformats.org/drawingml/2006/picture">
             <wp:extent cx="6248239" cy="2450290"/>
-            <wp:docPr id="27" name="Picture 27"/>
+            <wp:docPr id="30" name="Picture 30"/>
             <wp:cNvGraphicFramePr>
               <a:graphicFrameLocks noChangeAspect="1"/>
             </wp:cNvGraphicFramePr>
@@ -10222,7 +10342,7 @@
                     <pic:cNvPicPr/>
                   </pic:nvPicPr>
                   <pic:blipFill>
-                    <a:blip r:embed="rId36"/>
+                    <a:blip r:embed="rId39"/>
                     <a:stretch>
                       <a:fillRect/>
                     </a:stretch>
@@ -10250,7 +10370,7 @@
         <w:drawing>
           <wp:inline xmlns:a="http://schemas.openxmlformats.org/drawingml/2006/main" xmlns:pic="http://schemas.openxmlformats.org/drawingml/2006/picture">
             <wp:extent cx="6248239" cy="2928096"/>
-            <wp:docPr id="28" name="Picture 28"/>
+            <wp:docPr id="31" name="Picture 31"/>
             <wp:cNvGraphicFramePr>
               <a:graphicFrameLocks noChangeAspect="1"/>
             </wp:cNvGraphicFramePr>
@@ -10262,7 +10382,7 @@
                     <pic:cNvPicPr/>
                   </pic:nvPicPr>
                   <pic:blipFill>
-                    <a:blip r:embed="rId37"/>
+                    <a:blip r:embed="rId40"/>
                     <a:stretch>
                       <a:fillRect/>
                     </a:stretch>
@@ -10782,7 +10902,7 @@
         <w:drawing>
           <wp:inline xmlns:a="http://schemas.openxmlformats.org/drawingml/2006/main" xmlns:pic="http://schemas.openxmlformats.org/drawingml/2006/picture">
             <wp:extent cx="6309360" cy="2474259"/>
-            <wp:docPr id="29" name="Picture 29"/>
+            <wp:docPr id="32" name="Picture 32"/>
             <wp:cNvGraphicFramePr>
               <a:graphicFrameLocks noChangeAspect="1"/>
             </wp:cNvGraphicFramePr>
@@ -10794,7 +10914,7 @@
                     <pic:cNvPicPr/>
                   </pic:nvPicPr>
                   <pic:blipFill>
-                    <a:blip r:embed="rId38"/>
+                    <a:blip r:embed="rId41"/>
                     <a:stretch>
                       <a:fillRect/>
                     </a:stretch>
@@ -10822,7 +10942,7 @@
         <w:drawing>
           <wp:inline xmlns:a="http://schemas.openxmlformats.org/drawingml/2006/main" xmlns:pic="http://schemas.openxmlformats.org/drawingml/2006/picture">
             <wp:extent cx="6309360" cy="2474259"/>
-            <wp:docPr id="30" name="Picture 30"/>
+            <wp:docPr id="33" name="Picture 33"/>
             <wp:cNvGraphicFramePr>
               <a:graphicFrameLocks noChangeAspect="1"/>
             </wp:cNvGraphicFramePr>
@@ -10834,7 +10954,7 @@
                     <pic:cNvPicPr/>
                   </pic:nvPicPr>
                   <pic:blipFill>
-                    <a:blip r:embed="rId39"/>
+                    <a:blip r:embed="rId42"/>
                     <a:stretch>
                       <a:fillRect/>
                     </a:stretch>
@@ -11064,7 +11184,7 @@
         <w:drawing>
           <wp:inline xmlns:a="http://schemas.openxmlformats.org/drawingml/2006/main" xmlns:pic="http://schemas.openxmlformats.org/drawingml/2006/picture">
             <wp:extent cx="6309360" cy="2474259"/>
-            <wp:docPr id="31" name="Picture 31"/>
+            <wp:docPr id="34" name="Picture 34"/>
             <wp:cNvGraphicFramePr>
               <a:graphicFrameLocks noChangeAspect="1"/>
             </wp:cNvGraphicFramePr>
@@ -11076,7 +11196,7 @@
                     <pic:cNvPicPr/>
                   </pic:nvPicPr>
                   <pic:blipFill>
-                    <a:blip r:embed="rId40"/>
+                    <a:blip r:embed="rId43"/>
                     <a:stretch>
                       <a:fillRect/>
                     </a:stretch>
@@ -11104,7 +11224,7 @@
         <w:drawing>
           <wp:inline xmlns:a="http://schemas.openxmlformats.org/drawingml/2006/main" xmlns:pic="http://schemas.openxmlformats.org/drawingml/2006/picture">
             <wp:extent cx="6309360" cy="2313432"/>
-            <wp:docPr id="32" name="Picture 32"/>
+            <wp:docPr id="35" name="Picture 35"/>
             <wp:cNvGraphicFramePr>
               <a:graphicFrameLocks noChangeAspect="1"/>
             </wp:cNvGraphicFramePr>
@@ -11116,7 +11236,7 @@
                     <pic:cNvPicPr/>
                   </pic:nvPicPr>
                   <pic:blipFill>
-                    <a:blip r:embed="rId41"/>
+                    <a:blip r:embed="rId44"/>
                     <a:stretch>
                       <a:fillRect/>
                     </a:stretch>
@@ -11636,7 +11756,7 @@
         <w:drawing>
           <wp:inline xmlns:a="http://schemas.openxmlformats.org/drawingml/2006/main" xmlns:pic="http://schemas.openxmlformats.org/drawingml/2006/picture">
             <wp:extent cx="6309360" cy="2474259"/>
-            <wp:docPr id="33" name="Picture 33"/>
+            <wp:docPr id="36" name="Picture 36"/>
             <wp:cNvGraphicFramePr>
               <a:graphicFrameLocks noChangeAspect="1"/>
             </wp:cNvGraphicFramePr>
@@ -11648,7 +11768,7 @@
                     <pic:cNvPicPr/>
                   </pic:nvPicPr>
                   <pic:blipFill>
-                    <a:blip r:embed="rId42"/>
+                    <a:blip r:embed="rId45"/>
                     <a:stretch>
                       <a:fillRect/>
                     </a:stretch>
@@ -11676,7 +11796,7 @@
         <w:drawing>
           <wp:inline xmlns:a="http://schemas.openxmlformats.org/drawingml/2006/main" xmlns:pic="http://schemas.openxmlformats.org/drawingml/2006/picture">
             <wp:extent cx="6309360" cy="1830952"/>
-            <wp:docPr id="34" name="Picture 34"/>
+            <wp:docPr id="37" name="Picture 37"/>
             <wp:cNvGraphicFramePr>
               <a:graphicFrameLocks noChangeAspect="1"/>
             </wp:cNvGraphicFramePr>
@@ -11688,7 +11808,7 @@
                     <pic:cNvPicPr/>
                   </pic:nvPicPr>
                   <pic:blipFill>
-                    <a:blip r:embed="rId43"/>
+                    <a:blip r:embed="rId46"/>
                     <a:stretch>
                       <a:fillRect/>
                     </a:stretch>
@@ -12234,7 +12354,7 @@
         <w:drawing>
           <wp:inline xmlns:a="http://schemas.openxmlformats.org/drawingml/2006/main" xmlns:pic="http://schemas.openxmlformats.org/drawingml/2006/picture">
             <wp:extent cx="6309360" cy="2474259"/>
-            <wp:docPr id="35" name="Picture 35"/>
+            <wp:docPr id="38" name="Picture 38"/>
             <wp:cNvGraphicFramePr>
               <a:graphicFrameLocks noChangeAspect="1"/>
             </wp:cNvGraphicFramePr>
@@ -12246,7 +12366,7 @@
                     <pic:cNvPicPr/>
                   </pic:nvPicPr>
                   <pic:blipFill>
-                    <a:blip r:embed="rId44"/>
+                    <a:blip r:embed="rId47"/>
                     <a:stretch>
                       <a:fillRect/>
                     </a:stretch>
@@ -12274,7 +12394,7 @@
         <w:drawing>
           <wp:inline xmlns:a="http://schemas.openxmlformats.org/drawingml/2006/main" xmlns:pic="http://schemas.openxmlformats.org/drawingml/2006/picture">
             <wp:extent cx="6309360" cy="1991778"/>
-            <wp:docPr id="36" name="Picture 36"/>
+            <wp:docPr id="39" name="Picture 39"/>
             <wp:cNvGraphicFramePr>
               <a:graphicFrameLocks noChangeAspect="1"/>
             </wp:cNvGraphicFramePr>
@@ -12286,7 +12406,7 @@
                     <pic:cNvPicPr/>
                   </pic:nvPicPr>
                   <pic:blipFill>
-                    <a:blip r:embed="rId45"/>
+                    <a:blip r:embed="rId48"/>
                     <a:stretch>
                       <a:fillRect/>
                     </a:stretch>
@@ -12542,7 +12662,7 @@
         <w:drawing>
           <wp:inline xmlns:a="http://schemas.openxmlformats.org/drawingml/2006/main" xmlns:pic="http://schemas.openxmlformats.org/drawingml/2006/picture">
             <wp:extent cx="6309360" cy="2474259"/>
-            <wp:docPr id="37" name="Picture 37"/>
+            <wp:docPr id="40" name="Picture 40"/>
             <wp:cNvGraphicFramePr>
               <a:graphicFrameLocks noChangeAspect="1"/>
             </wp:cNvGraphicFramePr>
@@ -12554,7 +12674,7 @@
                     <pic:cNvPicPr/>
                   </pic:nvPicPr>
                   <pic:blipFill>
-                    <a:blip r:embed="rId46"/>
+                    <a:blip r:embed="rId49"/>
                     <a:stretch>
                       <a:fillRect/>
                     </a:stretch>
@@ -12582,7 +12702,7 @@
         <w:drawing>
           <wp:inline xmlns:a="http://schemas.openxmlformats.org/drawingml/2006/main" xmlns:pic="http://schemas.openxmlformats.org/drawingml/2006/picture">
             <wp:extent cx="6309360" cy="2313432"/>
-            <wp:docPr id="38" name="Picture 38"/>
+            <wp:docPr id="41" name="Picture 41"/>
             <wp:cNvGraphicFramePr>
               <a:graphicFrameLocks noChangeAspect="1"/>
             </wp:cNvGraphicFramePr>
@@ -12594,7 +12714,7 @@
                     <pic:cNvPicPr/>
                   </pic:nvPicPr>
                   <pic:blipFill>
-                    <a:blip r:embed="rId47"/>
+                    <a:blip r:embed="rId50"/>
                     <a:stretch>
                       <a:fillRect/>
                     </a:stretch>
@@ -13057,7 +13177,7 @@
         <w:drawing>
           <wp:inline xmlns:a="http://schemas.openxmlformats.org/drawingml/2006/main" xmlns:pic="http://schemas.openxmlformats.org/drawingml/2006/picture">
             <wp:extent cx="6309360" cy="2474259"/>
-            <wp:docPr id="39" name="Picture 39"/>
+            <wp:docPr id="42" name="Picture 42"/>
             <wp:cNvGraphicFramePr>
               <a:graphicFrameLocks noChangeAspect="1"/>
             </wp:cNvGraphicFramePr>
@@ -13069,7 +13189,7 @@
                     <pic:cNvPicPr/>
                   </pic:nvPicPr>
                   <pic:blipFill>
-                    <a:blip r:embed="rId48"/>
+                    <a:blip r:embed="rId51"/>
                     <a:stretch>
                       <a:fillRect/>
                     </a:stretch>
@@ -13097,7 +13217,7 @@
         <w:drawing>
           <wp:inline xmlns:a="http://schemas.openxmlformats.org/drawingml/2006/main" xmlns:pic="http://schemas.openxmlformats.org/drawingml/2006/picture">
             <wp:extent cx="6309360" cy="2474259"/>
-            <wp:docPr id="40" name="Picture 40"/>
+            <wp:docPr id="43" name="Picture 43"/>
             <wp:cNvGraphicFramePr>
               <a:graphicFrameLocks noChangeAspect="1"/>
             </wp:cNvGraphicFramePr>
@@ -13109,7 +13229,7 @@
                     <pic:cNvPicPr/>
                   </pic:nvPicPr>
                   <pic:blipFill>
-                    <a:blip r:embed="rId49"/>
+                    <a:blip r:embed="rId52"/>
                     <a:stretch>
                       <a:fillRect/>
                     </a:stretch>
@@ -13499,13 +13619,89 @@
         <w:tcPr>
           <w:tcW w:type="dxa" w:w="5040"/>
         </w:tcPr>
-        <w:p/>
+        <w:p>
+          <w:pPr>
+            <w:jc w:val="left"/>
+          </w:pPr>
+          <w:r>
+            <w:drawing>
+              <wp:inline xmlns:a="http://schemas.openxmlformats.org/drawingml/2006/main" xmlns:pic="http://schemas.openxmlformats.org/drawingml/2006/picture">
+                <wp:extent cx="777240" cy="754108"/>
+                <wp:docPr id="1" name="Picture 1"/>
+                <wp:cNvGraphicFramePr>
+                  <a:graphicFrameLocks noChangeAspect="1"/>
+                </wp:cNvGraphicFramePr>
+                <a:graphic>
+                  <a:graphicData uri="http://schemas.openxmlformats.org/drawingml/2006/picture">
+                    <pic:pic>
+                      <pic:nvPicPr>
+                        <pic:cNvPr id="0" name="aws_partner_cluster.png"/>
+                        <pic:cNvPicPr/>
+                      </pic:nvPicPr>
+                      <pic:blipFill>
+                        <a:blip r:embed="rId1"/>
+                        <a:stretch>
+                          <a:fillRect/>
+                        </a:stretch>
+                      </pic:blipFill>
+                      <pic:spPr>
+                        <a:xfrm>
+                          <a:off x="0" y="0"/>
+                          <a:ext cx="777240" cy="754108"/>
+                        </a:xfrm>
+                        <a:prstGeom prst="rect"/>
+                      </pic:spPr>
+                    </pic:pic>
+                  </a:graphicData>
+                </a:graphic>
+              </wp:inline>
+            </w:drawing>
+          </w:r>
+        </w:p>
       </w:tc>
       <w:tc>
         <w:tcPr>
           <w:tcW w:type="dxa" w:w="5040"/>
         </w:tcPr>
-        <w:p/>
+        <w:p>
+          <w:pPr>
+            <w:jc w:val="right"/>
+          </w:pPr>
+          <w:r>
+            <w:drawing>
+              <wp:inline xmlns:a="http://schemas.openxmlformats.org/drawingml/2006/main" xmlns:pic="http://schemas.openxmlformats.org/drawingml/2006/picture">
+                <wp:extent cx="1371600" cy="554477"/>
+                <wp:docPr id="2" name="Picture 2"/>
+                <wp:cNvGraphicFramePr>
+                  <a:graphicFrameLocks noChangeAspect="1"/>
+                </wp:cNvGraphicFramePr>
+                <a:graphic>
+                  <a:graphicData uri="http://schemas.openxmlformats.org/drawingml/2006/picture">
+                    <pic:pic>
+                      <pic:nvPicPr>
+                        <pic:cNvPr id="0" name="operisoft_logo_header.png"/>
+                        <pic:cNvPicPr/>
+                      </pic:nvPicPr>
+                      <pic:blipFill>
+                        <a:blip r:embed="rId2"/>
+                        <a:stretch>
+                          <a:fillRect/>
+                        </a:stretch>
+                      </pic:blipFill>
+                      <pic:spPr>
+                        <a:xfrm>
+                          <a:off x="0" y="0"/>
+                          <a:ext cx="1371600" cy="554477"/>
+                        </a:xfrm>
+                        <a:prstGeom prst="rect"/>
+                      </pic:spPr>
+                    </pic:pic>
+                  </a:graphicData>
+                </a:graphic>
+              </wp:inline>
+            </w:drawing>
+          </w:r>
+        </w:p>
       </w:tc>
     </w:tr>
   </w:tbl>

</xml_diff>

<commit_message>
Match report to client reference: red costs, total arrows, yellow links, arrow bullets, cluster image
- Red (FF0000) Last+Current cost cells when an account cost decreased (diff < -0.5)
- Total row: red up-arrow before Last Week total, green/red arrow before Current Week total
- Security table: lowercase 'security best practices: -' heading, FFD600 yellow header, teal 467885 underlined links
- Arrow bullets (U+2B9A, Noto Sans Symbols) for outer bullets via new _ensure_arrow_numbering + add_bullet(glyph=); inner bullets stay disc
- Inline AWS partner cluster image above the summary heading
- Regenerate ajreport_20261004.docx/.pdf; update learnings doc (section 6b)
</commit_message>
<xml_diff>
--- a/ajreport_20261004.docx
+++ b/ajreport_20261004.docx
@@ -221,6 +221,46 @@
         <w:t>Aptech Limited Weekly Status Report</w:t>
         <w:br/>
         <w:t>(28 September to 04 October 2026)</w:t>
+      </w:r>
+    </w:p>
+    <w:p>
+      <w:pPr>
+        <w:spacing w:before="0" w:after="120" w:line="240" w:lineRule="auto"/>
+        <w:jc w:val="center"/>
+      </w:pPr>
+      <w:r>
+        <w:drawing>
+          <wp:inline xmlns:a="http://schemas.openxmlformats.org/drawingml/2006/main" xmlns:pic="http://schemas.openxmlformats.org/drawingml/2006/picture">
+            <wp:extent cx="768096" cy="745236"/>
+            <wp:docPr id="4" name="Picture 4"/>
+            <wp:cNvGraphicFramePr>
+              <a:graphicFrameLocks noChangeAspect="1"/>
+            </wp:cNvGraphicFramePr>
+            <a:graphic>
+              <a:graphicData uri="http://schemas.openxmlformats.org/drawingml/2006/picture">
+                <pic:pic>
+                  <pic:nvPicPr>
+                    <pic:cNvPr id="0" name="aws_partner_cluster.png"/>
+                    <pic:cNvPicPr/>
+                  </pic:nvPicPr>
+                  <pic:blipFill>
+                    <a:blip r:embed="rId13"/>
+                    <a:stretch>
+                      <a:fillRect/>
+                    </a:stretch>
+                  </pic:blipFill>
+                  <pic:spPr>
+                    <a:xfrm>
+                      <a:off x="0" y="0"/>
+                      <a:ext cx="768096" cy="745236"/>
+                    </a:xfrm>
+                    <a:prstGeom prst="rect"/>
+                  </pic:spPr>
+                </pic:pic>
+              </a:graphicData>
+            </a:graphic>
+          </wp:inline>
+        </w:drawing>
       </w:r>
     </w:p>
     <w:p>
@@ -492,6 +532,7 @@
               <w:rPr>
                 <w:rFonts w:ascii="Arial" w:hAnsi="Arial"/>
                 <w:b w:val="0"/>
+                <w:color w:val="FF0000"/>
                 <w:sz w:val="14"/>
               </w:rPr>
               <w:t>$847.52</w:t>
@@ -529,6 +570,7 @@
               <w:rPr>
                 <w:rFonts w:ascii="Arial" w:hAnsi="Arial"/>
                 <w:b w:val="0"/>
+                <w:color w:val="FF0000"/>
                 <w:sz w:val="14"/>
               </w:rPr>
               <w:t>$758.69</w:t>
@@ -773,6 +815,7 @@
               <w:rPr>
                 <w:rFonts w:ascii="Arial" w:hAnsi="Arial"/>
                 <w:b w:val="0"/>
+                <w:color w:val="FF0000"/>
                 <w:sz w:val="14"/>
               </w:rPr>
               <w:t>$689.66</w:t>
@@ -810,6 +853,7 @@
               <w:rPr>
                 <w:rFonts w:ascii="Arial" w:hAnsi="Arial"/>
                 <w:b w:val="0"/>
+                <w:color w:val="FF0000"/>
                 <w:sz w:val="14"/>
               </w:rPr>
               <w:t>$642.65</w:t>
@@ -913,6 +957,7 @@
               <w:rPr>
                 <w:rFonts w:ascii="Arial" w:hAnsi="Arial"/>
                 <w:b w:val="0"/>
+                <w:color w:val="FF0000"/>
                 <w:sz w:val="14"/>
               </w:rPr>
               <w:t>$1,474.89</w:t>
@@ -950,6 +995,7 @@
               <w:rPr>
                 <w:rFonts w:ascii="Arial" w:hAnsi="Arial"/>
                 <w:b w:val="0"/>
+                <w:color w:val="FF0000"/>
                 <w:sz w:val="14"/>
               </w:rPr>
               <w:t>$1,452.06</w:t>
@@ -1053,6 +1099,7 @@
               <w:rPr>
                 <w:rFonts w:ascii="Arial" w:hAnsi="Arial"/>
                 <w:b w:val="0"/>
+                <w:color w:val="FF0000"/>
                 <w:sz w:val="14"/>
               </w:rPr>
               <w:t>$1,004.26</w:t>
@@ -1091,6 +1138,7 @@
               <w:rPr>
                 <w:rFonts w:ascii="Arial" w:hAnsi="Arial"/>
                 <w:b w:val="0"/>
+                <w:color w:val="FF0000"/>
                 <w:sz w:val="14"/>
               </w:rPr>
               <w:t>$968.33</w:t>
@@ -1334,6 +1382,7 @@
               <w:rPr>
                 <w:rFonts w:ascii="Arial" w:hAnsi="Arial"/>
                 <w:b w:val="0"/>
+                <w:color w:val="FF0000"/>
                 <w:sz w:val="14"/>
               </w:rPr>
               <w:t>$1,319.37</w:t>
@@ -1372,6 +1421,7 @@
               <w:rPr>
                 <w:rFonts w:ascii="Arial" w:hAnsi="Arial"/>
                 <w:b w:val="0"/>
+                <w:color w:val="FF0000"/>
                 <w:sz w:val="14"/>
               </w:rPr>
               <w:t>$1,183.84</w:t>
@@ -1475,6 +1525,7 @@
               <w:rPr>
                 <w:rFonts w:ascii="Arial" w:hAnsi="Arial"/>
                 <w:b w:val="0"/>
+                <w:color w:val="FF0000"/>
                 <w:sz w:val="14"/>
               </w:rPr>
               <w:t>$307.51</w:t>
@@ -1512,6 +1563,7 @@
               <w:rPr>
                 <w:rFonts w:ascii="Arial" w:hAnsi="Arial"/>
                 <w:b w:val="0"/>
+                <w:color w:val="FF0000"/>
                 <w:sz w:val="14"/>
               </w:rPr>
               <w:t>$283.14</w:t>
@@ -1615,6 +1667,7 @@
               <w:rPr>
                 <w:rFonts w:ascii="Arial" w:hAnsi="Arial"/>
                 <w:b w:val="0"/>
+                <w:color w:val="FF0000"/>
                 <w:sz w:val="14"/>
               </w:rPr>
               <w:t>$558.31</w:t>
@@ -1653,6 +1706,7 @@
               <w:rPr>
                 <w:rFonts w:ascii="Arial" w:hAnsi="Arial"/>
                 <w:b w:val="0"/>
+                <w:color w:val="FF0000"/>
                 <w:sz w:val="14"/>
               </w:rPr>
               <w:t>$471.23</w:t>
@@ -2317,6 +2371,7 @@
               <w:rPr>
                 <w:rFonts w:ascii="Arial" w:hAnsi="Arial"/>
                 <w:b w:val="0"/>
+                <w:color w:val="FF0000"/>
                 <w:sz w:val="14"/>
               </w:rPr>
               <w:t>$1,074.62</w:t>
@@ -2354,6 +2409,7 @@
               <w:rPr>
                 <w:rFonts w:ascii="Arial" w:hAnsi="Arial"/>
                 <w:b w:val="0"/>
+                <w:color w:val="FF0000"/>
                 <w:sz w:val="14"/>
               </w:rPr>
               <w:t>$969.23</w:t>
@@ -2457,6 +2513,7 @@
               <w:rPr>
                 <w:rFonts w:ascii="Arial" w:hAnsi="Arial"/>
                 <w:b w:val="0"/>
+                <w:color w:val="FF0000"/>
                 <w:sz w:val="14"/>
               </w:rPr>
               <w:t>$1,080.40</w:t>
@@ -2494,6 +2551,7 @@
               <w:rPr>
                 <w:rFonts w:ascii="Arial" w:hAnsi="Arial"/>
                 <w:b w:val="0"/>
+                <w:color w:val="FF0000"/>
                 <w:sz w:val="14"/>
               </w:rPr>
               <w:t>$913.08</w:t>
@@ -2878,6 +2936,7 @@
               <w:rPr>
                 <w:rFonts w:ascii="Arial" w:hAnsi="Arial"/>
                 <w:b w:val="0"/>
+                <w:color w:val="FF0000"/>
                 <w:sz w:val="14"/>
               </w:rPr>
               <w:t>$582.14</w:t>
@@ -2916,6 +2975,7 @@
               <w:rPr>
                 <w:rFonts w:ascii="Arial" w:hAnsi="Arial"/>
                 <w:b w:val="0"/>
+                <w:color w:val="FF0000"/>
                 <w:sz w:val="14"/>
               </w:rPr>
               <w:t>$526.40</w:t>
@@ -3019,6 +3079,7 @@
               <w:rPr>
                 <w:rFonts w:ascii="Arial" w:hAnsi="Arial"/>
                 <w:b w:val="0"/>
+                <w:color w:val="FF0000"/>
                 <w:sz w:val="14"/>
               </w:rPr>
               <w:t>$170.12</w:t>
@@ -3057,6 +3118,7 @@
               <w:rPr>
                 <w:rFonts w:ascii="Arial" w:hAnsi="Arial"/>
                 <w:b w:val="0"/>
+                <w:color w:val="FF0000"/>
                 <w:sz w:val="14"/>
               </w:rPr>
               <w:t>$155.02</w:t>
@@ -3160,6 +3222,7 @@
               <w:rPr>
                 <w:rFonts w:ascii="Arial" w:hAnsi="Arial"/>
                 <w:b w:val="0"/>
+                <w:color w:val="FF0000"/>
                 <w:sz w:val="14"/>
               </w:rPr>
               <w:t>$194.71</w:t>
@@ -3198,6 +3261,7 @@
               <w:rPr>
                 <w:rFonts w:ascii="Arial" w:hAnsi="Arial"/>
                 <w:b w:val="0"/>
+                <w:color w:val="FF0000"/>
                 <w:sz w:val="14"/>
               </w:rPr>
               <w:t>$184.64</w:t>
@@ -3259,6 +3323,16 @@
               <w:spacing w:before="0" w:after="0" w:line="240" w:lineRule="auto"/>
               <w:jc w:val="center"/>
             </w:pPr>
+            <w:r/>
+            <w:r>
+              <w:rPr>
+                <w:rFonts w:ascii="Arial" w:hAnsi="Arial"/>
+                <w:b/>
+                <w:color w:val="ED0000"/>
+                <w:sz w:val="17"/>
+              </w:rPr>
+              <w:t>⬆️</w:t>
+            </w:r>
             <w:r>
               <w:rPr>
                 <w:rFonts w:ascii="Arial" w:hAnsi="Arial"/>
@@ -3299,13 +3373,23 @@
               <w:spacing w:before="0" w:after="0" w:line="240" w:lineRule="auto"/>
               <w:jc w:val="center"/>
             </w:pPr>
+            <w:r/>
+            <w:r>
+              <w:rPr>
+                <w:rFonts w:ascii="Arial" w:hAnsi="Arial"/>
+                <w:b/>
+                <w:color w:val="00AF50"/>
+                <w:sz w:val="17"/>
+              </w:rPr>
+              <w:t>⬇️</w:t>
+            </w:r>
             <w:r>
               <w:rPr>
                 <w:rFonts w:ascii="Arial" w:hAnsi="Arial"/>
                 <w:b/>
                 <w:sz w:val="17"/>
               </w:rPr>
-              <w:t>⬇$14,256.30</w:t>
+              <w:t>$14,256.30</w:t>
             </w:r>
           </w:p>
         </w:tc>
@@ -3330,7 +3414,7 @@
         <w:ind w:left="922" w:hanging="360"/>
         <w:numPr>
           <w:ilvl w:val="0"/>
-          <w:numId w:val="9101"/>
+          <w:numId w:val="9201"/>
         </w:numPr>
       </w:pPr>
       <w:r>
@@ -3348,7 +3432,7 @@
         <w:ind w:left="922" w:hanging="360"/>
         <w:numPr>
           <w:ilvl w:val="0"/>
-          <w:numId w:val="9101"/>
+          <w:numId w:val="9201"/>
         </w:numPr>
       </w:pPr>
       <w:r>
@@ -3369,7 +3453,7 @@
           <w:i w:val="0"/>
           <w:sz w:val="24"/>
         </w:rPr>
-        <w:t>Security Best Practices Links:</w:t>
+        <w:t>security best practices: -</w:t>
       </w:r>
     </w:p>
     <w:tbl>
@@ -3395,7 +3479,7 @@
         <w:tc>
           <w:tcPr>
             <w:tcW w:type="dxa" w:w="3456"/>
-            <w:shd w:val="clear" w:color="auto" w:fill="BEBEBE"/>
+            <w:shd w:val="clear" w:color="auto" w:fill="FFD600"/>
           </w:tcPr>
           <w:p>
             <w:pPr>
@@ -3415,7 +3499,7 @@
         <w:tc>
           <w:tcPr>
             <w:tcW w:type="dxa" w:w="6624"/>
-            <w:shd w:val="clear" w:color="auto" w:fill="BEBEBE"/>
+            <w:shd w:val="clear" w:color="auto" w:fill="FFD600"/>
           </w:tcPr>
           <w:p>
             <w:pPr>
@@ -3463,13 +3547,13 @@
           <w:p>
             <w:pPr>
               <w:spacing w:before="20" w:after="20" w:line="240" w:lineRule="auto"/>
-              <w:jc w:val="left"/>
             </w:pPr>
             <w:r>
               <w:rPr>
                 <w:rFonts w:ascii="Arial" w:hAnsi="Arial"/>
-                <w:b w:val="0"/>
+                <w:color w:val="467885"/>
                 <w:sz w:val="17"/>
+                <w:u w:val="single"/>
               </w:rPr>
               <w:t>https://docs.aws.amazon.com/accounts/latest/reference/best-practices-root-user.html</w:t>
             </w:r>
@@ -3506,13 +3590,13 @@
           <w:p>
             <w:pPr>
               <w:spacing w:before="20" w:after="20" w:line="240" w:lineRule="auto"/>
-              <w:jc w:val="left"/>
             </w:pPr>
             <w:r>
               <w:rPr>
                 <w:rFonts w:ascii="Arial" w:hAnsi="Arial"/>
-                <w:b w:val="0"/>
+                <w:color w:val="467885"/>
                 <w:sz w:val="17"/>
+                <w:u w:val="single"/>
               </w:rPr>
               <w:t>https://docs.aws.amazon.com/accounts/latest/reference/credentials-access-keys-best-practices.html</w:t>
             </w:r>
@@ -3549,13 +3633,13 @@
           <w:p>
             <w:pPr>
               <w:spacing w:before="20" w:after="20" w:line="240" w:lineRule="auto"/>
-              <w:jc w:val="left"/>
             </w:pPr>
             <w:r>
               <w:rPr>
                 <w:rFonts w:ascii="Arial" w:hAnsi="Arial"/>
-                <w:b w:val="0"/>
+                <w:color w:val="467885"/>
                 <w:sz w:val="17"/>
+                <w:u w:val="single"/>
               </w:rPr>
               <w:t>https://aws.amazon.com/compliance/shared-responsibility-model/</w:t>
             </w:r>
@@ -3592,13 +3676,13 @@
           <w:p>
             <w:pPr>
               <w:spacing w:before="20" w:after="20" w:line="240" w:lineRule="auto"/>
-              <w:jc w:val="left"/>
             </w:pPr>
             <w:r>
               <w:rPr>
                 <w:rFonts w:ascii="Arial" w:hAnsi="Arial"/>
-                <w:b w:val="0"/>
+                <w:color w:val="467885"/>
                 <w:sz w:val="17"/>
+                <w:u w:val="single"/>
               </w:rPr>
               <w:t>https://aws.amazon.com/cloudtrail/</w:t>
             </w:r>
@@ -3635,13 +3719,13 @@
           <w:p>
             <w:pPr>
               <w:spacing w:before="20" w:after="20" w:line="240" w:lineRule="auto"/>
-              <w:jc w:val="left"/>
             </w:pPr>
             <w:r>
               <w:rPr>
                 <w:rFonts w:ascii="Arial" w:hAnsi="Arial"/>
-                <w:b w:val="0"/>
+                <w:color w:val="467885"/>
                 <w:sz w:val="17"/>
+                <w:u w:val="single"/>
               </w:rPr>
               <w:t>https://aws.amazon.com/premiumsupport/trustedadvisor/</w:t>
             </w:r>
@@ -3678,13 +3762,13 @@
           <w:p>
             <w:pPr>
               <w:spacing w:before="20" w:after="20" w:line="240" w:lineRule="auto"/>
-              <w:jc w:val="left"/>
             </w:pPr>
             <w:r>
               <w:rPr>
                 <w:rFonts w:ascii="Arial" w:hAnsi="Arial"/>
-                <w:b w:val="0"/>
+                <w:color w:val="467885"/>
                 <w:sz w:val="17"/>
+                <w:u w:val="single"/>
               </w:rPr>
               <w:t>https://docs.aws.amazon.com/AmazonCloudWatch/latest/monitoring/gs_monitor_estimated_charges_with_cloudwatch.html#gs_creating_billing_alarm</w:t>
             </w:r>
@@ -3721,13 +3805,13 @@
           <w:p>
             <w:pPr>
               <w:spacing w:before="20" w:after="20" w:line="240" w:lineRule="auto"/>
-              <w:jc w:val="left"/>
             </w:pPr>
             <w:r>
               <w:rPr>
                 <w:rFonts w:ascii="Arial" w:hAnsi="Arial"/>
-                <w:b w:val="0"/>
+                <w:color w:val="467885"/>
                 <w:sz w:val="17"/>
+                <w:u w:val="single"/>
               </w:rPr>
               <w:t>https://docs.aws.amazon.com/IAM/latest/UserGuide/id_credentials_mfa.html</w:t>
             </w:r>
@@ -3764,13 +3848,13 @@
           <w:p>
             <w:pPr>
               <w:spacing w:before="20" w:after="20" w:line="240" w:lineRule="auto"/>
-              <w:jc w:val="left"/>
             </w:pPr>
             <w:r>
               <w:rPr>
                 <w:rFonts w:ascii="Arial" w:hAnsi="Arial"/>
-                <w:b w:val="0"/>
+                <w:color w:val="467885"/>
                 <w:sz w:val="17"/>
+                <w:u w:val="single"/>
               </w:rPr>
               <w:t>https://github.com/awslabs/git-secrets</w:t>
             </w:r>
@@ -3851,7 +3935,7 @@
         <w:ind w:left="533" w:hanging="360"/>
         <w:numPr>
           <w:ilvl w:val="0"/>
-          <w:numId w:val="9101"/>
+          <w:numId w:val="9201"/>
         </w:numPr>
       </w:pPr>
       <w:r>
@@ -3924,46 +4008,6 @@
         <w:drawing>
           <wp:inline xmlns:a="http://schemas.openxmlformats.org/drawingml/2006/main" xmlns:pic="http://schemas.openxmlformats.org/drawingml/2006/picture">
             <wp:extent cx="6309360" cy="2474259"/>
-            <wp:docPr id="4" name="Picture 4"/>
-            <wp:cNvGraphicFramePr>
-              <a:graphicFrameLocks noChangeAspect="1"/>
-            </wp:cNvGraphicFramePr>
-            <a:graphic>
-              <a:graphicData uri="http://schemas.openxmlformats.org/drawingml/2006/picture">
-                <pic:pic>
-                  <pic:nvPicPr>
-                    <pic:cNvPr id="0" name="image.png"/>
-                    <pic:cNvPicPr/>
-                  </pic:nvPicPr>
-                  <pic:blipFill>
-                    <a:blip r:embed="rId13"/>
-                    <a:stretch>
-                      <a:fillRect/>
-                    </a:stretch>
-                  </pic:blipFill>
-                  <pic:spPr>
-                    <a:xfrm>
-                      <a:off x="0" y="0"/>
-                      <a:ext cx="6309360" cy="2474259"/>
-                    </a:xfrm>
-                    <a:prstGeom prst="rect"/>
-                  </pic:spPr>
-                </pic:pic>
-              </a:graphicData>
-            </a:graphic>
-          </wp:inline>
-        </w:drawing>
-      </w:r>
-    </w:p>
-    <w:p>
-      <w:pPr>
-        <w:spacing w:before="0" w:after="60" w:line="240" w:lineRule="auto"/>
-        <w:jc w:val="center"/>
-      </w:pPr>
-      <w:r>
-        <w:drawing>
-          <wp:inline xmlns:a="http://schemas.openxmlformats.org/drawingml/2006/main" xmlns:pic="http://schemas.openxmlformats.org/drawingml/2006/picture">
-            <wp:extent cx="6309360" cy="2152605"/>
             <wp:docPr id="5" name="Picture 5"/>
             <wp:cNvGraphicFramePr>
               <a:graphicFrameLocks noChangeAspect="1"/>
@@ -3984,6 +4028,46 @@
                   <pic:spPr>
                     <a:xfrm>
                       <a:off x="0" y="0"/>
+                      <a:ext cx="6309360" cy="2474259"/>
+                    </a:xfrm>
+                    <a:prstGeom prst="rect"/>
+                  </pic:spPr>
+                </pic:pic>
+              </a:graphicData>
+            </a:graphic>
+          </wp:inline>
+        </w:drawing>
+      </w:r>
+    </w:p>
+    <w:p>
+      <w:pPr>
+        <w:spacing w:before="0" w:after="60" w:line="240" w:lineRule="auto"/>
+        <w:jc w:val="center"/>
+      </w:pPr>
+      <w:r>
+        <w:drawing>
+          <wp:inline xmlns:a="http://schemas.openxmlformats.org/drawingml/2006/main" xmlns:pic="http://schemas.openxmlformats.org/drawingml/2006/picture">
+            <wp:extent cx="6309360" cy="2152605"/>
+            <wp:docPr id="6" name="Picture 6"/>
+            <wp:cNvGraphicFramePr>
+              <a:graphicFrameLocks noChangeAspect="1"/>
+            </wp:cNvGraphicFramePr>
+            <a:graphic>
+              <a:graphicData uri="http://schemas.openxmlformats.org/drawingml/2006/picture">
+                <pic:pic>
+                  <pic:nvPicPr>
+                    <pic:cNvPr id="0" name="image.png"/>
+                    <pic:cNvPicPr/>
+                  </pic:nvPicPr>
+                  <pic:blipFill>
+                    <a:blip r:embed="rId15"/>
+                    <a:stretch>
+                      <a:fillRect/>
+                    </a:stretch>
+                  </pic:blipFill>
+                  <pic:spPr>
+                    <a:xfrm>
+                      <a:off x="0" y="0"/>
                       <a:ext cx="6309360" cy="2152605"/>
                     </a:xfrm>
                     <a:prstGeom prst="rect"/>
@@ -4001,7 +4085,7 @@
         <w:ind w:left="533" w:hanging="360"/>
         <w:numPr>
           <w:ilvl w:val="0"/>
-          <w:numId w:val="9101"/>
+          <w:numId w:val="9201"/>
         </w:numPr>
       </w:pPr>
       <w:r>
@@ -4019,7 +4103,7 @@
         <w:ind w:left="533" w:hanging="360"/>
         <w:numPr>
           <w:ilvl w:val="0"/>
-          <w:numId w:val="9101"/>
+          <w:numId w:val="9201"/>
         </w:numPr>
       </w:pPr>
       <w:r>
@@ -4423,7 +4507,7 @@
         <w:ind w:left="533" w:hanging="360"/>
         <w:numPr>
           <w:ilvl w:val="0"/>
-          <w:numId w:val="9101"/>
+          <w:numId w:val="9201"/>
         </w:numPr>
       </w:pPr>
       <w:r>
@@ -4496,46 +4580,6 @@
         <w:drawing>
           <wp:inline xmlns:a="http://schemas.openxmlformats.org/drawingml/2006/main" xmlns:pic="http://schemas.openxmlformats.org/drawingml/2006/picture">
             <wp:extent cx="6309360" cy="2474259"/>
-            <wp:docPr id="6" name="Picture 6"/>
-            <wp:cNvGraphicFramePr>
-              <a:graphicFrameLocks noChangeAspect="1"/>
-            </wp:cNvGraphicFramePr>
-            <a:graphic>
-              <a:graphicData uri="http://schemas.openxmlformats.org/drawingml/2006/picture">
-                <pic:pic>
-                  <pic:nvPicPr>
-                    <pic:cNvPr id="0" name="image.png"/>
-                    <pic:cNvPicPr/>
-                  </pic:nvPicPr>
-                  <pic:blipFill>
-                    <a:blip r:embed="rId15"/>
-                    <a:stretch>
-                      <a:fillRect/>
-                    </a:stretch>
-                  </pic:blipFill>
-                  <pic:spPr>
-                    <a:xfrm>
-                      <a:off x="0" y="0"/>
-                      <a:ext cx="6309360" cy="2474259"/>
-                    </a:xfrm>
-                    <a:prstGeom prst="rect"/>
-                  </pic:spPr>
-                </pic:pic>
-              </a:graphicData>
-            </a:graphic>
-          </wp:inline>
-        </w:drawing>
-      </w:r>
-    </w:p>
-    <w:p>
-      <w:pPr>
-        <w:spacing w:before="0" w:after="60" w:line="240" w:lineRule="auto"/>
-        <w:jc w:val="center"/>
-      </w:pPr>
-      <w:r>
-        <w:drawing>
-          <wp:inline xmlns:a="http://schemas.openxmlformats.org/drawingml/2006/main" xmlns:pic="http://schemas.openxmlformats.org/drawingml/2006/picture">
-            <wp:extent cx="6309360" cy="2313432"/>
             <wp:docPr id="7" name="Picture 7"/>
             <wp:cNvGraphicFramePr>
               <a:graphicFrameLocks noChangeAspect="1"/>
@@ -4556,6 +4600,46 @@
                   <pic:spPr>
                     <a:xfrm>
                       <a:off x="0" y="0"/>
+                      <a:ext cx="6309360" cy="2474259"/>
+                    </a:xfrm>
+                    <a:prstGeom prst="rect"/>
+                  </pic:spPr>
+                </pic:pic>
+              </a:graphicData>
+            </a:graphic>
+          </wp:inline>
+        </w:drawing>
+      </w:r>
+    </w:p>
+    <w:p>
+      <w:pPr>
+        <w:spacing w:before="0" w:after="60" w:line="240" w:lineRule="auto"/>
+        <w:jc w:val="center"/>
+      </w:pPr>
+      <w:r>
+        <w:drawing>
+          <wp:inline xmlns:a="http://schemas.openxmlformats.org/drawingml/2006/main" xmlns:pic="http://schemas.openxmlformats.org/drawingml/2006/picture">
+            <wp:extent cx="6309360" cy="2313432"/>
+            <wp:docPr id="8" name="Picture 8"/>
+            <wp:cNvGraphicFramePr>
+              <a:graphicFrameLocks noChangeAspect="1"/>
+            </wp:cNvGraphicFramePr>
+            <a:graphic>
+              <a:graphicData uri="http://schemas.openxmlformats.org/drawingml/2006/picture">
+                <pic:pic>
+                  <pic:nvPicPr>
+                    <pic:cNvPr id="0" name="image.png"/>
+                    <pic:cNvPicPr/>
+                  </pic:nvPicPr>
+                  <pic:blipFill>
+                    <a:blip r:embed="rId17"/>
+                    <a:stretch>
+                      <a:fillRect/>
+                    </a:stretch>
+                  </pic:blipFill>
+                  <pic:spPr>
+                    <a:xfrm>
+                      <a:off x="0" y="0"/>
                       <a:ext cx="6309360" cy="2313432"/>
                     </a:xfrm>
                     <a:prstGeom prst="rect"/>
@@ -4599,7 +4683,7 @@
         <w:ind w:left="533" w:hanging="360"/>
         <w:numPr>
           <w:ilvl w:val="0"/>
-          <w:numId w:val="9101"/>
+          <w:numId w:val="9201"/>
         </w:numPr>
       </w:pPr>
       <w:r>
@@ -4617,7 +4701,7 @@
         <w:ind w:left="533" w:hanging="360"/>
         <w:numPr>
           <w:ilvl w:val="0"/>
-          <w:numId w:val="9101"/>
+          <w:numId w:val="9201"/>
         </w:numPr>
       </w:pPr>
       <w:r>
@@ -5104,7 +5188,7 @@
         <w:ind w:left="533" w:hanging="360"/>
         <w:numPr>
           <w:ilvl w:val="0"/>
-          <w:numId w:val="9101"/>
+          <w:numId w:val="9201"/>
         </w:numPr>
       </w:pPr>
       <w:r>
@@ -5177,46 +5261,6 @@
         <w:drawing>
           <wp:inline xmlns:a="http://schemas.openxmlformats.org/drawingml/2006/main" xmlns:pic="http://schemas.openxmlformats.org/drawingml/2006/picture">
             <wp:extent cx="6309360" cy="2474259"/>
-            <wp:docPr id="8" name="Picture 8"/>
-            <wp:cNvGraphicFramePr>
-              <a:graphicFrameLocks noChangeAspect="1"/>
-            </wp:cNvGraphicFramePr>
-            <a:graphic>
-              <a:graphicData uri="http://schemas.openxmlformats.org/drawingml/2006/picture">
-                <pic:pic>
-                  <pic:nvPicPr>
-                    <pic:cNvPr id="0" name="image.png"/>
-                    <pic:cNvPicPr/>
-                  </pic:nvPicPr>
-                  <pic:blipFill>
-                    <a:blip r:embed="rId17"/>
-                    <a:stretch>
-                      <a:fillRect/>
-                    </a:stretch>
-                  </pic:blipFill>
-                  <pic:spPr>
-                    <a:xfrm>
-                      <a:off x="0" y="0"/>
-                      <a:ext cx="6309360" cy="2474259"/>
-                    </a:xfrm>
-                    <a:prstGeom prst="rect"/>
-                  </pic:spPr>
-                </pic:pic>
-              </a:graphicData>
-            </a:graphic>
-          </wp:inline>
-        </w:drawing>
-      </w:r>
-    </w:p>
-    <w:p>
-      <w:pPr>
-        <w:spacing w:before="0" w:after="60" w:line="240" w:lineRule="auto"/>
-        <w:jc w:val="center"/>
-      </w:pPr>
-      <w:r>
-        <w:drawing>
-          <wp:inline xmlns:a="http://schemas.openxmlformats.org/drawingml/2006/main" xmlns:pic="http://schemas.openxmlformats.org/drawingml/2006/picture">
-            <wp:extent cx="6309360" cy="2313432"/>
             <wp:docPr id="9" name="Picture 9"/>
             <wp:cNvGraphicFramePr>
               <a:graphicFrameLocks noChangeAspect="1"/>
@@ -5237,6 +5281,46 @@
                   <pic:spPr>
                     <a:xfrm>
                       <a:off x="0" y="0"/>
+                      <a:ext cx="6309360" cy="2474259"/>
+                    </a:xfrm>
+                    <a:prstGeom prst="rect"/>
+                  </pic:spPr>
+                </pic:pic>
+              </a:graphicData>
+            </a:graphic>
+          </wp:inline>
+        </w:drawing>
+      </w:r>
+    </w:p>
+    <w:p>
+      <w:pPr>
+        <w:spacing w:before="0" w:after="60" w:line="240" w:lineRule="auto"/>
+        <w:jc w:val="center"/>
+      </w:pPr>
+      <w:r>
+        <w:drawing>
+          <wp:inline xmlns:a="http://schemas.openxmlformats.org/drawingml/2006/main" xmlns:pic="http://schemas.openxmlformats.org/drawingml/2006/picture">
+            <wp:extent cx="6309360" cy="2313432"/>
+            <wp:docPr id="10" name="Picture 10"/>
+            <wp:cNvGraphicFramePr>
+              <a:graphicFrameLocks noChangeAspect="1"/>
+            </wp:cNvGraphicFramePr>
+            <a:graphic>
+              <a:graphicData uri="http://schemas.openxmlformats.org/drawingml/2006/picture">
+                <pic:pic>
+                  <pic:nvPicPr>
+                    <pic:cNvPr id="0" name="image.png"/>
+                    <pic:cNvPicPr/>
+                  </pic:nvPicPr>
+                  <pic:blipFill>
+                    <a:blip r:embed="rId19"/>
+                    <a:stretch>
+                      <a:fillRect/>
+                    </a:stretch>
+                  </pic:blipFill>
+                  <pic:spPr>
+                    <a:xfrm>
+                      <a:off x="0" y="0"/>
                       <a:ext cx="6309360" cy="2313432"/>
                     </a:xfrm>
                     <a:prstGeom prst="rect"/>
@@ -5254,7 +5338,7 @@
         <w:ind w:left="533" w:hanging="360"/>
         <w:numPr>
           <w:ilvl w:val="0"/>
-          <w:numId w:val="9101"/>
+          <w:numId w:val="9201"/>
         </w:numPr>
       </w:pPr>
       <w:r>
@@ -5272,7 +5356,7 @@
         <w:ind w:left="533" w:hanging="360"/>
         <w:numPr>
           <w:ilvl w:val="0"/>
-          <w:numId w:val="9101"/>
+          <w:numId w:val="9201"/>
         </w:numPr>
       </w:pPr>
       <w:r>
@@ -5386,7 +5470,7 @@
         <w:ind w:left="533" w:hanging="360"/>
         <w:numPr>
           <w:ilvl w:val="0"/>
-          <w:numId w:val="9101"/>
+          <w:numId w:val="9201"/>
         </w:numPr>
       </w:pPr>
       <w:r>
@@ -5459,46 +5543,6 @@
         <w:drawing>
           <wp:inline xmlns:a="http://schemas.openxmlformats.org/drawingml/2006/main" xmlns:pic="http://schemas.openxmlformats.org/drawingml/2006/picture">
             <wp:extent cx="6309360" cy="2474259"/>
-            <wp:docPr id="10" name="Picture 10"/>
-            <wp:cNvGraphicFramePr>
-              <a:graphicFrameLocks noChangeAspect="1"/>
-            </wp:cNvGraphicFramePr>
-            <a:graphic>
-              <a:graphicData uri="http://schemas.openxmlformats.org/drawingml/2006/picture">
-                <pic:pic>
-                  <pic:nvPicPr>
-                    <pic:cNvPr id="0" name="image.png"/>
-                    <pic:cNvPicPr/>
-                  </pic:nvPicPr>
-                  <pic:blipFill>
-                    <a:blip r:embed="rId19"/>
-                    <a:stretch>
-                      <a:fillRect/>
-                    </a:stretch>
-                  </pic:blipFill>
-                  <pic:spPr>
-                    <a:xfrm>
-                      <a:off x="0" y="0"/>
-                      <a:ext cx="6309360" cy="2474259"/>
-                    </a:xfrm>
-                    <a:prstGeom prst="rect"/>
-                  </pic:spPr>
-                </pic:pic>
-              </a:graphicData>
-            </a:graphic>
-          </wp:inline>
-        </w:drawing>
-      </w:r>
-    </w:p>
-    <w:p>
-      <w:pPr>
-        <w:spacing w:before="0" w:after="60" w:line="240" w:lineRule="auto"/>
-        <w:jc w:val="center"/>
-      </w:pPr>
-      <w:r>
-        <w:drawing>
-          <wp:inline xmlns:a="http://schemas.openxmlformats.org/drawingml/2006/main" xmlns:pic="http://schemas.openxmlformats.org/drawingml/2006/picture">
-            <wp:extent cx="6309360" cy="2795912"/>
             <wp:docPr id="11" name="Picture 11"/>
             <wp:cNvGraphicFramePr>
               <a:graphicFrameLocks noChangeAspect="1"/>
@@ -5519,6 +5563,46 @@
                   <pic:spPr>
                     <a:xfrm>
                       <a:off x="0" y="0"/>
+                      <a:ext cx="6309360" cy="2474259"/>
+                    </a:xfrm>
+                    <a:prstGeom prst="rect"/>
+                  </pic:spPr>
+                </pic:pic>
+              </a:graphicData>
+            </a:graphic>
+          </wp:inline>
+        </w:drawing>
+      </w:r>
+    </w:p>
+    <w:p>
+      <w:pPr>
+        <w:spacing w:before="0" w:after="60" w:line="240" w:lineRule="auto"/>
+        <w:jc w:val="center"/>
+      </w:pPr>
+      <w:r>
+        <w:drawing>
+          <wp:inline xmlns:a="http://schemas.openxmlformats.org/drawingml/2006/main" xmlns:pic="http://schemas.openxmlformats.org/drawingml/2006/picture">
+            <wp:extent cx="6309360" cy="2795912"/>
+            <wp:docPr id="12" name="Picture 12"/>
+            <wp:cNvGraphicFramePr>
+              <a:graphicFrameLocks noChangeAspect="1"/>
+            </wp:cNvGraphicFramePr>
+            <a:graphic>
+              <a:graphicData uri="http://schemas.openxmlformats.org/drawingml/2006/picture">
+                <pic:pic>
+                  <pic:nvPicPr>
+                    <pic:cNvPr id="0" name="image.png"/>
+                    <pic:cNvPicPr/>
+                  </pic:nvPicPr>
+                  <pic:blipFill>
+                    <a:blip r:embed="rId21"/>
+                    <a:stretch>
+                      <a:fillRect/>
+                    </a:stretch>
+                  </pic:blipFill>
+                  <pic:spPr>
+                    <a:xfrm>
+                      <a:off x="0" y="0"/>
                       <a:ext cx="6309360" cy="2795912"/>
                     </a:xfrm>
                     <a:prstGeom prst="rect"/>
@@ -5536,7 +5620,7 @@
         <w:ind w:left="533" w:hanging="360"/>
         <w:numPr>
           <w:ilvl w:val="0"/>
-          <w:numId w:val="9101"/>
+          <w:numId w:val="9201"/>
         </w:numPr>
       </w:pPr>
       <w:r>
@@ -5554,7 +5638,7 @@
         <w:ind w:left="533" w:hanging="360"/>
         <w:numPr>
           <w:ilvl w:val="0"/>
-          <w:numId w:val="9101"/>
+          <w:numId w:val="9201"/>
         </w:numPr>
       </w:pPr>
       <w:r>
@@ -5958,7 +6042,7 @@
         <w:ind w:left="533" w:hanging="360"/>
         <w:numPr>
           <w:ilvl w:val="0"/>
-          <w:numId w:val="9101"/>
+          <w:numId w:val="9201"/>
         </w:numPr>
       </w:pPr>
       <w:r>
@@ -6031,46 +6115,6 @@
         <w:drawing>
           <wp:inline xmlns:a="http://schemas.openxmlformats.org/drawingml/2006/main" xmlns:pic="http://schemas.openxmlformats.org/drawingml/2006/picture">
             <wp:extent cx="5986210" cy="2347533"/>
-            <wp:docPr id="12" name="Picture 12"/>
-            <wp:cNvGraphicFramePr>
-              <a:graphicFrameLocks noChangeAspect="1"/>
-            </wp:cNvGraphicFramePr>
-            <a:graphic>
-              <a:graphicData uri="http://schemas.openxmlformats.org/drawingml/2006/picture">
-                <pic:pic>
-                  <pic:nvPicPr>
-                    <pic:cNvPr id="0" name="image.png"/>
-                    <pic:cNvPicPr/>
-                  </pic:nvPicPr>
-                  <pic:blipFill>
-                    <a:blip r:embed="rId21"/>
-                    <a:stretch>
-                      <a:fillRect/>
-                    </a:stretch>
-                  </pic:blipFill>
-                  <pic:spPr>
-                    <a:xfrm>
-                      <a:off x="0" y="0"/>
-                      <a:ext cx="5986210" cy="2347533"/>
-                    </a:xfrm>
-                    <a:prstGeom prst="rect"/>
-                  </pic:spPr>
-                </pic:pic>
-              </a:graphicData>
-            </a:graphic>
-          </wp:inline>
-        </w:drawing>
-      </w:r>
-    </w:p>
-    <w:p>
-      <w:pPr>
-        <w:spacing w:before="0" w:after="60" w:line="240" w:lineRule="auto"/>
-        <w:jc w:val="center"/>
-      </w:pPr>
-      <w:r>
-        <w:drawing>
-          <wp:inline xmlns:a="http://schemas.openxmlformats.org/drawingml/2006/main" xmlns:pic="http://schemas.openxmlformats.org/drawingml/2006/picture">
-            <wp:extent cx="5986210" cy="3110482"/>
             <wp:docPr id="13" name="Picture 13"/>
             <wp:cNvGraphicFramePr>
               <a:graphicFrameLocks noChangeAspect="1"/>
@@ -6091,6 +6135,46 @@
                   <pic:spPr>
                     <a:xfrm>
                       <a:off x="0" y="0"/>
+                      <a:ext cx="5986210" cy="2347533"/>
+                    </a:xfrm>
+                    <a:prstGeom prst="rect"/>
+                  </pic:spPr>
+                </pic:pic>
+              </a:graphicData>
+            </a:graphic>
+          </wp:inline>
+        </w:drawing>
+      </w:r>
+    </w:p>
+    <w:p>
+      <w:pPr>
+        <w:spacing w:before="0" w:after="60" w:line="240" w:lineRule="auto"/>
+        <w:jc w:val="center"/>
+      </w:pPr>
+      <w:r>
+        <w:drawing>
+          <wp:inline xmlns:a="http://schemas.openxmlformats.org/drawingml/2006/main" xmlns:pic="http://schemas.openxmlformats.org/drawingml/2006/picture">
+            <wp:extent cx="5986210" cy="3110482"/>
+            <wp:docPr id="14" name="Picture 14"/>
+            <wp:cNvGraphicFramePr>
+              <a:graphicFrameLocks noChangeAspect="1"/>
+            </wp:cNvGraphicFramePr>
+            <a:graphic>
+              <a:graphicData uri="http://schemas.openxmlformats.org/drawingml/2006/picture">
+                <pic:pic>
+                  <pic:nvPicPr>
+                    <pic:cNvPr id="0" name="image.png"/>
+                    <pic:cNvPicPr/>
+                  </pic:nvPicPr>
+                  <pic:blipFill>
+                    <a:blip r:embed="rId23"/>
+                    <a:stretch>
+                      <a:fillRect/>
+                    </a:stretch>
+                  </pic:blipFill>
+                  <pic:spPr>
+                    <a:xfrm>
+                      <a:off x="0" y="0"/>
                       <a:ext cx="5986210" cy="3110482"/>
                     </a:xfrm>
                     <a:prstGeom prst="rect"/>
@@ -6134,7 +6218,7 @@
         <w:ind w:left="533" w:hanging="360"/>
         <w:numPr>
           <w:ilvl w:val="0"/>
-          <w:numId w:val="9101"/>
+          <w:numId w:val="9201"/>
         </w:numPr>
       </w:pPr>
       <w:r>
@@ -6152,7 +6236,7 @@
         <w:ind w:left="533" w:hanging="360"/>
         <w:numPr>
           <w:ilvl w:val="0"/>
-          <w:numId w:val="9101"/>
+          <w:numId w:val="9201"/>
         </w:numPr>
       </w:pPr>
       <w:r>
@@ -6473,7 +6557,7 @@
         <w:ind w:left="533" w:hanging="360"/>
         <w:numPr>
           <w:ilvl w:val="0"/>
-          <w:numId w:val="9101"/>
+          <w:numId w:val="9201"/>
         </w:numPr>
       </w:pPr>
       <w:r>
@@ -6546,46 +6630,6 @@
         <w:drawing>
           <wp:inline xmlns:a="http://schemas.openxmlformats.org/drawingml/2006/main" xmlns:pic="http://schemas.openxmlformats.org/drawingml/2006/picture">
             <wp:extent cx="6309360" cy="2474259"/>
-            <wp:docPr id="14" name="Picture 14"/>
-            <wp:cNvGraphicFramePr>
-              <a:graphicFrameLocks noChangeAspect="1"/>
-            </wp:cNvGraphicFramePr>
-            <a:graphic>
-              <a:graphicData uri="http://schemas.openxmlformats.org/drawingml/2006/picture">
-                <pic:pic>
-                  <pic:nvPicPr>
-                    <pic:cNvPr id="0" name="image.png"/>
-                    <pic:cNvPicPr/>
-                  </pic:nvPicPr>
-                  <pic:blipFill>
-                    <a:blip r:embed="rId23"/>
-                    <a:stretch>
-                      <a:fillRect/>
-                    </a:stretch>
-                  </pic:blipFill>
-                  <pic:spPr>
-                    <a:xfrm>
-                      <a:off x="0" y="0"/>
-                      <a:ext cx="6309360" cy="2474259"/>
-                    </a:xfrm>
-                    <a:prstGeom prst="rect"/>
-                  </pic:spPr>
-                </pic:pic>
-              </a:graphicData>
-            </a:graphic>
-          </wp:inline>
-        </w:drawing>
-      </w:r>
-    </w:p>
-    <w:p>
-      <w:pPr>
-        <w:spacing w:before="0" w:after="60" w:line="240" w:lineRule="auto"/>
-        <w:jc w:val="center"/>
-      </w:pPr>
-      <w:r>
-        <w:drawing>
-          <wp:inline xmlns:a="http://schemas.openxmlformats.org/drawingml/2006/main" xmlns:pic="http://schemas.openxmlformats.org/drawingml/2006/picture">
-            <wp:extent cx="6309360" cy="2152605"/>
             <wp:docPr id="15" name="Picture 15"/>
             <wp:cNvGraphicFramePr>
               <a:graphicFrameLocks noChangeAspect="1"/>
@@ -6606,6 +6650,46 @@
                   <pic:spPr>
                     <a:xfrm>
                       <a:off x="0" y="0"/>
+                      <a:ext cx="6309360" cy="2474259"/>
+                    </a:xfrm>
+                    <a:prstGeom prst="rect"/>
+                  </pic:spPr>
+                </pic:pic>
+              </a:graphicData>
+            </a:graphic>
+          </wp:inline>
+        </w:drawing>
+      </w:r>
+    </w:p>
+    <w:p>
+      <w:pPr>
+        <w:spacing w:before="0" w:after="60" w:line="240" w:lineRule="auto"/>
+        <w:jc w:val="center"/>
+      </w:pPr>
+      <w:r>
+        <w:drawing>
+          <wp:inline xmlns:a="http://schemas.openxmlformats.org/drawingml/2006/main" xmlns:pic="http://schemas.openxmlformats.org/drawingml/2006/picture">
+            <wp:extent cx="6309360" cy="2152605"/>
+            <wp:docPr id="16" name="Picture 16"/>
+            <wp:cNvGraphicFramePr>
+              <a:graphicFrameLocks noChangeAspect="1"/>
+            </wp:cNvGraphicFramePr>
+            <a:graphic>
+              <a:graphicData uri="http://schemas.openxmlformats.org/drawingml/2006/picture">
+                <pic:pic>
+                  <pic:nvPicPr>
+                    <pic:cNvPr id="0" name="image.png"/>
+                    <pic:cNvPicPr/>
+                  </pic:nvPicPr>
+                  <pic:blipFill>
+                    <a:blip r:embed="rId25"/>
+                    <a:stretch>
+                      <a:fillRect/>
+                    </a:stretch>
+                  </pic:blipFill>
+                  <pic:spPr>
+                    <a:xfrm>
+                      <a:off x="0" y="0"/>
                       <a:ext cx="6309360" cy="2152605"/>
                     </a:xfrm>
                     <a:prstGeom prst="rect"/>
@@ -6623,7 +6707,7 @@
         <w:ind w:left="533" w:hanging="360"/>
         <w:numPr>
           <w:ilvl w:val="0"/>
-          <w:numId w:val="9101"/>
+          <w:numId w:val="9201"/>
         </w:numPr>
       </w:pPr>
       <w:r>
@@ -6641,7 +6725,7 @@
         <w:ind w:left="533" w:hanging="360"/>
         <w:numPr>
           <w:ilvl w:val="0"/>
-          <w:numId w:val="9101"/>
+          <w:numId w:val="9201"/>
         </w:numPr>
       </w:pPr>
       <w:r>
@@ -6755,7 +6839,7 @@
         <w:ind w:left="533" w:hanging="360"/>
         <w:numPr>
           <w:ilvl w:val="0"/>
-          <w:numId w:val="9101"/>
+          <w:numId w:val="9201"/>
         </w:numPr>
       </w:pPr>
       <w:r>
@@ -6828,46 +6912,6 @@
         <w:drawing>
           <wp:inline xmlns:a="http://schemas.openxmlformats.org/drawingml/2006/main" xmlns:pic="http://schemas.openxmlformats.org/drawingml/2006/picture">
             <wp:extent cx="6309360" cy="2474259"/>
-            <wp:docPr id="16" name="Picture 16"/>
-            <wp:cNvGraphicFramePr>
-              <a:graphicFrameLocks noChangeAspect="1"/>
-            </wp:cNvGraphicFramePr>
-            <a:graphic>
-              <a:graphicData uri="http://schemas.openxmlformats.org/drawingml/2006/picture">
-                <pic:pic>
-                  <pic:nvPicPr>
-                    <pic:cNvPr id="0" name="image.png"/>
-                    <pic:cNvPicPr/>
-                  </pic:nvPicPr>
-                  <pic:blipFill>
-                    <a:blip r:embed="rId25"/>
-                    <a:stretch>
-                      <a:fillRect/>
-                    </a:stretch>
-                  </pic:blipFill>
-                  <pic:spPr>
-                    <a:xfrm>
-                      <a:off x="0" y="0"/>
-                      <a:ext cx="6309360" cy="2474259"/>
-                    </a:xfrm>
-                    <a:prstGeom prst="rect"/>
-                  </pic:spPr>
-                </pic:pic>
-              </a:graphicData>
-            </a:graphic>
-          </wp:inline>
-        </w:drawing>
-      </w:r>
-    </w:p>
-    <w:p>
-      <w:pPr>
-        <w:spacing w:before="0" w:after="60" w:line="240" w:lineRule="auto"/>
-        <w:jc w:val="center"/>
-      </w:pPr>
-      <w:r>
-        <w:drawing>
-          <wp:inline xmlns:a="http://schemas.openxmlformats.org/drawingml/2006/main" xmlns:pic="http://schemas.openxmlformats.org/drawingml/2006/picture">
-            <wp:extent cx="6309360" cy="2152605"/>
             <wp:docPr id="17" name="Picture 17"/>
             <wp:cNvGraphicFramePr>
               <a:graphicFrameLocks noChangeAspect="1"/>
@@ -6888,6 +6932,46 @@
                   <pic:spPr>
                     <a:xfrm>
                       <a:off x="0" y="0"/>
+                      <a:ext cx="6309360" cy="2474259"/>
+                    </a:xfrm>
+                    <a:prstGeom prst="rect"/>
+                  </pic:spPr>
+                </pic:pic>
+              </a:graphicData>
+            </a:graphic>
+          </wp:inline>
+        </w:drawing>
+      </w:r>
+    </w:p>
+    <w:p>
+      <w:pPr>
+        <w:spacing w:before="0" w:after="60" w:line="240" w:lineRule="auto"/>
+        <w:jc w:val="center"/>
+      </w:pPr>
+      <w:r>
+        <w:drawing>
+          <wp:inline xmlns:a="http://schemas.openxmlformats.org/drawingml/2006/main" xmlns:pic="http://schemas.openxmlformats.org/drawingml/2006/picture">
+            <wp:extent cx="6309360" cy="2152605"/>
+            <wp:docPr id="18" name="Picture 18"/>
+            <wp:cNvGraphicFramePr>
+              <a:graphicFrameLocks noChangeAspect="1"/>
+            </wp:cNvGraphicFramePr>
+            <a:graphic>
+              <a:graphicData uri="http://schemas.openxmlformats.org/drawingml/2006/picture">
+                <pic:pic>
+                  <pic:nvPicPr>
+                    <pic:cNvPr id="0" name="image.png"/>
+                    <pic:cNvPicPr/>
+                  </pic:nvPicPr>
+                  <pic:blipFill>
+                    <a:blip r:embed="rId27"/>
+                    <a:stretch>
+                      <a:fillRect/>
+                    </a:stretch>
+                  </pic:blipFill>
+                  <pic:spPr>
+                    <a:xfrm>
+                      <a:off x="0" y="0"/>
                       <a:ext cx="6309360" cy="2152605"/>
                     </a:xfrm>
                     <a:prstGeom prst="rect"/>
@@ -6931,7 +7015,7 @@
         <w:ind w:left="533" w:hanging="360"/>
         <w:numPr>
           <w:ilvl w:val="0"/>
-          <w:numId w:val="9101"/>
+          <w:numId w:val="9201"/>
         </w:numPr>
       </w:pPr>
       <w:r>
@@ -6949,7 +7033,7 @@
         <w:ind w:left="533" w:hanging="360"/>
         <w:numPr>
           <w:ilvl w:val="0"/>
-          <w:numId w:val="9101"/>
+          <w:numId w:val="9201"/>
         </w:numPr>
       </w:pPr>
       <w:r>
@@ -7353,7 +7437,7 @@
         <w:ind w:left="533" w:hanging="360"/>
         <w:numPr>
           <w:ilvl w:val="0"/>
-          <w:numId w:val="9101"/>
+          <w:numId w:val="9201"/>
         </w:numPr>
       </w:pPr>
       <w:r>
@@ -7426,46 +7510,6 @@
         <w:drawing>
           <wp:inline xmlns:a="http://schemas.openxmlformats.org/drawingml/2006/main" xmlns:pic="http://schemas.openxmlformats.org/drawingml/2006/picture">
             <wp:extent cx="6309360" cy="2474259"/>
-            <wp:docPr id="18" name="Picture 18"/>
-            <wp:cNvGraphicFramePr>
-              <a:graphicFrameLocks noChangeAspect="1"/>
-            </wp:cNvGraphicFramePr>
-            <a:graphic>
-              <a:graphicData uri="http://schemas.openxmlformats.org/drawingml/2006/picture">
-                <pic:pic>
-                  <pic:nvPicPr>
-                    <pic:cNvPr id="0" name="image.png"/>
-                    <pic:cNvPicPr/>
-                  </pic:nvPicPr>
-                  <pic:blipFill>
-                    <a:blip r:embed="rId27"/>
-                    <a:stretch>
-                      <a:fillRect/>
-                    </a:stretch>
-                  </pic:blipFill>
-                  <pic:spPr>
-                    <a:xfrm>
-                      <a:off x="0" y="0"/>
-                      <a:ext cx="6309360" cy="2474259"/>
-                    </a:xfrm>
-                    <a:prstGeom prst="rect"/>
-                  </pic:spPr>
-                </pic:pic>
-              </a:graphicData>
-            </a:graphic>
-          </wp:inline>
-        </w:drawing>
-      </w:r>
-    </w:p>
-    <w:p>
-      <w:pPr>
-        <w:spacing w:before="0" w:after="60" w:line="240" w:lineRule="auto"/>
-        <w:jc w:val="center"/>
-      </w:pPr>
-      <w:r>
-        <w:drawing>
-          <wp:inline xmlns:a="http://schemas.openxmlformats.org/drawingml/2006/main" xmlns:pic="http://schemas.openxmlformats.org/drawingml/2006/picture">
-            <wp:extent cx="6309360" cy="1670125"/>
             <wp:docPr id="19" name="Picture 19"/>
             <wp:cNvGraphicFramePr>
               <a:graphicFrameLocks noChangeAspect="1"/>
@@ -7486,6 +7530,46 @@
                   <pic:spPr>
                     <a:xfrm>
                       <a:off x="0" y="0"/>
+                      <a:ext cx="6309360" cy="2474259"/>
+                    </a:xfrm>
+                    <a:prstGeom prst="rect"/>
+                  </pic:spPr>
+                </pic:pic>
+              </a:graphicData>
+            </a:graphic>
+          </wp:inline>
+        </w:drawing>
+      </w:r>
+    </w:p>
+    <w:p>
+      <w:pPr>
+        <w:spacing w:before="0" w:after="60" w:line="240" w:lineRule="auto"/>
+        <w:jc w:val="center"/>
+      </w:pPr>
+      <w:r>
+        <w:drawing>
+          <wp:inline xmlns:a="http://schemas.openxmlformats.org/drawingml/2006/main" xmlns:pic="http://schemas.openxmlformats.org/drawingml/2006/picture">
+            <wp:extent cx="6309360" cy="1670125"/>
+            <wp:docPr id="20" name="Picture 20"/>
+            <wp:cNvGraphicFramePr>
+              <a:graphicFrameLocks noChangeAspect="1"/>
+            </wp:cNvGraphicFramePr>
+            <a:graphic>
+              <a:graphicData uri="http://schemas.openxmlformats.org/drawingml/2006/picture">
+                <pic:pic>
+                  <pic:nvPicPr>
+                    <pic:cNvPr id="0" name="image.png"/>
+                    <pic:cNvPicPr/>
+                  </pic:nvPicPr>
+                  <pic:blipFill>
+                    <a:blip r:embed="rId29"/>
+                    <a:stretch>
+                      <a:fillRect/>
+                    </a:stretch>
+                  </pic:blipFill>
+                  <pic:spPr>
+                    <a:xfrm>
+                      <a:off x="0" y="0"/>
                       <a:ext cx="6309360" cy="1670125"/>
                     </a:xfrm>
                     <a:prstGeom prst="rect"/>
@@ -7503,7 +7587,7 @@
         <w:ind w:left="533" w:hanging="360"/>
         <w:numPr>
           <w:ilvl w:val="0"/>
-          <w:numId w:val="9101"/>
+          <w:numId w:val="9201"/>
         </w:numPr>
       </w:pPr>
       <w:r>
@@ -7521,7 +7605,7 @@
         <w:ind w:left="533" w:hanging="360"/>
         <w:numPr>
           <w:ilvl w:val="0"/>
-          <w:numId w:val="9101"/>
+          <w:numId w:val="9201"/>
         </w:numPr>
       </w:pPr>
       <w:r>
@@ -8008,7 +8092,7 @@
         <w:ind w:left="533" w:hanging="360"/>
         <w:numPr>
           <w:ilvl w:val="0"/>
-          <w:numId w:val="9101"/>
+          <w:numId w:val="9201"/>
         </w:numPr>
       </w:pPr>
       <w:r>
@@ -8081,46 +8165,6 @@
         <w:drawing>
           <wp:inline xmlns:a="http://schemas.openxmlformats.org/drawingml/2006/main" xmlns:pic="http://schemas.openxmlformats.org/drawingml/2006/picture">
             <wp:extent cx="6309360" cy="2474259"/>
-            <wp:docPr id="20" name="Picture 20"/>
-            <wp:cNvGraphicFramePr>
-              <a:graphicFrameLocks noChangeAspect="1"/>
-            </wp:cNvGraphicFramePr>
-            <a:graphic>
-              <a:graphicData uri="http://schemas.openxmlformats.org/drawingml/2006/picture">
-                <pic:pic>
-                  <pic:nvPicPr>
-                    <pic:cNvPr id="0" name="image.png"/>
-                    <pic:cNvPicPr/>
-                  </pic:nvPicPr>
-                  <pic:blipFill>
-                    <a:blip r:embed="rId29"/>
-                    <a:stretch>
-                      <a:fillRect/>
-                    </a:stretch>
-                  </pic:blipFill>
-                  <pic:spPr>
-                    <a:xfrm>
-                      <a:off x="0" y="0"/>
-                      <a:ext cx="6309360" cy="2474259"/>
-                    </a:xfrm>
-                    <a:prstGeom prst="rect"/>
-                  </pic:spPr>
-                </pic:pic>
-              </a:graphicData>
-            </a:graphic>
-          </wp:inline>
-        </w:drawing>
-      </w:r>
-    </w:p>
-    <w:p>
-      <w:pPr>
-        <w:spacing w:before="0" w:after="60" w:line="240" w:lineRule="auto"/>
-        <w:jc w:val="center"/>
-      </w:pPr>
-      <w:r>
-        <w:drawing>
-          <wp:inline xmlns:a="http://schemas.openxmlformats.org/drawingml/2006/main" xmlns:pic="http://schemas.openxmlformats.org/drawingml/2006/picture">
-            <wp:extent cx="6309360" cy="1991778"/>
             <wp:docPr id="21" name="Picture 21"/>
             <wp:cNvGraphicFramePr>
               <a:graphicFrameLocks noChangeAspect="1"/>
@@ -8141,6 +8185,46 @@
                   <pic:spPr>
                     <a:xfrm>
                       <a:off x="0" y="0"/>
+                      <a:ext cx="6309360" cy="2474259"/>
+                    </a:xfrm>
+                    <a:prstGeom prst="rect"/>
+                  </pic:spPr>
+                </pic:pic>
+              </a:graphicData>
+            </a:graphic>
+          </wp:inline>
+        </w:drawing>
+      </w:r>
+    </w:p>
+    <w:p>
+      <w:pPr>
+        <w:spacing w:before="0" w:after="60" w:line="240" w:lineRule="auto"/>
+        <w:jc w:val="center"/>
+      </w:pPr>
+      <w:r>
+        <w:drawing>
+          <wp:inline xmlns:a="http://schemas.openxmlformats.org/drawingml/2006/main" xmlns:pic="http://schemas.openxmlformats.org/drawingml/2006/picture">
+            <wp:extent cx="6309360" cy="1991778"/>
+            <wp:docPr id="22" name="Picture 22"/>
+            <wp:cNvGraphicFramePr>
+              <a:graphicFrameLocks noChangeAspect="1"/>
+            </wp:cNvGraphicFramePr>
+            <a:graphic>
+              <a:graphicData uri="http://schemas.openxmlformats.org/drawingml/2006/picture">
+                <pic:pic>
+                  <pic:nvPicPr>
+                    <pic:cNvPr id="0" name="image.png"/>
+                    <pic:cNvPicPr/>
+                  </pic:nvPicPr>
+                  <pic:blipFill>
+                    <a:blip r:embed="rId31"/>
+                    <a:stretch>
+                      <a:fillRect/>
+                    </a:stretch>
+                  </pic:blipFill>
+                  <pic:spPr>
+                    <a:xfrm>
+                      <a:off x="0" y="0"/>
                       <a:ext cx="6309360" cy="1991778"/>
                     </a:xfrm>
                     <a:prstGeom prst="rect"/>
@@ -8184,7 +8268,7 @@
         <w:ind w:left="533" w:hanging="360"/>
         <w:numPr>
           <w:ilvl w:val="0"/>
-          <w:numId w:val="9101"/>
+          <w:numId w:val="9201"/>
         </w:numPr>
       </w:pPr>
       <w:r>
@@ -8202,7 +8286,7 @@
         <w:ind w:left="533" w:hanging="360"/>
         <w:numPr>
           <w:ilvl w:val="0"/>
-          <w:numId w:val="9101"/>
+          <w:numId w:val="9201"/>
         </w:numPr>
       </w:pPr>
       <w:r>
@@ -8316,7 +8400,7 @@
         <w:ind w:left="533" w:hanging="360"/>
         <w:numPr>
           <w:ilvl w:val="0"/>
-          <w:numId w:val="9101"/>
+          <w:numId w:val="9201"/>
         </w:numPr>
       </w:pPr>
       <w:r>
@@ -8389,46 +8473,6 @@
         <w:drawing>
           <wp:inline xmlns:a="http://schemas.openxmlformats.org/drawingml/2006/main" xmlns:pic="http://schemas.openxmlformats.org/drawingml/2006/picture">
             <wp:extent cx="6309360" cy="2474259"/>
-            <wp:docPr id="22" name="Picture 22"/>
-            <wp:cNvGraphicFramePr>
-              <a:graphicFrameLocks noChangeAspect="1"/>
-            </wp:cNvGraphicFramePr>
-            <a:graphic>
-              <a:graphicData uri="http://schemas.openxmlformats.org/drawingml/2006/picture">
-                <pic:pic>
-                  <pic:nvPicPr>
-                    <pic:cNvPr id="0" name="image.png"/>
-                    <pic:cNvPicPr/>
-                  </pic:nvPicPr>
-                  <pic:blipFill>
-                    <a:blip r:embed="rId31"/>
-                    <a:stretch>
-                      <a:fillRect/>
-                    </a:stretch>
-                  </pic:blipFill>
-                  <pic:spPr>
-                    <a:xfrm>
-                      <a:off x="0" y="0"/>
-                      <a:ext cx="6309360" cy="2474259"/>
-                    </a:xfrm>
-                    <a:prstGeom prst="rect"/>
-                  </pic:spPr>
-                </pic:pic>
-              </a:graphicData>
-            </a:graphic>
-          </wp:inline>
-        </w:drawing>
-      </w:r>
-    </w:p>
-    <w:p>
-      <w:pPr>
-        <w:spacing w:before="0" w:after="60" w:line="240" w:lineRule="auto"/>
-        <w:jc w:val="center"/>
-      </w:pPr>
-      <w:r>
-        <w:drawing>
-          <wp:inline xmlns:a="http://schemas.openxmlformats.org/drawingml/2006/main" xmlns:pic="http://schemas.openxmlformats.org/drawingml/2006/picture">
-            <wp:extent cx="6309360" cy="1670125"/>
             <wp:docPr id="23" name="Picture 23"/>
             <wp:cNvGraphicFramePr>
               <a:graphicFrameLocks noChangeAspect="1"/>
@@ -8449,6 +8493,46 @@
                   <pic:spPr>
                     <a:xfrm>
                       <a:off x="0" y="0"/>
+                      <a:ext cx="6309360" cy="2474259"/>
+                    </a:xfrm>
+                    <a:prstGeom prst="rect"/>
+                  </pic:spPr>
+                </pic:pic>
+              </a:graphicData>
+            </a:graphic>
+          </wp:inline>
+        </w:drawing>
+      </w:r>
+    </w:p>
+    <w:p>
+      <w:pPr>
+        <w:spacing w:before="0" w:after="60" w:line="240" w:lineRule="auto"/>
+        <w:jc w:val="center"/>
+      </w:pPr>
+      <w:r>
+        <w:drawing>
+          <wp:inline xmlns:a="http://schemas.openxmlformats.org/drawingml/2006/main" xmlns:pic="http://schemas.openxmlformats.org/drawingml/2006/picture">
+            <wp:extent cx="6309360" cy="1670125"/>
+            <wp:docPr id="24" name="Picture 24"/>
+            <wp:cNvGraphicFramePr>
+              <a:graphicFrameLocks noChangeAspect="1"/>
+            </wp:cNvGraphicFramePr>
+            <a:graphic>
+              <a:graphicData uri="http://schemas.openxmlformats.org/drawingml/2006/picture">
+                <pic:pic>
+                  <pic:nvPicPr>
+                    <pic:cNvPr id="0" name="image.png"/>
+                    <pic:cNvPicPr/>
+                  </pic:nvPicPr>
+                  <pic:blipFill>
+                    <a:blip r:embed="rId33"/>
+                    <a:stretch>
+                      <a:fillRect/>
+                    </a:stretch>
+                  </pic:blipFill>
+                  <pic:spPr>
+                    <a:xfrm>
+                      <a:off x="0" y="0"/>
                       <a:ext cx="6309360" cy="1670125"/>
                     </a:xfrm>
                     <a:prstGeom prst="rect"/>
@@ -8466,7 +8550,7 @@
         <w:ind w:left="533" w:hanging="360"/>
         <w:numPr>
           <w:ilvl w:val="0"/>
-          <w:numId w:val="9101"/>
+          <w:numId w:val="9201"/>
         </w:numPr>
       </w:pPr>
       <w:r>
@@ -8484,7 +8568,7 @@
         <w:ind w:left="533" w:hanging="360"/>
         <w:numPr>
           <w:ilvl w:val="0"/>
-          <w:numId w:val="9101"/>
+          <w:numId w:val="9201"/>
         </w:numPr>
       </w:pPr>
       <w:r>
@@ -8805,7 +8889,7 @@
         <w:ind w:left="533" w:hanging="360"/>
         <w:numPr>
           <w:ilvl w:val="0"/>
-          <w:numId w:val="9101"/>
+          <w:numId w:val="9201"/>
         </w:numPr>
       </w:pPr>
       <w:r>
@@ -8878,46 +8962,6 @@
         <w:drawing>
           <wp:inline xmlns:a="http://schemas.openxmlformats.org/drawingml/2006/main" xmlns:pic="http://schemas.openxmlformats.org/drawingml/2006/picture">
             <wp:extent cx="6068533" cy="2379817"/>
-            <wp:docPr id="24" name="Picture 24"/>
-            <wp:cNvGraphicFramePr>
-              <a:graphicFrameLocks noChangeAspect="1"/>
-            </wp:cNvGraphicFramePr>
-            <a:graphic>
-              <a:graphicData uri="http://schemas.openxmlformats.org/drawingml/2006/picture">
-                <pic:pic>
-                  <pic:nvPicPr>
-                    <pic:cNvPr id="0" name="image.png"/>
-                    <pic:cNvPicPr/>
-                  </pic:nvPicPr>
-                  <pic:blipFill>
-                    <a:blip r:embed="rId33"/>
-                    <a:stretch>
-                      <a:fillRect/>
-                    </a:stretch>
-                  </pic:blipFill>
-                  <pic:spPr>
-                    <a:xfrm>
-                      <a:off x="0" y="0"/>
-                      <a:ext cx="6068533" cy="2379817"/>
-                    </a:xfrm>
-                    <a:prstGeom prst="rect"/>
-                  </pic:spPr>
-                </pic:pic>
-              </a:graphicData>
-            </a:graphic>
-          </wp:inline>
-        </w:drawing>
-      </w:r>
-    </w:p>
-    <w:p>
-      <w:pPr>
-        <w:spacing w:before="0" w:after="60" w:line="240" w:lineRule="auto"/>
-        <w:jc w:val="center"/>
-      </w:pPr>
-      <w:r>
-        <w:drawing>
-          <wp:inline xmlns:a="http://schemas.openxmlformats.org/drawingml/2006/main" xmlns:pic="http://schemas.openxmlformats.org/drawingml/2006/picture">
-            <wp:extent cx="6068533" cy="2998569"/>
             <wp:docPr id="25" name="Picture 25"/>
             <wp:cNvGraphicFramePr>
               <a:graphicFrameLocks noChangeAspect="1"/>
@@ -8938,6 +8982,46 @@
                   <pic:spPr>
                     <a:xfrm>
                       <a:off x="0" y="0"/>
+                      <a:ext cx="6068533" cy="2379817"/>
+                    </a:xfrm>
+                    <a:prstGeom prst="rect"/>
+                  </pic:spPr>
+                </pic:pic>
+              </a:graphicData>
+            </a:graphic>
+          </wp:inline>
+        </w:drawing>
+      </w:r>
+    </w:p>
+    <w:p>
+      <w:pPr>
+        <w:spacing w:before="0" w:after="60" w:line="240" w:lineRule="auto"/>
+        <w:jc w:val="center"/>
+      </w:pPr>
+      <w:r>
+        <w:drawing>
+          <wp:inline xmlns:a="http://schemas.openxmlformats.org/drawingml/2006/main" xmlns:pic="http://schemas.openxmlformats.org/drawingml/2006/picture">
+            <wp:extent cx="6068533" cy="2998569"/>
+            <wp:docPr id="26" name="Picture 26"/>
+            <wp:cNvGraphicFramePr>
+              <a:graphicFrameLocks noChangeAspect="1"/>
+            </wp:cNvGraphicFramePr>
+            <a:graphic>
+              <a:graphicData uri="http://schemas.openxmlformats.org/drawingml/2006/picture">
+                <pic:pic>
+                  <pic:nvPicPr>
+                    <pic:cNvPr id="0" name="image.png"/>
+                    <pic:cNvPicPr/>
+                  </pic:nvPicPr>
+                  <pic:blipFill>
+                    <a:blip r:embed="rId35"/>
+                    <a:stretch>
+                      <a:fillRect/>
+                    </a:stretch>
+                  </pic:blipFill>
+                  <pic:spPr>
+                    <a:xfrm>
+                      <a:off x="0" y="0"/>
                       <a:ext cx="6068533" cy="2998569"/>
                     </a:xfrm>
                     <a:prstGeom prst="rect"/>
@@ -8955,7 +9039,7 @@
         <w:ind w:left="533" w:hanging="360"/>
         <w:numPr>
           <w:ilvl w:val="0"/>
-          <w:numId w:val="9101"/>
+          <w:numId w:val="9201"/>
         </w:numPr>
       </w:pPr>
       <w:r>
@@ -8973,7 +9057,7 @@
         <w:ind w:left="533" w:hanging="360"/>
         <w:numPr>
           <w:ilvl w:val="0"/>
-          <w:numId w:val="9101"/>
+          <w:numId w:val="9201"/>
         </w:numPr>
       </w:pPr>
       <w:r>
@@ -9377,7 +9461,7 @@
         <w:ind w:left="533" w:hanging="360"/>
         <w:numPr>
           <w:ilvl w:val="0"/>
-          <w:numId w:val="9101"/>
+          <w:numId w:val="9201"/>
         </w:numPr>
       </w:pPr>
       <w:r>
@@ -9450,46 +9534,6 @@
         <w:drawing>
           <wp:inline xmlns:a="http://schemas.openxmlformats.org/drawingml/2006/main" xmlns:pic="http://schemas.openxmlformats.org/drawingml/2006/picture">
             <wp:extent cx="6309360" cy="2474259"/>
-            <wp:docPr id="26" name="Picture 26"/>
-            <wp:cNvGraphicFramePr>
-              <a:graphicFrameLocks noChangeAspect="1"/>
-            </wp:cNvGraphicFramePr>
-            <a:graphic>
-              <a:graphicData uri="http://schemas.openxmlformats.org/drawingml/2006/picture">
-                <pic:pic>
-                  <pic:nvPicPr>
-                    <pic:cNvPr id="0" name="image.png"/>
-                    <pic:cNvPicPr/>
-                  </pic:nvPicPr>
-                  <pic:blipFill>
-                    <a:blip r:embed="rId35"/>
-                    <a:stretch>
-                      <a:fillRect/>
-                    </a:stretch>
-                  </pic:blipFill>
-                  <pic:spPr>
-                    <a:xfrm>
-                      <a:off x="0" y="0"/>
-                      <a:ext cx="6309360" cy="2474259"/>
-                    </a:xfrm>
-                    <a:prstGeom prst="rect"/>
-                  </pic:spPr>
-                </pic:pic>
-              </a:graphicData>
-            </a:graphic>
-          </wp:inline>
-        </w:drawing>
-      </w:r>
-    </w:p>
-    <w:p>
-      <w:pPr>
-        <w:spacing w:before="0" w:after="60" w:line="240" w:lineRule="auto"/>
-        <w:jc w:val="center"/>
-      </w:pPr>
-      <w:r>
-        <w:drawing>
-          <wp:inline xmlns:a="http://schemas.openxmlformats.org/drawingml/2006/main" xmlns:pic="http://schemas.openxmlformats.org/drawingml/2006/picture">
-            <wp:extent cx="6309360" cy="2313432"/>
             <wp:docPr id="27" name="Picture 27"/>
             <wp:cNvGraphicFramePr>
               <a:graphicFrameLocks noChangeAspect="1"/>
@@ -9510,6 +9554,46 @@
                   <pic:spPr>
                     <a:xfrm>
                       <a:off x="0" y="0"/>
+                      <a:ext cx="6309360" cy="2474259"/>
+                    </a:xfrm>
+                    <a:prstGeom prst="rect"/>
+                  </pic:spPr>
+                </pic:pic>
+              </a:graphicData>
+            </a:graphic>
+          </wp:inline>
+        </w:drawing>
+      </w:r>
+    </w:p>
+    <w:p>
+      <w:pPr>
+        <w:spacing w:before="0" w:after="60" w:line="240" w:lineRule="auto"/>
+        <w:jc w:val="center"/>
+      </w:pPr>
+      <w:r>
+        <w:drawing>
+          <wp:inline xmlns:a="http://schemas.openxmlformats.org/drawingml/2006/main" xmlns:pic="http://schemas.openxmlformats.org/drawingml/2006/picture">
+            <wp:extent cx="6309360" cy="2313432"/>
+            <wp:docPr id="28" name="Picture 28"/>
+            <wp:cNvGraphicFramePr>
+              <a:graphicFrameLocks noChangeAspect="1"/>
+            </wp:cNvGraphicFramePr>
+            <a:graphic>
+              <a:graphicData uri="http://schemas.openxmlformats.org/drawingml/2006/picture">
+                <pic:pic>
+                  <pic:nvPicPr>
+                    <pic:cNvPr id="0" name="image.png"/>
+                    <pic:cNvPicPr/>
+                  </pic:nvPicPr>
+                  <pic:blipFill>
+                    <a:blip r:embed="rId37"/>
+                    <a:stretch>
+                      <a:fillRect/>
+                    </a:stretch>
+                  </pic:blipFill>
+                  <pic:spPr>
+                    <a:xfrm>
+                      <a:off x="0" y="0"/>
                       <a:ext cx="6309360" cy="2313432"/>
                     </a:xfrm>
                     <a:prstGeom prst="rect"/>
@@ -9527,7 +9611,7 @@
         <w:ind w:left="533" w:hanging="360"/>
         <w:numPr>
           <w:ilvl w:val="0"/>
-          <w:numId w:val="9101"/>
+          <w:numId w:val="9201"/>
         </w:numPr>
       </w:pPr>
       <w:r>
@@ -9545,7 +9629,7 @@
         <w:ind w:left="533" w:hanging="360"/>
         <w:numPr>
           <w:ilvl w:val="0"/>
-          <w:numId w:val="9101"/>
+          <w:numId w:val="9201"/>
         </w:numPr>
       </w:pPr>
       <w:r>
@@ -9659,7 +9743,7 @@
         <w:ind w:left="533" w:hanging="360"/>
         <w:numPr>
           <w:ilvl w:val="0"/>
-          <w:numId w:val="9101"/>
+          <w:numId w:val="9201"/>
         </w:numPr>
       </w:pPr>
       <w:r>
@@ -9732,46 +9816,6 @@
         <w:drawing>
           <wp:inline xmlns:a="http://schemas.openxmlformats.org/drawingml/2006/main" xmlns:pic="http://schemas.openxmlformats.org/drawingml/2006/picture">
             <wp:extent cx="6198686" cy="2430857"/>
-            <wp:docPr id="28" name="Picture 28"/>
-            <wp:cNvGraphicFramePr>
-              <a:graphicFrameLocks noChangeAspect="1"/>
-            </wp:cNvGraphicFramePr>
-            <a:graphic>
-              <a:graphicData uri="http://schemas.openxmlformats.org/drawingml/2006/picture">
-                <pic:pic>
-                  <pic:nvPicPr>
-                    <pic:cNvPr id="0" name="image.png"/>
-                    <pic:cNvPicPr/>
-                  </pic:nvPicPr>
-                  <pic:blipFill>
-                    <a:blip r:embed="rId37"/>
-                    <a:stretch>
-                      <a:fillRect/>
-                    </a:stretch>
-                  </pic:blipFill>
-                  <pic:spPr>
-                    <a:xfrm>
-                      <a:off x="0" y="0"/>
-                      <a:ext cx="6198686" cy="2430857"/>
-                    </a:xfrm>
-                    <a:prstGeom prst="rect"/>
-                  </pic:spPr>
-                </pic:pic>
-              </a:graphicData>
-            </a:graphic>
-          </wp:inline>
-        </w:drawing>
-      </w:r>
-    </w:p>
-    <w:p>
-      <w:pPr>
-        <w:spacing w:before="0" w:after="60" w:line="240" w:lineRule="auto"/>
-        <w:jc w:val="center"/>
-      </w:pPr>
-      <w:r>
-        <w:drawing>
-          <wp:inline xmlns:a="http://schemas.openxmlformats.org/drawingml/2006/main" xmlns:pic="http://schemas.openxmlformats.org/drawingml/2006/picture">
-            <wp:extent cx="6198686" cy="2746868"/>
             <wp:docPr id="29" name="Picture 29"/>
             <wp:cNvGraphicFramePr>
               <a:graphicFrameLocks noChangeAspect="1"/>
@@ -9792,6 +9836,46 @@
                   <pic:spPr>
                     <a:xfrm>
                       <a:off x="0" y="0"/>
+                      <a:ext cx="6198686" cy="2430857"/>
+                    </a:xfrm>
+                    <a:prstGeom prst="rect"/>
+                  </pic:spPr>
+                </pic:pic>
+              </a:graphicData>
+            </a:graphic>
+          </wp:inline>
+        </w:drawing>
+      </w:r>
+    </w:p>
+    <w:p>
+      <w:pPr>
+        <w:spacing w:before="0" w:after="60" w:line="240" w:lineRule="auto"/>
+        <w:jc w:val="center"/>
+      </w:pPr>
+      <w:r>
+        <w:drawing>
+          <wp:inline xmlns:a="http://schemas.openxmlformats.org/drawingml/2006/main" xmlns:pic="http://schemas.openxmlformats.org/drawingml/2006/picture">
+            <wp:extent cx="6198686" cy="2746868"/>
+            <wp:docPr id="30" name="Picture 30"/>
+            <wp:cNvGraphicFramePr>
+              <a:graphicFrameLocks noChangeAspect="1"/>
+            </wp:cNvGraphicFramePr>
+            <a:graphic>
+              <a:graphicData uri="http://schemas.openxmlformats.org/drawingml/2006/picture">
+                <pic:pic>
+                  <pic:nvPicPr>
+                    <pic:cNvPr id="0" name="image.png"/>
+                    <pic:cNvPicPr/>
+                  </pic:nvPicPr>
+                  <pic:blipFill>
+                    <a:blip r:embed="rId39"/>
+                    <a:stretch>
+                      <a:fillRect/>
+                    </a:stretch>
+                  </pic:blipFill>
+                  <pic:spPr>
+                    <a:xfrm>
+                      <a:off x="0" y="0"/>
                       <a:ext cx="6198686" cy="2746868"/>
                     </a:xfrm>
                     <a:prstGeom prst="rect"/>
@@ -9835,7 +9919,7 @@
         <w:ind w:left="533" w:hanging="360"/>
         <w:numPr>
           <w:ilvl w:val="0"/>
-          <w:numId w:val="9101"/>
+          <w:numId w:val="9201"/>
         </w:numPr>
       </w:pPr>
       <w:r>
@@ -9853,7 +9937,7 @@
         <w:ind w:left="533" w:hanging="360"/>
         <w:numPr>
           <w:ilvl w:val="0"/>
-          <w:numId w:val="9101"/>
+          <w:numId w:val="9201"/>
         </w:numPr>
       </w:pPr>
       <w:r>
@@ -10257,7 +10341,7 @@
         <w:ind w:left="533" w:hanging="360"/>
         <w:numPr>
           <w:ilvl w:val="0"/>
-          <w:numId w:val="9101"/>
+          <w:numId w:val="9201"/>
         </w:numPr>
       </w:pPr>
       <w:r>
@@ -10330,46 +10414,6 @@
         <w:drawing>
           <wp:inline xmlns:a="http://schemas.openxmlformats.org/drawingml/2006/main" xmlns:pic="http://schemas.openxmlformats.org/drawingml/2006/picture">
             <wp:extent cx="6248239" cy="2450290"/>
-            <wp:docPr id="30" name="Picture 30"/>
-            <wp:cNvGraphicFramePr>
-              <a:graphicFrameLocks noChangeAspect="1"/>
-            </wp:cNvGraphicFramePr>
-            <a:graphic>
-              <a:graphicData uri="http://schemas.openxmlformats.org/drawingml/2006/picture">
-                <pic:pic>
-                  <pic:nvPicPr>
-                    <pic:cNvPr id="0" name="image.png"/>
-                    <pic:cNvPicPr/>
-                  </pic:nvPicPr>
-                  <pic:blipFill>
-                    <a:blip r:embed="rId39"/>
-                    <a:stretch>
-                      <a:fillRect/>
-                    </a:stretch>
-                  </pic:blipFill>
-                  <pic:spPr>
-                    <a:xfrm>
-                      <a:off x="0" y="0"/>
-                      <a:ext cx="6248239" cy="2450290"/>
-                    </a:xfrm>
-                    <a:prstGeom prst="rect"/>
-                  </pic:spPr>
-                </pic:pic>
-              </a:graphicData>
-            </a:graphic>
-          </wp:inline>
-        </w:drawing>
-      </w:r>
-    </w:p>
-    <w:p>
-      <w:pPr>
-        <w:spacing w:before="0" w:after="60" w:line="240" w:lineRule="auto"/>
-        <w:jc w:val="center"/>
-      </w:pPr>
-      <w:r>
-        <w:drawing>
-          <wp:inline xmlns:a="http://schemas.openxmlformats.org/drawingml/2006/main" xmlns:pic="http://schemas.openxmlformats.org/drawingml/2006/picture">
-            <wp:extent cx="6248239" cy="2928096"/>
             <wp:docPr id="31" name="Picture 31"/>
             <wp:cNvGraphicFramePr>
               <a:graphicFrameLocks noChangeAspect="1"/>
@@ -10390,6 +10434,46 @@
                   <pic:spPr>
                     <a:xfrm>
                       <a:off x="0" y="0"/>
+                      <a:ext cx="6248239" cy="2450290"/>
+                    </a:xfrm>
+                    <a:prstGeom prst="rect"/>
+                  </pic:spPr>
+                </pic:pic>
+              </a:graphicData>
+            </a:graphic>
+          </wp:inline>
+        </w:drawing>
+      </w:r>
+    </w:p>
+    <w:p>
+      <w:pPr>
+        <w:spacing w:before="0" w:after="60" w:line="240" w:lineRule="auto"/>
+        <w:jc w:val="center"/>
+      </w:pPr>
+      <w:r>
+        <w:drawing>
+          <wp:inline xmlns:a="http://schemas.openxmlformats.org/drawingml/2006/main" xmlns:pic="http://schemas.openxmlformats.org/drawingml/2006/picture">
+            <wp:extent cx="6248239" cy="2928096"/>
+            <wp:docPr id="32" name="Picture 32"/>
+            <wp:cNvGraphicFramePr>
+              <a:graphicFrameLocks noChangeAspect="1"/>
+            </wp:cNvGraphicFramePr>
+            <a:graphic>
+              <a:graphicData uri="http://schemas.openxmlformats.org/drawingml/2006/picture">
+                <pic:pic>
+                  <pic:nvPicPr>
+                    <pic:cNvPr id="0" name="image.png"/>
+                    <pic:cNvPicPr/>
+                  </pic:nvPicPr>
+                  <pic:blipFill>
+                    <a:blip r:embed="rId41"/>
+                    <a:stretch>
+                      <a:fillRect/>
+                    </a:stretch>
+                  </pic:blipFill>
+                  <pic:spPr>
+                    <a:xfrm>
+                      <a:off x="0" y="0"/>
                       <a:ext cx="6248239" cy="2928096"/>
                     </a:xfrm>
                     <a:prstGeom prst="rect"/>
@@ -10407,7 +10491,7 @@
         <w:ind w:left="533" w:hanging="360"/>
         <w:numPr>
           <w:ilvl w:val="0"/>
-          <w:numId w:val="9101"/>
+          <w:numId w:val="9201"/>
         </w:numPr>
       </w:pPr>
       <w:r>
@@ -10425,7 +10509,7 @@
         <w:ind w:left="533" w:hanging="360"/>
         <w:numPr>
           <w:ilvl w:val="0"/>
-          <w:numId w:val="9101"/>
+          <w:numId w:val="9201"/>
         </w:numPr>
       </w:pPr>
       <w:r>
@@ -10829,7 +10913,7 @@
         <w:ind w:left="533" w:hanging="360"/>
         <w:numPr>
           <w:ilvl w:val="0"/>
-          <w:numId w:val="9101"/>
+          <w:numId w:val="9201"/>
         </w:numPr>
       </w:pPr>
       <w:r>
@@ -10891,46 +10975,6 @@
           <w:sz w:val="24"/>
         </w:rPr>
         <w:t>$130.44</w:t>
-      </w:r>
-    </w:p>
-    <w:p>
-      <w:pPr>
-        <w:spacing w:before="0" w:after="60" w:line="240" w:lineRule="auto"/>
-        <w:jc w:val="center"/>
-      </w:pPr>
-      <w:r>
-        <w:drawing>
-          <wp:inline xmlns:a="http://schemas.openxmlformats.org/drawingml/2006/main" xmlns:pic="http://schemas.openxmlformats.org/drawingml/2006/picture">
-            <wp:extent cx="6309360" cy="2474259"/>
-            <wp:docPr id="32" name="Picture 32"/>
-            <wp:cNvGraphicFramePr>
-              <a:graphicFrameLocks noChangeAspect="1"/>
-            </wp:cNvGraphicFramePr>
-            <a:graphic>
-              <a:graphicData uri="http://schemas.openxmlformats.org/drawingml/2006/picture">
-                <pic:pic>
-                  <pic:nvPicPr>
-                    <pic:cNvPr id="0" name="image.png"/>
-                    <pic:cNvPicPr/>
-                  </pic:nvPicPr>
-                  <pic:blipFill>
-                    <a:blip r:embed="rId41"/>
-                    <a:stretch>
-                      <a:fillRect/>
-                    </a:stretch>
-                  </pic:blipFill>
-                  <pic:spPr>
-                    <a:xfrm>
-                      <a:off x="0" y="0"/>
-                      <a:ext cx="6309360" cy="2474259"/>
-                    </a:xfrm>
-                    <a:prstGeom prst="rect"/>
-                  </pic:spPr>
-                </pic:pic>
-              </a:graphicData>
-            </a:graphic>
-          </wp:inline>
-        </w:drawing>
       </w:r>
     </w:p>
     <w:p>
@@ -10975,208 +11019,6 @@
     </w:p>
     <w:p>
       <w:pPr>
-        <w:spacing w:before="0" w:after="40" w:line="240" w:lineRule="auto"/>
-        <w:ind w:left="533" w:hanging="360"/>
-        <w:numPr>
-          <w:ilvl w:val="0"/>
-          <w:numId w:val="9101"/>
-        </w:numPr>
-      </w:pPr>
-      <w:r>
-        <w:rPr>
-          <w:rFonts w:ascii="Arial" w:hAnsi="Arial"/>
-          <w:b w:val="0"/>
-          <w:sz w:val="24"/>
-        </w:rPr>
-        <w:t>The costs decreased by $167.32 due to usage of following services: EC2-Instances, VPC, EC2-Other.</w:t>
-      </w:r>
-    </w:p>
-    <w:p>
-      <w:pPr>
-        <w:spacing w:before="0" w:after="120" w:line="240" w:lineRule="auto"/>
-        <w:ind w:left="533" w:hanging="360"/>
-        <w:numPr>
-          <w:ilvl w:val="0"/>
-          <w:numId w:val="9101"/>
-        </w:numPr>
-      </w:pPr>
-      <w:r>
-        <w:rPr>
-          <w:rFonts w:ascii="Arial" w:hAnsi="Arial"/>
-          <w:b/>
-          <w:sz w:val="24"/>
-        </w:rPr>
-        <w:t>No Activity performed by Operisoft in this account.</w:t>
-      </w:r>
-    </w:p>
-    <w:p>
-      <w:pPr>
-        <w:keepNext/>
-        <w:spacing w:before="0" w:after="80" w:line="240" w:lineRule="auto"/>
-      </w:pPr>
-      <w:r>
-        <w:rPr>
-          <w:rFonts w:ascii="Arial" w:hAnsi="Arial"/>
-          <w:b/>
-          <w:i w:val="0"/>
-          <w:sz w:val="28"/>
-        </w:rPr>
-        <w:t>Resource Utilization &amp; Alarms</w:t>
-      </w:r>
-    </w:p>
-    <w:p>
-      <w:pPr>
-        <w:spacing w:before="0" w:after="40" w:line="240" w:lineRule="auto"/>
-      </w:pPr>
-      <w:r>
-        <w:rPr>
-          <w:rFonts w:ascii="Arial" w:hAnsi="Arial"/>
-          <w:b w:val="0"/>
-          <w:i w:val="0"/>
-          <w:sz w:val="22"/>
-        </w:rPr>
-        <w:t>No Resource Utilization &amp; Alarms.</w:t>
-      </w:r>
-    </w:p>
-    <w:p>
-      <w:pPr>
-        <w:pageBreakBefore/>
-        <w:spacing w:before="0" w:after="40" w:line="240" w:lineRule="auto"/>
-        <w:jc w:val="center"/>
-      </w:pPr>
-      <w:r>
-        <w:rPr>
-          <w:rFonts w:ascii="Arial" w:hAnsi="Arial"/>
-          <w:b/>
-          <w:sz w:val="19"/>
-        </w:rPr>
-        <w:t xml:space="preserve">------------------------------------------------------- </w:t>
-      </w:r>
-      <w:hyperlink w:anchor="Summary" w:history="1">
-        <w:r>
-          <w:rPr>
-            <w:rFonts w:ascii="Arial" w:hAnsi="Arial"/>
-            <w:b/>
-            <w:color w:val="1F487C"/>
-            <w:sz w:val="20"/>
-            <w:u w:val="single"/>
-          </w:rPr>
-          <w:t xml:space="preserve">Summary</w:t>
-        </w:r>
-      </w:hyperlink>
-      <w:r>
-        <w:rPr>
-          <w:rFonts w:ascii="Arial" w:hAnsi="Arial"/>
-          <w:b/>
-          <w:sz w:val="19"/>
-        </w:rPr>
-        <w:t xml:space="preserve"> -------------------------------------------------------</w:t>
-      </w:r>
-    </w:p>
-    <w:p>
-      <w:pPr>
-        <w:spacing w:before="0" w:after="40" w:line="240" w:lineRule="auto"/>
-        <w:jc w:val="center"/>
-      </w:pPr>
-      <w:bookmarkStart w:id="17" w:name="_acc_377555974222"/>
-      <w:r>
-        <w:rPr>
-          <w:rFonts w:ascii="Arial" w:hAnsi="Arial"/>
-          <w:b/>
-          <w:i w:val="0"/>
-          <w:sz w:val="28"/>
-          <w:u w:val="single"/>
-        </w:rPr>
-        <w:t>Aptrack AR_VR_MAAC – 377555974222</w:t>
-      </w:r>
-      <w:bookmarkEnd w:id="17"/>
-    </w:p>
-    <w:p>
-      <w:pPr>
-        <w:spacing w:before="0" w:after="80" w:line="240" w:lineRule="auto"/>
-      </w:pPr>
-      <w:r>
-        <w:rPr>
-          <w:rFonts w:ascii="Arial" w:hAnsi="Arial"/>
-          <w:b/>
-          <w:i w:val="0"/>
-          <w:sz w:val="19"/>
-        </w:rPr>
-        <w:t>--------------------------------------------------------------------------------------------------------------------------------</w:t>
-      </w:r>
-    </w:p>
-    <w:p>
-      <w:pPr>
-        <w:spacing w:before="0" w:after="60" w:line="240" w:lineRule="auto"/>
-        <w:ind w:left="533" w:hanging="360"/>
-        <w:numPr>
-          <w:ilvl w:val="0"/>
-          <w:numId w:val="9101"/>
-        </w:numPr>
-      </w:pPr>
-      <w:r>
-        <w:rPr>
-          <w:rFonts w:ascii="Arial" w:hAnsi="Arial"/>
-          <w:b/>
-          <w:sz w:val="24"/>
-        </w:rPr>
-        <w:t>Billing and Cost Overview</w:t>
-      </w:r>
-    </w:p>
-    <w:p>
-      <w:pPr>
-        <w:spacing w:before="0" w:after="40" w:line="240" w:lineRule="auto"/>
-        <w:ind w:left="1354" w:hanging="360"/>
-        <w:numPr>
-          <w:ilvl w:val="1"/>
-          <w:numId w:val="9101"/>
-        </w:numPr>
-      </w:pPr>
-      <w:r>
-        <w:rPr>
-          <w:rFonts w:ascii="Arial" w:hAnsi="Arial"/>
-          <w:b w:val="0"/>
-          <w:sz w:val="24"/>
-        </w:rPr>
-        <w:t xml:space="preserve">Total cost for the week: </w:t>
-      </w:r>
-      <w:r>
-        <w:rPr>
-          <w:rFonts w:ascii="Arial" w:hAnsi="Arial"/>
-          <w:b/>
-          <w:sz w:val="24"/>
-        </w:rPr>
-        <w:t>$1,226.69</w:t>
-      </w:r>
-    </w:p>
-    <w:p>
-      <w:pPr>
-        <w:spacing w:before="0" w:after="80" w:line="240" w:lineRule="auto"/>
-        <w:ind w:left="1354" w:hanging="360"/>
-        <w:numPr>
-          <w:ilvl w:val="1"/>
-          <w:numId w:val="9101"/>
-        </w:numPr>
-      </w:pPr>
-      <w:r>
-        <w:rPr>
-          <w:rFonts w:ascii="Arial" w:hAnsi="Arial"/>
-          <w:b w:val="0"/>
-          <w:sz w:val="24"/>
-        </w:rPr>
-        <w:t xml:space="preserve">Average Daily Cost: </w:t>
-      </w:r>
-      <w:r>
-        <w:rPr>
-          <w:rFonts w:ascii="Arial" w:hAnsi="Arial"/>
-          <w:b/>
-          <w:sz w:val="24"/>
-        </w:rPr>
-        <w:t>$175.24</w:t>
-      </w:r>
-    </w:p>
-    <w:p>
-      <w:pPr>
         <w:spacing w:before="0" w:after="60" w:line="240" w:lineRule="auto"/>
         <w:jc w:val="center"/>
       </w:pPr>
@@ -11217,13 +11059,215 @@
     </w:p>
     <w:p>
       <w:pPr>
+        <w:spacing w:before="0" w:after="40" w:line="240" w:lineRule="auto"/>
+        <w:ind w:left="533" w:hanging="360"/>
+        <w:numPr>
+          <w:ilvl w:val="0"/>
+          <w:numId w:val="9201"/>
+        </w:numPr>
+      </w:pPr>
+      <w:r>
+        <w:rPr>
+          <w:rFonts w:ascii="Arial" w:hAnsi="Arial"/>
+          <w:b w:val="0"/>
+          <w:sz w:val="24"/>
+        </w:rPr>
+        <w:t>The costs decreased by $167.32 due to usage of following services: EC2-Instances, VPC, EC2-Other.</w:t>
+      </w:r>
+    </w:p>
+    <w:p>
+      <w:pPr>
+        <w:spacing w:before="0" w:after="120" w:line="240" w:lineRule="auto"/>
+        <w:ind w:left="533" w:hanging="360"/>
+        <w:numPr>
+          <w:ilvl w:val="0"/>
+          <w:numId w:val="9201"/>
+        </w:numPr>
+      </w:pPr>
+      <w:r>
+        <w:rPr>
+          <w:rFonts w:ascii="Arial" w:hAnsi="Arial"/>
+          <w:b/>
+          <w:sz w:val="24"/>
+        </w:rPr>
+        <w:t>No Activity performed by Operisoft in this account.</w:t>
+      </w:r>
+    </w:p>
+    <w:p>
+      <w:pPr>
+        <w:keepNext/>
+        <w:spacing w:before="0" w:after="80" w:line="240" w:lineRule="auto"/>
+      </w:pPr>
+      <w:r>
+        <w:rPr>
+          <w:rFonts w:ascii="Arial" w:hAnsi="Arial"/>
+          <w:b/>
+          <w:i w:val="0"/>
+          <w:sz w:val="28"/>
+        </w:rPr>
+        <w:t>Resource Utilization &amp; Alarms</w:t>
+      </w:r>
+    </w:p>
+    <w:p>
+      <w:pPr>
+        <w:spacing w:before="0" w:after="40" w:line="240" w:lineRule="auto"/>
+      </w:pPr>
+      <w:r>
+        <w:rPr>
+          <w:rFonts w:ascii="Arial" w:hAnsi="Arial"/>
+          <w:b w:val="0"/>
+          <w:i w:val="0"/>
+          <w:sz w:val="22"/>
+        </w:rPr>
+        <w:t>No Resource Utilization &amp; Alarms.</w:t>
+      </w:r>
+    </w:p>
+    <w:p>
+      <w:pPr>
+        <w:pageBreakBefore/>
+        <w:spacing w:before="0" w:after="40" w:line="240" w:lineRule="auto"/>
+        <w:jc w:val="center"/>
+      </w:pPr>
+      <w:r>
+        <w:rPr>
+          <w:rFonts w:ascii="Arial" w:hAnsi="Arial"/>
+          <w:b/>
+          <w:sz w:val="19"/>
+        </w:rPr>
+        <w:t xml:space="preserve">------------------------------------------------------- </w:t>
+      </w:r>
+      <w:hyperlink w:anchor="Summary" w:history="1">
+        <w:r>
+          <w:rPr>
+            <w:rFonts w:ascii="Arial" w:hAnsi="Arial"/>
+            <w:b/>
+            <w:color w:val="1F487C"/>
+            <w:sz w:val="20"/>
+            <w:u w:val="single"/>
+          </w:rPr>
+          <w:t xml:space="preserve">Summary</w:t>
+        </w:r>
+      </w:hyperlink>
+      <w:r>
+        <w:rPr>
+          <w:rFonts w:ascii="Arial" w:hAnsi="Arial"/>
+          <w:b/>
+          <w:sz w:val="19"/>
+        </w:rPr>
+        <w:t xml:space="preserve"> -------------------------------------------------------</w:t>
+      </w:r>
+    </w:p>
+    <w:p>
+      <w:pPr>
+        <w:spacing w:before="0" w:after="40" w:line="240" w:lineRule="auto"/>
+        <w:jc w:val="center"/>
+      </w:pPr>
+      <w:bookmarkStart w:id="17" w:name="_acc_377555974222"/>
+      <w:r>
+        <w:rPr>
+          <w:rFonts w:ascii="Arial" w:hAnsi="Arial"/>
+          <w:b/>
+          <w:i w:val="0"/>
+          <w:sz w:val="28"/>
+          <w:u w:val="single"/>
+        </w:rPr>
+        <w:t>Aptrack AR_VR_MAAC – 377555974222</w:t>
+      </w:r>
+      <w:bookmarkEnd w:id="17"/>
+    </w:p>
+    <w:p>
+      <w:pPr>
+        <w:spacing w:before="0" w:after="80" w:line="240" w:lineRule="auto"/>
+      </w:pPr>
+      <w:r>
+        <w:rPr>
+          <w:rFonts w:ascii="Arial" w:hAnsi="Arial"/>
+          <w:b/>
+          <w:i w:val="0"/>
+          <w:sz w:val="19"/>
+        </w:rPr>
+        <w:t>--------------------------------------------------------------------------------------------------------------------------------</w:t>
+      </w:r>
+    </w:p>
+    <w:p>
+      <w:pPr>
+        <w:spacing w:before="0" w:after="60" w:line="240" w:lineRule="auto"/>
+        <w:ind w:left="533" w:hanging="360"/>
+        <w:numPr>
+          <w:ilvl w:val="0"/>
+          <w:numId w:val="9201"/>
+        </w:numPr>
+      </w:pPr>
+      <w:r>
+        <w:rPr>
+          <w:rFonts w:ascii="Arial" w:hAnsi="Arial"/>
+          <w:b/>
+          <w:sz w:val="24"/>
+        </w:rPr>
+        <w:t>Billing and Cost Overview</w:t>
+      </w:r>
+    </w:p>
+    <w:p>
+      <w:pPr>
+        <w:spacing w:before="0" w:after="40" w:line="240" w:lineRule="auto"/>
+        <w:ind w:left="1354" w:hanging="360"/>
+        <w:numPr>
+          <w:ilvl w:val="1"/>
+          <w:numId w:val="9101"/>
+        </w:numPr>
+      </w:pPr>
+      <w:r>
+        <w:rPr>
+          <w:rFonts w:ascii="Arial" w:hAnsi="Arial"/>
+          <w:b w:val="0"/>
+          <w:sz w:val="24"/>
+        </w:rPr>
+        <w:t xml:space="preserve">Total cost for the week: </w:t>
+      </w:r>
+      <w:r>
+        <w:rPr>
+          <w:rFonts w:ascii="Arial" w:hAnsi="Arial"/>
+          <w:b/>
+          <w:sz w:val="24"/>
+        </w:rPr>
+        <w:t>$1,226.69</w:t>
+      </w:r>
+    </w:p>
+    <w:p>
+      <w:pPr>
+        <w:spacing w:before="0" w:after="80" w:line="240" w:lineRule="auto"/>
+        <w:ind w:left="1354" w:hanging="360"/>
+        <w:numPr>
+          <w:ilvl w:val="1"/>
+          <w:numId w:val="9101"/>
+        </w:numPr>
+      </w:pPr>
+      <w:r>
+        <w:rPr>
+          <w:rFonts w:ascii="Arial" w:hAnsi="Arial"/>
+          <w:b w:val="0"/>
+          <w:sz w:val="24"/>
+        </w:rPr>
+        <w:t xml:space="preserve">Average Daily Cost: </w:t>
+      </w:r>
+      <w:r>
+        <w:rPr>
+          <w:rFonts w:ascii="Arial" w:hAnsi="Arial"/>
+          <w:b/>
+          <w:sz w:val="24"/>
+        </w:rPr>
+        <w:t>$175.24</w:t>
+      </w:r>
+    </w:p>
+    <w:p>
+      <w:pPr>
         <w:spacing w:before="0" w:after="60" w:line="240" w:lineRule="auto"/>
         <w:jc w:val="center"/>
       </w:pPr>
       <w:r>
         <w:drawing>
           <wp:inline xmlns:a="http://schemas.openxmlformats.org/drawingml/2006/main" xmlns:pic="http://schemas.openxmlformats.org/drawingml/2006/picture">
-            <wp:extent cx="6309360" cy="2313432"/>
+            <wp:extent cx="6309360" cy="2474259"/>
             <wp:docPr id="35" name="Picture 35"/>
             <wp:cNvGraphicFramePr>
               <a:graphicFrameLocks noChangeAspect="1"/>
@@ -11244,6 +11288,46 @@
                   <pic:spPr>
                     <a:xfrm>
                       <a:off x="0" y="0"/>
+                      <a:ext cx="6309360" cy="2474259"/>
+                    </a:xfrm>
+                    <a:prstGeom prst="rect"/>
+                  </pic:spPr>
+                </pic:pic>
+              </a:graphicData>
+            </a:graphic>
+          </wp:inline>
+        </w:drawing>
+      </w:r>
+    </w:p>
+    <w:p>
+      <w:pPr>
+        <w:spacing w:before="0" w:after="60" w:line="240" w:lineRule="auto"/>
+        <w:jc w:val="center"/>
+      </w:pPr>
+      <w:r>
+        <w:drawing>
+          <wp:inline xmlns:a="http://schemas.openxmlformats.org/drawingml/2006/main" xmlns:pic="http://schemas.openxmlformats.org/drawingml/2006/picture">
+            <wp:extent cx="6309360" cy="2313432"/>
+            <wp:docPr id="36" name="Picture 36"/>
+            <wp:cNvGraphicFramePr>
+              <a:graphicFrameLocks noChangeAspect="1"/>
+            </wp:cNvGraphicFramePr>
+            <a:graphic>
+              <a:graphicData uri="http://schemas.openxmlformats.org/drawingml/2006/picture">
+                <pic:pic>
+                  <pic:nvPicPr>
+                    <pic:cNvPr id="0" name="image.png"/>
+                    <pic:cNvPicPr/>
+                  </pic:nvPicPr>
+                  <pic:blipFill>
+                    <a:blip r:embed="rId45"/>
+                    <a:stretch>
+                      <a:fillRect/>
+                    </a:stretch>
+                  </pic:blipFill>
+                  <pic:spPr>
+                    <a:xfrm>
+                      <a:off x="0" y="0"/>
                       <a:ext cx="6309360" cy="2313432"/>
                     </a:xfrm>
                     <a:prstGeom prst="rect"/>
@@ -11261,7 +11345,7 @@
         <w:ind w:left="533" w:hanging="360"/>
         <w:numPr>
           <w:ilvl w:val="0"/>
-          <w:numId w:val="9101"/>
+          <w:numId w:val="9201"/>
         </w:numPr>
       </w:pPr>
       <w:r>
@@ -11279,7 +11363,7 @@
         <w:ind w:left="533" w:hanging="360"/>
         <w:numPr>
           <w:ilvl w:val="0"/>
-          <w:numId w:val="9101"/>
+          <w:numId w:val="9201"/>
         </w:numPr>
       </w:pPr>
       <w:r>
@@ -11683,7 +11767,7 @@
         <w:ind w:left="533" w:hanging="360"/>
         <w:numPr>
           <w:ilvl w:val="0"/>
-          <w:numId w:val="9101"/>
+          <w:numId w:val="9201"/>
         </w:numPr>
       </w:pPr>
       <w:r>
@@ -11756,46 +11840,6 @@
         <w:drawing>
           <wp:inline xmlns:a="http://schemas.openxmlformats.org/drawingml/2006/main" xmlns:pic="http://schemas.openxmlformats.org/drawingml/2006/picture">
             <wp:extent cx="6309360" cy="2474259"/>
-            <wp:docPr id="36" name="Picture 36"/>
-            <wp:cNvGraphicFramePr>
-              <a:graphicFrameLocks noChangeAspect="1"/>
-            </wp:cNvGraphicFramePr>
-            <a:graphic>
-              <a:graphicData uri="http://schemas.openxmlformats.org/drawingml/2006/picture">
-                <pic:pic>
-                  <pic:nvPicPr>
-                    <pic:cNvPr id="0" name="image.png"/>
-                    <pic:cNvPicPr/>
-                  </pic:nvPicPr>
-                  <pic:blipFill>
-                    <a:blip r:embed="rId45"/>
-                    <a:stretch>
-                      <a:fillRect/>
-                    </a:stretch>
-                  </pic:blipFill>
-                  <pic:spPr>
-                    <a:xfrm>
-                      <a:off x="0" y="0"/>
-                      <a:ext cx="6309360" cy="2474259"/>
-                    </a:xfrm>
-                    <a:prstGeom prst="rect"/>
-                  </pic:spPr>
-                </pic:pic>
-              </a:graphicData>
-            </a:graphic>
-          </wp:inline>
-        </w:drawing>
-      </w:r>
-    </w:p>
-    <w:p>
-      <w:pPr>
-        <w:spacing w:before="0" w:after="60" w:line="240" w:lineRule="auto"/>
-        <w:jc w:val="center"/>
-      </w:pPr>
-      <w:r>
-        <w:drawing>
-          <wp:inline xmlns:a="http://schemas.openxmlformats.org/drawingml/2006/main" xmlns:pic="http://schemas.openxmlformats.org/drawingml/2006/picture">
-            <wp:extent cx="6309360" cy="1830952"/>
             <wp:docPr id="37" name="Picture 37"/>
             <wp:cNvGraphicFramePr>
               <a:graphicFrameLocks noChangeAspect="1"/>
@@ -11816,6 +11860,46 @@
                   <pic:spPr>
                     <a:xfrm>
                       <a:off x="0" y="0"/>
+                      <a:ext cx="6309360" cy="2474259"/>
+                    </a:xfrm>
+                    <a:prstGeom prst="rect"/>
+                  </pic:spPr>
+                </pic:pic>
+              </a:graphicData>
+            </a:graphic>
+          </wp:inline>
+        </w:drawing>
+      </w:r>
+    </w:p>
+    <w:p>
+      <w:pPr>
+        <w:spacing w:before="0" w:after="60" w:line="240" w:lineRule="auto"/>
+        <w:jc w:val="center"/>
+      </w:pPr>
+      <w:r>
+        <w:drawing>
+          <wp:inline xmlns:a="http://schemas.openxmlformats.org/drawingml/2006/main" xmlns:pic="http://schemas.openxmlformats.org/drawingml/2006/picture">
+            <wp:extent cx="6309360" cy="1830952"/>
+            <wp:docPr id="38" name="Picture 38"/>
+            <wp:cNvGraphicFramePr>
+              <a:graphicFrameLocks noChangeAspect="1"/>
+            </wp:cNvGraphicFramePr>
+            <a:graphic>
+              <a:graphicData uri="http://schemas.openxmlformats.org/drawingml/2006/picture">
+                <pic:pic>
+                  <pic:nvPicPr>
+                    <pic:cNvPr id="0" name="image.png"/>
+                    <pic:cNvPicPr/>
+                  </pic:nvPicPr>
+                  <pic:blipFill>
+                    <a:blip r:embed="rId47"/>
+                    <a:stretch>
+                      <a:fillRect/>
+                    </a:stretch>
+                  </pic:blipFill>
+                  <pic:spPr>
+                    <a:xfrm>
+                      <a:off x="0" y="0"/>
                       <a:ext cx="6309360" cy="1830952"/>
                     </a:xfrm>
                     <a:prstGeom prst="rect"/>
@@ -11859,7 +11943,7 @@
         <w:ind w:left="533" w:hanging="360"/>
         <w:numPr>
           <w:ilvl w:val="0"/>
-          <w:numId w:val="9101"/>
+          <w:numId w:val="9201"/>
         </w:numPr>
       </w:pPr>
       <w:r>
@@ -11877,7 +11961,7 @@
         <w:ind w:left="533" w:hanging="360"/>
         <w:numPr>
           <w:ilvl w:val="0"/>
-          <w:numId w:val="9101"/>
+          <w:numId w:val="9201"/>
         </w:numPr>
       </w:pPr>
       <w:r>
@@ -12281,7 +12365,7 @@
         <w:ind w:left="533" w:hanging="360"/>
         <w:numPr>
           <w:ilvl w:val="0"/>
-          <w:numId w:val="9101"/>
+          <w:numId w:val="9201"/>
         </w:numPr>
       </w:pPr>
       <w:r>
@@ -12354,46 +12438,6 @@
         <w:drawing>
           <wp:inline xmlns:a="http://schemas.openxmlformats.org/drawingml/2006/main" xmlns:pic="http://schemas.openxmlformats.org/drawingml/2006/picture">
             <wp:extent cx="6309360" cy="2474259"/>
-            <wp:docPr id="38" name="Picture 38"/>
-            <wp:cNvGraphicFramePr>
-              <a:graphicFrameLocks noChangeAspect="1"/>
-            </wp:cNvGraphicFramePr>
-            <a:graphic>
-              <a:graphicData uri="http://schemas.openxmlformats.org/drawingml/2006/picture">
-                <pic:pic>
-                  <pic:nvPicPr>
-                    <pic:cNvPr id="0" name="image.png"/>
-                    <pic:cNvPicPr/>
-                  </pic:nvPicPr>
-                  <pic:blipFill>
-                    <a:blip r:embed="rId47"/>
-                    <a:stretch>
-                      <a:fillRect/>
-                    </a:stretch>
-                  </pic:blipFill>
-                  <pic:spPr>
-                    <a:xfrm>
-                      <a:off x="0" y="0"/>
-                      <a:ext cx="6309360" cy="2474259"/>
-                    </a:xfrm>
-                    <a:prstGeom prst="rect"/>
-                  </pic:spPr>
-                </pic:pic>
-              </a:graphicData>
-            </a:graphic>
-          </wp:inline>
-        </w:drawing>
-      </w:r>
-    </w:p>
-    <w:p>
-      <w:pPr>
-        <w:spacing w:before="0" w:after="60" w:line="240" w:lineRule="auto"/>
-        <w:jc w:val="center"/>
-      </w:pPr>
-      <w:r>
-        <w:drawing>
-          <wp:inline xmlns:a="http://schemas.openxmlformats.org/drawingml/2006/main" xmlns:pic="http://schemas.openxmlformats.org/drawingml/2006/picture">
-            <wp:extent cx="6309360" cy="1991778"/>
             <wp:docPr id="39" name="Picture 39"/>
             <wp:cNvGraphicFramePr>
               <a:graphicFrameLocks noChangeAspect="1"/>
@@ -12414,6 +12458,46 @@
                   <pic:spPr>
                     <a:xfrm>
                       <a:off x="0" y="0"/>
+                      <a:ext cx="6309360" cy="2474259"/>
+                    </a:xfrm>
+                    <a:prstGeom prst="rect"/>
+                  </pic:spPr>
+                </pic:pic>
+              </a:graphicData>
+            </a:graphic>
+          </wp:inline>
+        </w:drawing>
+      </w:r>
+    </w:p>
+    <w:p>
+      <w:pPr>
+        <w:spacing w:before="0" w:after="60" w:line="240" w:lineRule="auto"/>
+        <w:jc w:val="center"/>
+      </w:pPr>
+      <w:r>
+        <w:drawing>
+          <wp:inline xmlns:a="http://schemas.openxmlformats.org/drawingml/2006/main" xmlns:pic="http://schemas.openxmlformats.org/drawingml/2006/picture">
+            <wp:extent cx="6309360" cy="1991778"/>
+            <wp:docPr id="40" name="Picture 40"/>
+            <wp:cNvGraphicFramePr>
+              <a:graphicFrameLocks noChangeAspect="1"/>
+            </wp:cNvGraphicFramePr>
+            <a:graphic>
+              <a:graphicData uri="http://schemas.openxmlformats.org/drawingml/2006/picture">
+                <pic:pic>
+                  <pic:nvPicPr>
+                    <pic:cNvPr id="0" name="image.png"/>
+                    <pic:cNvPicPr/>
+                  </pic:nvPicPr>
+                  <pic:blipFill>
+                    <a:blip r:embed="rId49"/>
+                    <a:stretch>
+                      <a:fillRect/>
+                    </a:stretch>
+                  </pic:blipFill>
+                  <pic:spPr>
+                    <a:xfrm>
+                      <a:off x="0" y="0"/>
                       <a:ext cx="6309360" cy="1991778"/>
                     </a:xfrm>
                     <a:prstGeom prst="rect"/>
@@ -12457,7 +12541,7 @@
         <w:ind w:left="533" w:hanging="360"/>
         <w:numPr>
           <w:ilvl w:val="0"/>
-          <w:numId w:val="9101"/>
+          <w:numId w:val="9201"/>
         </w:numPr>
       </w:pPr>
       <w:r>
@@ -12475,7 +12559,7 @@
         <w:ind w:left="533" w:hanging="360"/>
         <w:numPr>
           <w:ilvl w:val="0"/>
-          <w:numId w:val="9101"/>
+          <w:numId w:val="9201"/>
         </w:numPr>
       </w:pPr>
       <w:r>
@@ -12589,7 +12673,7 @@
         <w:ind w:left="533" w:hanging="360"/>
         <w:numPr>
           <w:ilvl w:val="0"/>
-          <w:numId w:val="9101"/>
+          <w:numId w:val="9201"/>
         </w:numPr>
       </w:pPr>
       <w:r>
@@ -12662,46 +12746,6 @@
         <w:drawing>
           <wp:inline xmlns:a="http://schemas.openxmlformats.org/drawingml/2006/main" xmlns:pic="http://schemas.openxmlformats.org/drawingml/2006/picture">
             <wp:extent cx="6309360" cy="2474259"/>
-            <wp:docPr id="40" name="Picture 40"/>
-            <wp:cNvGraphicFramePr>
-              <a:graphicFrameLocks noChangeAspect="1"/>
-            </wp:cNvGraphicFramePr>
-            <a:graphic>
-              <a:graphicData uri="http://schemas.openxmlformats.org/drawingml/2006/picture">
-                <pic:pic>
-                  <pic:nvPicPr>
-                    <pic:cNvPr id="0" name="image.png"/>
-                    <pic:cNvPicPr/>
-                  </pic:nvPicPr>
-                  <pic:blipFill>
-                    <a:blip r:embed="rId49"/>
-                    <a:stretch>
-                      <a:fillRect/>
-                    </a:stretch>
-                  </pic:blipFill>
-                  <pic:spPr>
-                    <a:xfrm>
-                      <a:off x="0" y="0"/>
-                      <a:ext cx="6309360" cy="2474259"/>
-                    </a:xfrm>
-                    <a:prstGeom prst="rect"/>
-                  </pic:spPr>
-                </pic:pic>
-              </a:graphicData>
-            </a:graphic>
-          </wp:inline>
-        </w:drawing>
-      </w:r>
-    </w:p>
-    <w:p>
-      <w:pPr>
-        <w:spacing w:before="0" w:after="60" w:line="240" w:lineRule="auto"/>
-        <w:jc w:val="center"/>
-      </w:pPr>
-      <w:r>
-        <w:drawing>
-          <wp:inline xmlns:a="http://schemas.openxmlformats.org/drawingml/2006/main" xmlns:pic="http://schemas.openxmlformats.org/drawingml/2006/picture">
-            <wp:extent cx="6309360" cy="2313432"/>
             <wp:docPr id="41" name="Picture 41"/>
             <wp:cNvGraphicFramePr>
               <a:graphicFrameLocks noChangeAspect="1"/>
@@ -12722,6 +12766,46 @@
                   <pic:spPr>
                     <a:xfrm>
                       <a:off x="0" y="0"/>
+                      <a:ext cx="6309360" cy="2474259"/>
+                    </a:xfrm>
+                    <a:prstGeom prst="rect"/>
+                  </pic:spPr>
+                </pic:pic>
+              </a:graphicData>
+            </a:graphic>
+          </wp:inline>
+        </w:drawing>
+      </w:r>
+    </w:p>
+    <w:p>
+      <w:pPr>
+        <w:spacing w:before="0" w:after="60" w:line="240" w:lineRule="auto"/>
+        <w:jc w:val="center"/>
+      </w:pPr>
+      <w:r>
+        <w:drawing>
+          <wp:inline xmlns:a="http://schemas.openxmlformats.org/drawingml/2006/main" xmlns:pic="http://schemas.openxmlformats.org/drawingml/2006/picture">
+            <wp:extent cx="6309360" cy="2313432"/>
+            <wp:docPr id="42" name="Picture 42"/>
+            <wp:cNvGraphicFramePr>
+              <a:graphicFrameLocks noChangeAspect="1"/>
+            </wp:cNvGraphicFramePr>
+            <a:graphic>
+              <a:graphicData uri="http://schemas.openxmlformats.org/drawingml/2006/picture">
+                <pic:pic>
+                  <pic:nvPicPr>
+                    <pic:cNvPr id="0" name="image.png"/>
+                    <pic:cNvPicPr/>
+                  </pic:nvPicPr>
+                  <pic:blipFill>
+                    <a:blip r:embed="rId51"/>
+                    <a:stretch>
+                      <a:fillRect/>
+                    </a:stretch>
+                  </pic:blipFill>
+                  <pic:spPr>
+                    <a:xfrm>
+                      <a:off x="0" y="0"/>
                       <a:ext cx="6309360" cy="2313432"/>
                     </a:xfrm>
                     <a:prstGeom prst="rect"/>
@@ -12765,7 +12849,7 @@
         <w:ind w:left="533" w:hanging="360"/>
         <w:numPr>
           <w:ilvl w:val="0"/>
-          <w:numId w:val="9101"/>
+          <w:numId w:val="9201"/>
         </w:numPr>
       </w:pPr>
       <w:r>
@@ -12783,7 +12867,7 @@
         <w:ind w:left="533" w:hanging="360"/>
         <w:numPr>
           <w:ilvl w:val="0"/>
-          <w:numId w:val="9101"/>
+          <w:numId w:val="9201"/>
         </w:numPr>
       </w:pPr>
       <w:r>
@@ -13104,7 +13188,7 @@
         <w:ind w:left="533" w:hanging="360"/>
         <w:numPr>
           <w:ilvl w:val="0"/>
-          <w:numId w:val="9101"/>
+          <w:numId w:val="9201"/>
         </w:numPr>
       </w:pPr>
       <w:r>
@@ -13166,46 +13250,6 @@
           <w:sz w:val="24"/>
         </w:rPr>
         <w:t>$26.38</w:t>
-      </w:r>
-    </w:p>
-    <w:p>
-      <w:pPr>
-        <w:spacing w:before="0" w:after="60" w:line="240" w:lineRule="auto"/>
-        <w:jc w:val="center"/>
-      </w:pPr>
-      <w:r>
-        <w:drawing>
-          <wp:inline xmlns:a="http://schemas.openxmlformats.org/drawingml/2006/main" xmlns:pic="http://schemas.openxmlformats.org/drawingml/2006/picture">
-            <wp:extent cx="6309360" cy="2474259"/>
-            <wp:docPr id="42" name="Picture 42"/>
-            <wp:cNvGraphicFramePr>
-              <a:graphicFrameLocks noChangeAspect="1"/>
-            </wp:cNvGraphicFramePr>
-            <a:graphic>
-              <a:graphicData uri="http://schemas.openxmlformats.org/drawingml/2006/picture">
-                <pic:pic>
-                  <pic:nvPicPr>
-                    <pic:cNvPr id="0" name="image.png"/>
-                    <pic:cNvPicPr/>
-                  </pic:nvPicPr>
-                  <pic:blipFill>
-                    <a:blip r:embed="rId51"/>
-                    <a:stretch>
-                      <a:fillRect/>
-                    </a:stretch>
-                  </pic:blipFill>
-                  <pic:spPr>
-                    <a:xfrm>
-                      <a:off x="0" y="0"/>
-                      <a:ext cx="6309360" cy="2474259"/>
-                    </a:xfrm>
-                    <a:prstGeom prst="rect"/>
-                  </pic:spPr>
-                </pic:pic>
-              </a:graphicData>
-            </a:graphic>
-          </wp:inline>
-        </w:drawing>
       </w:r>
     </w:p>
     <w:p>
@@ -13250,6 +13294,46 @@
     </w:p>
     <w:p>
       <w:pPr>
+        <w:spacing w:before="0" w:after="60" w:line="240" w:lineRule="auto"/>
+        <w:jc w:val="center"/>
+      </w:pPr>
+      <w:r>
+        <w:drawing>
+          <wp:inline xmlns:a="http://schemas.openxmlformats.org/drawingml/2006/main" xmlns:pic="http://schemas.openxmlformats.org/drawingml/2006/picture">
+            <wp:extent cx="6309360" cy="2474259"/>
+            <wp:docPr id="44" name="Picture 44"/>
+            <wp:cNvGraphicFramePr>
+              <a:graphicFrameLocks noChangeAspect="1"/>
+            </wp:cNvGraphicFramePr>
+            <a:graphic>
+              <a:graphicData uri="http://schemas.openxmlformats.org/drawingml/2006/picture">
+                <pic:pic>
+                  <pic:nvPicPr>
+                    <pic:cNvPr id="0" name="image.png"/>
+                    <pic:cNvPicPr/>
+                  </pic:nvPicPr>
+                  <pic:blipFill>
+                    <a:blip r:embed="rId53"/>
+                    <a:stretch>
+                      <a:fillRect/>
+                    </a:stretch>
+                  </pic:blipFill>
+                  <pic:spPr>
+                    <a:xfrm>
+                      <a:off x="0" y="0"/>
+                      <a:ext cx="6309360" cy="2474259"/>
+                    </a:xfrm>
+                    <a:prstGeom prst="rect"/>
+                  </pic:spPr>
+                </pic:pic>
+              </a:graphicData>
+            </a:graphic>
+          </wp:inline>
+        </w:drawing>
+      </w:r>
+    </w:p>
+    <w:p>
+      <w:pPr>
         <w:spacing w:before="0" w:after="40" w:line="240" w:lineRule="auto"/>
         <w:ind w:left="1354" w:hanging="360"/>
         <w:numPr>
@@ -13280,7 +13364,7 @@
         <w:ind w:left="533" w:hanging="360"/>
         <w:numPr>
           <w:ilvl w:val="0"/>
-          <w:numId w:val="9101"/>
+          <w:numId w:val="9201"/>
         </w:numPr>
       </w:pPr>
       <w:r>
@@ -13298,7 +13382,7 @@
         <w:ind w:left="533" w:hanging="360"/>
         <w:numPr>
           <w:ilvl w:val="0"/>
-          <w:numId w:val="9101"/>
+          <w:numId w:val="9201"/>
         </w:numPr>
       </w:pPr>
       <w:r>
@@ -13749,6 +13833,45 @@
       </w:rPr>
     </w:lvl>
   </w:abstractNum>
+  <w:abstractNum w:abstractNumId="9200">
+    <w:multiLevelType w:val="hybridMultilevel"/>
+    <w:lvl w:ilvl="0">
+      <w:start w:val="1"/>
+      <w:numFmt w:val="bullet"/>
+      <w:lvlText w:val="⮚"/>
+      <w:lvlJc w:val="left"/>
+      <w:pPr>
+        <w:ind w:left="720" w:hanging="360"/>
+      </w:pPr>
+      <w:rPr>
+        <w:rFonts w:ascii="Noto Sans Symbols" w:hAnsi="Noto Sans Symbols" w:cs="Noto Sans Symbols" w:hint="default"/>
+      </w:rPr>
+    </w:lvl>
+    <w:lvl w:ilvl="1">
+      <w:start w:val="1"/>
+      <w:numFmt w:val="bullet"/>
+      <w:lvlText w:val="●"/>
+      <w:lvlJc w:val="left"/>
+      <w:pPr>
+        <w:ind w:left="1440" w:hanging="360"/>
+      </w:pPr>
+      <w:rPr>
+        <w:rFonts w:ascii="Arial" w:hAnsi="Arial" w:hint="default"/>
+      </w:rPr>
+    </w:lvl>
+    <w:lvl w:ilvl="2">
+      <w:start w:val="1"/>
+      <w:numFmt w:val="bullet"/>
+      <w:lvlText w:val="●"/>
+      <w:lvlJc w:val="left"/>
+      <w:pPr>
+        <w:ind w:left="2160" w:hanging="360"/>
+      </w:pPr>
+      <w:rPr>
+        <w:rFonts w:ascii="Arial" w:hAnsi="Arial" w:hint="default"/>
+      </w:rPr>
+    </w:lvl>
+  </w:abstractNum>
   <w:abstractNum w:abstractNumId="0">
     <w:nsid w:val="FFFFFF7C"/>
     <w:multiLevelType w:val="singleLevel"/>
@@ -13946,6 +14069,9 @@
   </w:num>
   <w:num w:numId="9">
     <w:abstractNumId w:val="0"/>
+  </w:num>
+  <w:num w:numId="9201">
+    <w:abstractNumId w:val="9200"/>
   </w:num>
   <w:num w:numId="9101">
     <w:abstractNumId w:val="9100"/>

</xml_diff>

<commit_message>
Remove inline AWS cluster image above summary heading (not in client reference)
The reference has only the heading there, not a repeated cluster image.
Regenerate ajreport_20261004.docx/.pdf.
</commit_message>
<xml_diff>
--- a/ajreport_20261004.docx
+++ b/ajreport_20261004.docx
@@ -221,46 +221,6 @@
         <w:t>Aptech Limited Weekly Status Report</w:t>
         <w:br/>
         <w:t>(28 September to 04 October 2026)</w:t>
-      </w:r>
-    </w:p>
-    <w:p>
-      <w:pPr>
-        <w:spacing w:before="0" w:after="120" w:line="240" w:lineRule="auto"/>
-        <w:jc w:val="center"/>
-      </w:pPr>
-      <w:r>
-        <w:drawing>
-          <wp:inline xmlns:a="http://schemas.openxmlformats.org/drawingml/2006/main" xmlns:pic="http://schemas.openxmlformats.org/drawingml/2006/picture">
-            <wp:extent cx="768096" cy="745236"/>
-            <wp:docPr id="4" name="Picture 4"/>
-            <wp:cNvGraphicFramePr>
-              <a:graphicFrameLocks noChangeAspect="1"/>
-            </wp:cNvGraphicFramePr>
-            <a:graphic>
-              <a:graphicData uri="http://schemas.openxmlformats.org/drawingml/2006/picture">
-                <pic:pic>
-                  <pic:nvPicPr>
-                    <pic:cNvPr id="0" name="aws_partner_cluster.png"/>
-                    <pic:cNvPicPr/>
-                  </pic:nvPicPr>
-                  <pic:blipFill>
-                    <a:blip r:embed="rId13"/>
-                    <a:stretch>
-                      <a:fillRect/>
-                    </a:stretch>
-                  </pic:blipFill>
-                  <pic:spPr>
-                    <a:xfrm>
-                      <a:off x="0" y="0"/>
-                      <a:ext cx="768096" cy="745236"/>
-                    </a:xfrm>
-                    <a:prstGeom prst="rect"/>
-                  </pic:spPr>
-                </pic:pic>
-              </a:graphicData>
-            </a:graphic>
-          </wp:inline>
-        </w:drawing>
       </w:r>
     </w:p>
     <w:p>
@@ -4008,7 +3968,7 @@
         <w:drawing>
           <wp:inline xmlns:a="http://schemas.openxmlformats.org/drawingml/2006/main" xmlns:pic="http://schemas.openxmlformats.org/drawingml/2006/picture">
             <wp:extent cx="6309360" cy="2474259"/>
-            <wp:docPr id="5" name="Picture 5"/>
+            <wp:docPr id="4" name="Picture 4"/>
             <wp:cNvGraphicFramePr>
               <a:graphicFrameLocks noChangeAspect="1"/>
             </wp:cNvGraphicFramePr>
@@ -4020,7 +3980,7 @@
                     <pic:cNvPicPr/>
                   </pic:nvPicPr>
                   <pic:blipFill>
-                    <a:blip r:embed="rId14"/>
+                    <a:blip r:embed="rId13"/>
                     <a:stretch>
                       <a:fillRect/>
                     </a:stretch>
@@ -4048,7 +4008,7 @@
         <w:drawing>
           <wp:inline xmlns:a="http://schemas.openxmlformats.org/drawingml/2006/main" xmlns:pic="http://schemas.openxmlformats.org/drawingml/2006/picture">
             <wp:extent cx="6309360" cy="2152605"/>
-            <wp:docPr id="6" name="Picture 6"/>
+            <wp:docPr id="5" name="Picture 5"/>
             <wp:cNvGraphicFramePr>
               <a:graphicFrameLocks noChangeAspect="1"/>
             </wp:cNvGraphicFramePr>
@@ -4060,7 +4020,7 @@
                     <pic:cNvPicPr/>
                   </pic:nvPicPr>
                   <pic:blipFill>
-                    <a:blip r:embed="rId15"/>
+                    <a:blip r:embed="rId14"/>
                     <a:stretch>
                       <a:fillRect/>
                     </a:stretch>
@@ -4580,7 +4540,7 @@
         <w:drawing>
           <wp:inline xmlns:a="http://schemas.openxmlformats.org/drawingml/2006/main" xmlns:pic="http://schemas.openxmlformats.org/drawingml/2006/picture">
             <wp:extent cx="6309360" cy="2474259"/>
-            <wp:docPr id="7" name="Picture 7"/>
+            <wp:docPr id="6" name="Picture 6"/>
             <wp:cNvGraphicFramePr>
               <a:graphicFrameLocks noChangeAspect="1"/>
             </wp:cNvGraphicFramePr>
@@ -4592,7 +4552,7 @@
                     <pic:cNvPicPr/>
                   </pic:nvPicPr>
                   <pic:blipFill>
-                    <a:blip r:embed="rId16"/>
+                    <a:blip r:embed="rId15"/>
                     <a:stretch>
                       <a:fillRect/>
                     </a:stretch>
@@ -4620,7 +4580,7 @@
         <w:drawing>
           <wp:inline xmlns:a="http://schemas.openxmlformats.org/drawingml/2006/main" xmlns:pic="http://schemas.openxmlformats.org/drawingml/2006/picture">
             <wp:extent cx="6309360" cy="2313432"/>
-            <wp:docPr id="8" name="Picture 8"/>
+            <wp:docPr id="7" name="Picture 7"/>
             <wp:cNvGraphicFramePr>
               <a:graphicFrameLocks noChangeAspect="1"/>
             </wp:cNvGraphicFramePr>
@@ -4632,7 +4592,7 @@
                     <pic:cNvPicPr/>
                   </pic:nvPicPr>
                   <pic:blipFill>
-                    <a:blip r:embed="rId17"/>
+                    <a:blip r:embed="rId16"/>
                     <a:stretch>
                       <a:fillRect/>
                     </a:stretch>
@@ -5261,7 +5221,7 @@
         <w:drawing>
           <wp:inline xmlns:a="http://schemas.openxmlformats.org/drawingml/2006/main" xmlns:pic="http://schemas.openxmlformats.org/drawingml/2006/picture">
             <wp:extent cx="6309360" cy="2474259"/>
-            <wp:docPr id="9" name="Picture 9"/>
+            <wp:docPr id="8" name="Picture 8"/>
             <wp:cNvGraphicFramePr>
               <a:graphicFrameLocks noChangeAspect="1"/>
             </wp:cNvGraphicFramePr>
@@ -5273,7 +5233,7 @@
                     <pic:cNvPicPr/>
                   </pic:nvPicPr>
                   <pic:blipFill>
-                    <a:blip r:embed="rId18"/>
+                    <a:blip r:embed="rId17"/>
                     <a:stretch>
                       <a:fillRect/>
                     </a:stretch>
@@ -5301,7 +5261,7 @@
         <w:drawing>
           <wp:inline xmlns:a="http://schemas.openxmlformats.org/drawingml/2006/main" xmlns:pic="http://schemas.openxmlformats.org/drawingml/2006/picture">
             <wp:extent cx="6309360" cy="2313432"/>
-            <wp:docPr id="10" name="Picture 10"/>
+            <wp:docPr id="9" name="Picture 9"/>
             <wp:cNvGraphicFramePr>
               <a:graphicFrameLocks noChangeAspect="1"/>
             </wp:cNvGraphicFramePr>
@@ -5313,7 +5273,7 @@
                     <pic:cNvPicPr/>
                   </pic:nvPicPr>
                   <pic:blipFill>
-                    <a:blip r:embed="rId19"/>
+                    <a:blip r:embed="rId18"/>
                     <a:stretch>
                       <a:fillRect/>
                     </a:stretch>
@@ -5543,7 +5503,7 @@
         <w:drawing>
           <wp:inline xmlns:a="http://schemas.openxmlformats.org/drawingml/2006/main" xmlns:pic="http://schemas.openxmlformats.org/drawingml/2006/picture">
             <wp:extent cx="6309360" cy="2474259"/>
-            <wp:docPr id="11" name="Picture 11"/>
+            <wp:docPr id="10" name="Picture 10"/>
             <wp:cNvGraphicFramePr>
               <a:graphicFrameLocks noChangeAspect="1"/>
             </wp:cNvGraphicFramePr>
@@ -5555,7 +5515,7 @@
                     <pic:cNvPicPr/>
                   </pic:nvPicPr>
                   <pic:blipFill>
-                    <a:blip r:embed="rId20"/>
+                    <a:blip r:embed="rId19"/>
                     <a:stretch>
                       <a:fillRect/>
                     </a:stretch>
@@ -5583,7 +5543,7 @@
         <w:drawing>
           <wp:inline xmlns:a="http://schemas.openxmlformats.org/drawingml/2006/main" xmlns:pic="http://schemas.openxmlformats.org/drawingml/2006/picture">
             <wp:extent cx="6309360" cy="2795912"/>
-            <wp:docPr id="12" name="Picture 12"/>
+            <wp:docPr id="11" name="Picture 11"/>
             <wp:cNvGraphicFramePr>
               <a:graphicFrameLocks noChangeAspect="1"/>
             </wp:cNvGraphicFramePr>
@@ -5595,7 +5555,7 @@
                     <pic:cNvPicPr/>
                   </pic:nvPicPr>
                   <pic:blipFill>
-                    <a:blip r:embed="rId21"/>
+                    <a:blip r:embed="rId20"/>
                     <a:stretch>
                       <a:fillRect/>
                     </a:stretch>
@@ -6115,7 +6075,7 @@
         <w:drawing>
           <wp:inline xmlns:a="http://schemas.openxmlformats.org/drawingml/2006/main" xmlns:pic="http://schemas.openxmlformats.org/drawingml/2006/picture">
             <wp:extent cx="5986210" cy="2347533"/>
-            <wp:docPr id="13" name="Picture 13"/>
+            <wp:docPr id="12" name="Picture 12"/>
             <wp:cNvGraphicFramePr>
               <a:graphicFrameLocks noChangeAspect="1"/>
             </wp:cNvGraphicFramePr>
@@ -6127,7 +6087,7 @@
                     <pic:cNvPicPr/>
                   </pic:nvPicPr>
                   <pic:blipFill>
-                    <a:blip r:embed="rId22"/>
+                    <a:blip r:embed="rId21"/>
                     <a:stretch>
                       <a:fillRect/>
                     </a:stretch>
@@ -6155,7 +6115,7 @@
         <w:drawing>
           <wp:inline xmlns:a="http://schemas.openxmlformats.org/drawingml/2006/main" xmlns:pic="http://schemas.openxmlformats.org/drawingml/2006/picture">
             <wp:extent cx="5986210" cy="3110482"/>
-            <wp:docPr id="14" name="Picture 14"/>
+            <wp:docPr id="13" name="Picture 13"/>
             <wp:cNvGraphicFramePr>
               <a:graphicFrameLocks noChangeAspect="1"/>
             </wp:cNvGraphicFramePr>
@@ -6167,7 +6127,7 @@
                     <pic:cNvPicPr/>
                   </pic:nvPicPr>
                   <pic:blipFill>
-                    <a:blip r:embed="rId23"/>
+                    <a:blip r:embed="rId22"/>
                     <a:stretch>
                       <a:fillRect/>
                     </a:stretch>
@@ -6630,7 +6590,7 @@
         <w:drawing>
           <wp:inline xmlns:a="http://schemas.openxmlformats.org/drawingml/2006/main" xmlns:pic="http://schemas.openxmlformats.org/drawingml/2006/picture">
             <wp:extent cx="6309360" cy="2474259"/>
-            <wp:docPr id="15" name="Picture 15"/>
+            <wp:docPr id="14" name="Picture 14"/>
             <wp:cNvGraphicFramePr>
               <a:graphicFrameLocks noChangeAspect="1"/>
             </wp:cNvGraphicFramePr>
@@ -6642,7 +6602,7 @@
                     <pic:cNvPicPr/>
                   </pic:nvPicPr>
                   <pic:blipFill>
-                    <a:blip r:embed="rId24"/>
+                    <a:blip r:embed="rId23"/>
                     <a:stretch>
                       <a:fillRect/>
                     </a:stretch>
@@ -6670,7 +6630,7 @@
         <w:drawing>
           <wp:inline xmlns:a="http://schemas.openxmlformats.org/drawingml/2006/main" xmlns:pic="http://schemas.openxmlformats.org/drawingml/2006/picture">
             <wp:extent cx="6309360" cy="2152605"/>
-            <wp:docPr id="16" name="Picture 16"/>
+            <wp:docPr id="15" name="Picture 15"/>
             <wp:cNvGraphicFramePr>
               <a:graphicFrameLocks noChangeAspect="1"/>
             </wp:cNvGraphicFramePr>
@@ -6682,7 +6642,7 @@
                     <pic:cNvPicPr/>
                   </pic:nvPicPr>
                   <pic:blipFill>
-                    <a:blip r:embed="rId25"/>
+                    <a:blip r:embed="rId24"/>
                     <a:stretch>
                       <a:fillRect/>
                     </a:stretch>
@@ -6912,7 +6872,7 @@
         <w:drawing>
           <wp:inline xmlns:a="http://schemas.openxmlformats.org/drawingml/2006/main" xmlns:pic="http://schemas.openxmlformats.org/drawingml/2006/picture">
             <wp:extent cx="6309360" cy="2474259"/>
-            <wp:docPr id="17" name="Picture 17"/>
+            <wp:docPr id="16" name="Picture 16"/>
             <wp:cNvGraphicFramePr>
               <a:graphicFrameLocks noChangeAspect="1"/>
             </wp:cNvGraphicFramePr>
@@ -6924,7 +6884,7 @@
                     <pic:cNvPicPr/>
                   </pic:nvPicPr>
                   <pic:blipFill>
-                    <a:blip r:embed="rId26"/>
+                    <a:blip r:embed="rId25"/>
                     <a:stretch>
                       <a:fillRect/>
                     </a:stretch>
@@ -6952,7 +6912,7 @@
         <w:drawing>
           <wp:inline xmlns:a="http://schemas.openxmlformats.org/drawingml/2006/main" xmlns:pic="http://schemas.openxmlformats.org/drawingml/2006/picture">
             <wp:extent cx="6309360" cy="2152605"/>
-            <wp:docPr id="18" name="Picture 18"/>
+            <wp:docPr id="17" name="Picture 17"/>
             <wp:cNvGraphicFramePr>
               <a:graphicFrameLocks noChangeAspect="1"/>
             </wp:cNvGraphicFramePr>
@@ -6964,7 +6924,7 @@
                     <pic:cNvPicPr/>
                   </pic:nvPicPr>
                   <pic:blipFill>
-                    <a:blip r:embed="rId27"/>
+                    <a:blip r:embed="rId26"/>
                     <a:stretch>
                       <a:fillRect/>
                     </a:stretch>
@@ -7510,7 +7470,7 @@
         <w:drawing>
           <wp:inline xmlns:a="http://schemas.openxmlformats.org/drawingml/2006/main" xmlns:pic="http://schemas.openxmlformats.org/drawingml/2006/picture">
             <wp:extent cx="6309360" cy="2474259"/>
-            <wp:docPr id="19" name="Picture 19"/>
+            <wp:docPr id="18" name="Picture 18"/>
             <wp:cNvGraphicFramePr>
               <a:graphicFrameLocks noChangeAspect="1"/>
             </wp:cNvGraphicFramePr>
@@ -7522,7 +7482,7 @@
                     <pic:cNvPicPr/>
                   </pic:nvPicPr>
                   <pic:blipFill>
-                    <a:blip r:embed="rId28"/>
+                    <a:blip r:embed="rId27"/>
                     <a:stretch>
                       <a:fillRect/>
                     </a:stretch>
@@ -7550,7 +7510,7 @@
         <w:drawing>
           <wp:inline xmlns:a="http://schemas.openxmlformats.org/drawingml/2006/main" xmlns:pic="http://schemas.openxmlformats.org/drawingml/2006/picture">
             <wp:extent cx="6309360" cy="1670125"/>
-            <wp:docPr id="20" name="Picture 20"/>
+            <wp:docPr id="19" name="Picture 19"/>
             <wp:cNvGraphicFramePr>
               <a:graphicFrameLocks noChangeAspect="1"/>
             </wp:cNvGraphicFramePr>
@@ -7562,7 +7522,7 @@
                     <pic:cNvPicPr/>
                   </pic:nvPicPr>
                   <pic:blipFill>
-                    <a:blip r:embed="rId29"/>
+                    <a:blip r:embed="rId28"/>
                     <a:stretch>
                       <a:fillRect/>
                     </a:stretch>
@@ -8165,7 +8125,7 @@
         <w:drawing>
           <wp:inline xmlns:a="http://schemas.openxmlformats.org/drawingml/2006/main" xmlns:pic="http://schemas.openxmlformats.org/drawingml/2006/picture">
             <wp:extent cx="6309360" cy="2474259"/>
-            <wp:docPr id="21" name="Picture 21"/>
+            <wp:docPr id="20" name="Picture 20"/>
             <wp:cNvGraphicFramePr>
               <a:graphicFrameLocks noChangeAspect="1"/>
             </wp:cNvGraphicFramePr>
@@ -8177,7 +8137,7 @@
                     <pic:cNvPicPr/>
                   </pic:nvPicPr>
                   <pic:blipFill>
-                    <a:blip r:embed="rId30"/>
+                    <a:blip r:embed="rId29"/>
                     <a:stretch>
                       <a:fillRect/>
                     </a:stretch>
@@ -8205,7 +8165,7 @@
         <w:drawing>
           <wp:inline xmlns:a="http://schemas.openxmlformats.org/drawingml/2006/main" xmlns:pic="http://schemas.openxmlformats.org/drawingml/2006/picture">
             <wp:extent cx="6309360" cy="1991778"/>
-            <wp:docPr id="22" name="Picture 22"/>
+            <wp:docPr id="21" name="Picture 21"/>
             <wp:cNvGraphicFramePr>
               <a:graphicFrameLocks noChangeAspect="1"/>
             </wp:cNvGraphicFramePr>
@@ -8217,7 +8177,7 @@
                     <pic:cNvPicPr/>
                   </pic:nvPicPr>
                   <pic:blipFill>
-                    <a:blip r:embed="rId31"/>
+                    <a:blip r:embed="rId30"/>
                     <a:stretch>
                       <a:fillRect/>
                     </a:stretch>
@@ -8473,7 +8433,7 @@
         <w:drawing>
           <wp:inline xmlns:a="http://schemas.openxmlformats.org/drawingml/2006/main" xmlns:pic="http://schemas.openxmlformats.org/drawingml/2006/picture">
             <wp:extent cx="6309360" cy="2474259"/>
-            <wp:docPr id="23" name="Picture 23"/>
+            <wp:docPr id="22" name="Picture 22"/>
             <wp:cNvGraphicFramePr>
               <a:graphicFrameLocks noChangeAspect="1"/>
             </wp:cNvGraphicFramePr>
@@ -8485,7 +8445,7 @@
                     <pic:cNvPicPr/>
                   </pic:nvPicPr>
                   <pic:blipFill>
-                    <a:blip r:embed="rId32"/>
+                    <a:blip r:embed="rId31"/>
                     <a:stretch>
                       <a:fillRect/>
                     </a:stretch>
@@ -8513,7 +8473,7 @@
         <w:drawing>
           <wp:inline xmlns:a="http://schemas.openxmlformats.org/drawingml/2006/main" xmlns:pic="http://schemas.openxmlformats.org/drawingml/2006/picture">
             <wp:extent cx="6309360" cy="1670125"/>
-            <wp:docPr id="24" name="Picture 24"/>
+            <wp:docPr id="23" name="Picture 23"/>
             <wp:cNvGraphicFramePr>
               <a:graphicFrameLocks noChangeAspect="1"/>
             </wp:cNvGraphicFramePr>
@@ -8525,7 +8485,7 @@
                     <pic:cNvPicPr/>
                   </pic:nvPicPr>
                   <pic:blipFill>
-                    <a:blip r:embed="rId33"/>
+                    <a:blip r:embed="rId32"/>
                     <a:stretch>
                       <a:fillRect/>
                     </a:stretch>
@@ -8962,7 +8922,7 @@
         <w:drawing>
           <wp:inline xmlns:a="http://schemas.openxmlformats.org/drawingml/2006/main" xmlns:pic="http://schemas.openxmlformats.org/drawingml/2006/picture">
             <wp:extent cx="6068533" cy="2379817"/>
-            <wp:docPr id="25" name="Picture 25"/>
+            <wp:docPr id="24" name="Picture 24"/>
             <wp:cNvGraphicFramePr>
               <a:graphicFrameLocks noChangeAspect="1"/>
             </wp:cNvGraphicFramePr>
@@ -8974,7 +8934,7 @@
                     <pic:cNvPicPr/>
                   </pic:nvPicPr>
                   <pic:blipFill>
-                    <a:blip r:embed="rId34"/>
+                    <a:blip r:embed="rId33"/>
                     <a:stretch>
                       <a:fillRect/>
                     </a:stretch>
@@ -9002,7 +8962,7 @@
         <w:drawing>
           <wp:inline xmlns:a="http://schemas.openxmlformats.org/drawingml/2006/main" xmlns:pic="http://schemas.openxmlformats.org/drawingml/2006/picture">
             <wp:extent cx="6068533" cy="2998569"/>
-            <wp:docPr id="26" name="Picture 26"/>
+            <wp:docPr id="25" name="Picture 25"/>
             <wp:cNvGraphicFramePr>
               <a:graphicFrameLocks noChangeAspect="1"/>
             </wp:cNvGraphicFramePr>
@@ -9014,7 +8974,7 @@
                     <pic:cNvPicPr/>
                   </pic:nvPicPr>
                   <pic:blipFill>
-                    <a:blip r:embed="rId35"/>
+                    <a:blip r:embed="rId34"/>
                     <a:stretch>
                       <a:fillRect/>
                     </a:stretch>
@@ -9534,7 +9494,7 @@
         <w:drawing>
           <wp:inline xmlns:a="http://schemas.openxmlformats.org/drawingml/2006/main" xmlns:pic="http://schemas.openxmlformats.org/drawingml/2006/picture">
             <wp:extent cx="6309360" cy="2474259"/>
-            <wp:docPr id="27" name="Picture 27"/>
+            <wp:docPr id="26" name="Picture 26"/>
             <wp:cNvGraphicFramePr>
               <a:graphicFrameLocks noChangeAspect="1"/>
             </wp:cNvGraphicFramePr>
@@ -9546,7 +9506,7 @@
                     <pic:cNvPicPr/>
                   </pic:nvPicPr>
                   <pic:blipFill>
-                    <a:blip r:embed="rId36"/>
+                    <a:blip r:embed="rId35"/>
                     <a:stretch>
                       <a:fillRect/>
                     </a:stretch>
@@ -9574,7 +9534,7 @@
         <w:drawing>
           <wp:inline xmlns:a="http://schemas.openxmlformats.org/drawingml/2006/main" xmlns:pic="http://schemas.openxmlformats.org/drawingml/2006/picture">
             <wp:extent cx="6309360" cy="2313432"/>
-            <wp:docPr id="28" name="Picture 28"/>
+            <wp:docPr id="27" name="Picture 27"/>
             <wp:cNvGraphicFramePr>
               <a:graphicFrameLocks noChangeAspect="1"/>
             </wp:cNvGraphicFramePr>
@@ -9586,7 +9546,7 @@
                     <pic:cNvPicPr/>
                   </pic:nvPicPr>
                   <pic:blipFill>
-                    <a:blip r:embed="rId37"/>
+                    <a:blip r:embed="rId36"/>
                     <a:stretch>
                       <a:fillRect/>
                     </a:stretch>
@@ -9816,7 +9776,7 @@
         <w:drawing>
           <wp:inline xmlns:a="http://schemas.openxmlformats.org/drawingml/2006/main" xmlns:pic="http://schemas.openxmlformats.org/drawingml/2006/picture">
             <wp:extent cx="6198686" cy="2430857"/>
-            <wp:docPr id="29" name="Picture 29"/>
+            <wp:docPr id="28" name="Picture 28"/>
             <wp:cNvGraphicFramePr>
               <a:graphicFrameLocks noChangeAspect="1"/>
             </wp:cNvGraphicFramePr>
@@ -9828,7 +9788,7 @@
                     <pic:cNvPicPr/>
                   </pic:nvPicPr>
                   <pic:blipFill>
-                    <a:blip r:embed="rId38"/>
+                    <a:blip r:embed="rId37"/>
                     <a:stretch>
                       <a:fillRect/>
                     </a:stretch>
@@ -9856,7 +9816,7 @@
         <w:drawing>
           <wp:inline xmlns:a="http://schemas.openxmlformats.org/drawingml/2006/main" xmlns:pic="http://schemas.openxmlformats.org/drawingml/2006/picture">
             <wp:extent cx="6198686" cy="2746868"/>
-            <wp:docPr id="30" name="Picture 30"/>
+            <wp:docPr id="29" name="Picture 29"/>
             <wp:cNvGraphicFramePr>
               <a:graphicFrameLocks noChangeAspect="1"/>
             </wp:cNvGraphicFramePr>
@@ -9868,7 +9828,7 @@
                     <pic:cNvPicPr/>
                   </pic:nvPicPr>
                   <pic:blipFill>
-                    <a:blip r:embed="rId39"/>
+                    <a:blip r:embed="rId38"/>
                     <a:stretch>
                       <a:fillRect/>
                     </a:stretch>
@@ -10414,7 +10374,7 @@
         <w:drawing>
           <wp:inline xmlns:a="http://schemas.openxmlformats.org/drawingml/2006/main" xmlns:pic="http://schemas.openxmlformats.org/drawingml/2006/picture">
             <wp:extent cx="6248239" cy="2450290"/>
-            <wp:docPr id="31" name="Picture 31"/>
+            <wp:docPr id="30" name="Picture 30"/>
             <wp:cNvGraphicFramePr>
               <a:graphicFrameLocks noChangeAspect="1"/>
             </wp:cNvGraphicFramePr>
@@ -10426,7 +10386,7 @@
                     <pic:cNvPicPr/>
                   </pic:nvPicPr>
                   <pic:blipFill>
-                    <a:blip r:embed="rId40"/>
+                    <a:blip r:embed="rId39"/>
                     <a:stretch>
                       <a:fillRect/>
                     </a:stretch>
@@ -10454,7 +10414,7 @@
         <w:drawing>
           <wp:inline xmlns:a="http://schemas.openxmlformats.org/drawingml/2006/main" xmlns:pic="http://schemas.openxmlformats.org/drawingml/2006/picture">
             <wp:extent cx="6248239" cy="2928096"/>
-            <wp:docPr id="32" name="Picture 32"/>
+            <wp:docPr id="31" name="Picture 31"/>
             <wp:cNvGraphicFramePr>
               <a:graphicFrameLocks noChangeAspect="1"/>
             </wp:cNvGraphicFramePr>
@@ -10466,7 +10426,7 @@
                     <pic:cNvPicPr/>
                   </pic:nvPicPr>
                   <pic:blipFill>
-                    <a:blip r:embed="rId41"/>
+                    <a:blip r:embed="rId40"/>
                     <a:stretch>
                       <a:fillRect/>
                     </a:stretch>
@@ -10986,6 +10946,46 @@
         <w:drawing>
           <wp:inline xmlns:a="http://schemas.openxmlformats.org/drawingml/2006/main" xmlns:pic="http://schemas.openxmlformats.org/drawingml/2006/picture">
             <wp:extent cx="6309360" cy="2474259"/>
+            <wp:docPr id="32" name="Picture 32"/>
+            <wp:cNvGraphicFramePr>
+              <a:graphicFrameLocks noChangeAspect="1"/>
+            </wp:cNvGraphicFramePr>
+            <a:graphic>
+              <a:graphicData uri="http://schemas.openxmlformats.org/drawingml/2006/picture">
+                <pic:pic>
+                  <pic:nvPicPr>
+                    <pic:cNvPr id="0" name="image.png"/>
+                    <pic:cNvPicPr/>
+                  </pic:nvPicPr>
+                  <pic:blipFill>
+                    <a:blip r:embed="rId41"/>
+                    <a:stretch>
+                      <a:fillRect/>
+                    </a:stretch>
+                  </pic:blipFill>
+                  <pic:spPr>
+                    <a:xfrm>
+                      <a:off x="0" y="0"/>
+                      <a:ext cx="6309360" cy="2474259"/>
+                    </a:xfrm>
+                    <a:prstGeom prst="rect"/>
+                  </pic:spPr>
+                </pic:pic>
+              </a:graphicData>
+            </a:graphic>
+          </wp:inline>
+        </w:drawing>
+      </w:r>
+    </w:p>
+    <w:p>
+      <w:pPr>
+        <w:spacing w:before="0" w:after="60" w:line="240" w:lineRule="auto"/>
+        <w:jc w:val="center"/>
+      </w:pPr>
+      <w:r>
+        <w:drawing>
+          <wp:inline xmlns:a="http://schemas.openxmlformats.org/drawingml/2006/main" xmlns:pic="http://schemas.openxmlformats.org/drawingml/2006/picture">
+            <wp:extent cx="6309360" cy="2474259"/>
             <wp:docPr id="33" name="Picture 33"/>
             <wp:cNvGraphicFramePr>
               <a:graphicFrameLocks noChangeAspect="1"/>
@@ -11015,6 +11015,208 @@
             </a:graphic>
           </wp:inline>
         </w:drawing>
+      </w:r>
+    </w:p>
+    <w:p>
+      <w:pPr>
+        <w:spacing w:before="0" w:after="40" w:line="240" w:lineRule="auto"/>
+        <w:ind w:left="533" w:hanging="360"/>
+        <w:numPr>
+          <w:ilvl w:val="0"/>
+          <w:numId w:val="9201"/>
+        </w:numPr>
+      </w:pPr>
+      <w:r>
+        <w:rPr>
+          <w:rFonts w:ascii="Arial" w:hAnsi="Arial"/>
+          <w:b w:val="0"/>
+          <w:sz w:val="24"/>
+        </w:rPr>
+        <w:t>The costs decreased by $167.32 due to usage of following services: EC2-Instances, VPC, EC2-Other.</w:t>
+      </w:r>
+    </w:p>
+    <w:p>
+      <w:pPr>
+        <w:spacing w:before="0" w:after="120" w:line="240" w:lineRule="auto"/>
+        <w:ind w:left="533" w:hanging="360"/>
+        <w:numPr>
+          <w:ilvl w:val="0"/>
+          <w:numId w:val="9201"/>
+        </w:numPr>
+      </w:pPr>
+      <w:r>
+        <w:rPr>
+          <w:rFonts w:ascii="Arial" w:hAnsi="Arial"/>
+          <w:b/>
+          <w:sz w:val="24"/>
+        </w:rPr>
+        <w:t>No Activity performed by Operisoft in this account.</w:t>
+      </w:r>
+    </w:p>
+    <w:p>
+      <w:pPr>
+        <w:keepNext/>
+        <w:spacing w:before="0" w:after="80" w:line="240" w:lineRule="auto"/>
+      </w:pPr>
+      <w:r>
+        <w:rPr>
+          <w:rFonts w:ascii="Arial" w:hAnsi="Arial"/>
+          <w:b/>
+          <w:i w:val="0"/>
+          <w:sz w:val="28"/>
+        </w:rPr>
+        <w:t>Resource Utilization &amp; Alarms</w:t>
+      </w:r>
+    </w:p>
+    <w:p>
+      <w:pPr>
+        <w:spacing w:before="0" w:after="40" w:line="240" w:lineRule="auto"/>
+      </w:pPr>
+      <w:r>
+        <w:rPr>
+          <w:rFonts w:ascii="Arial" w:hAnsi="Arial"/>
+          <w:b w:val="0"/>
+          <w:i w:val="0"/>
+          <w:sz w:val="22"/>
+        </w:rPr>
+        <w:t>No Resource Utilization &amp; Alarms.</w:t>
+      </w:r>
+    </w:p>
+    <w:p>
+      <w:pPr>
+        <w:pageBreakBefore/>
+        <w:spacing w:before="0" w:after="40" w:line="240" w:lineRule="auto"/>
+        <w:jc w:val="center"/>
+      </w:pPr>
+      <w:r>
+        <w:rPr>
+          <w:rFonts w:ascii="Arial" w:hAnsi="Arial"/>
+          <w:b/>
+          <w:sz w:val="19"/>
+        </w:rPr>
+        <w:t xml:space="preserve">------------------------------------------------------- </w:t>
+      </w:r>
+      <w:hyperlink w:anchor="Summary" w:history="1">
+        <w:r>
+          <w:rPr>
+            <w:rFonts w:ascii="Arial" w:hAnsi="Arial"/>
+            <w:b/>
+            <w:color w:val="1F487C"/>
+            <w:sz w:val="20"/>
+            <w:u w:val="single"/>
+          </w:rPr>
+          <w:t xml:space="preserve">Summary</w:t>
+        </w:r>
+      </w:hyperlink>
+      <w:r>
+        <w:rPr>
+          <w:rFonts w:ascii="Arial" w:hAnsi="Arial"/>
+          <w:b/>
+          <w:sz w:val="19"/>
+        </w:rPr>
+        <w:t xml:space="preserve"> -------------------------------------------------------</w:t>
+      </w:r>
+    </w:p>
+    <w:p>
+      <w:pPr>
+        <w:spacing w:before="0" w:after="40" w:line="240" w:lineRule="auto"/>
+        <w:jc w:val="center"/>
+      </w:pPr>
+      <w:bookmarkStart w:id="17" w:name="_acc_377555974222"/>
+      <w:r>
+        <w:rPr>
+          <w:rFonts w:ascii="Arial" w:hAnsi="Arial"/>
+          <w:b/>
+          <w:i w:val="0"/>
+          <w:sz w:val="28"/>
+          <w:u w:val="single"/>
+        </w:rPr>
+        <w:t>Aptrack AR_VR_MAAC – 377555974222</w:t>
+      </w:r>
+      <w:bookmarkEnd w:id="17"/>
+    </w:p>
+    <w:p>
+      <w:pPr>
+        <w:spacing w:before="0" w:after="80" w:line="240" w:lineRule="auto"/>
+      </w:pPr>
+      <w:r>
+        <w:rPr>
+          <w:rFonts w:ascii="Arial" w:hAnsi="Arial"/>
+          <w:b/>
+          <w:i w:val="0"/>
+          <w:sz w:val="19"/>
+        </w:rPr>
+        <w:t>--------------------------------------------------------------------------------------------------------------------------------</w:t>
+      </w:r>
+    </w:p>
+    <w:p>
+      <w:pPr>
+        <w:spacing w:before="0" w:after="60" w:line="240" w:lineRule="auto"/>
+        <w:ind w:left="533" w:hanging="360"/>
+        <w:numPr>
+          <w:ilvl w:val="0"/>
+          <w:numId w:val="9201"/>
+        </w:numPr>
+      </w:pPr>
+      <w:r>
+        <w:rPr>
+          <w:rFonts w:ascii="Arial" w:hAnsi="Arial"/>
+          <w:b/>
+          <w:sz w:val="24"/>
+        </w:rPr>
+        <w:t>Billing and Cost Overview</w:t>
+      </w:r>
+    </w:p>
+    <w:p>
+      <w:pPr>
+        <w:spacing w:before="0" w:after="40" w:line="240" w:lineRule="auto"/>
+        <w:ind w:left="1354" w:hanging="360"/>
+        <w:numPr>
+          <w:ilvl w:val="1"/>
+          <w:numId w:val="9101"/>
+        </w:numPr>
+      </w:pPr>
+      <w:r>
+        <w:rPr>
+          <w:rFonts w:ascii="Arial" w:hAnsi="Arial"/>
+          <w:b w:val="0"/>
+          <w:sz w:val="24"/>
+        </w:rPr>
+        <w:t xml:space="preserve">Total cost for the week: </w:t>
+      </w:r>
+      <w:r>
+        <w:rPr>
+          <w:rFonts w:ascii="Arial" w:hAnsi="Arial"/>
+          <w:b/>
+          <w:sz w:val="24"/>
+        </w:rPr>
+        <w:t>$1,226.69</w:t>
+      </w:r>
+    </w:p>
+    <w:p>
+      <w:pPr>
+        <w:spacing w:before="0" w:after="80" w:line="240" w:lineRule="auto"/>
+        <w:ind w:left="1354" w:hanging="360"/>
+        <w:numPr>
+          <w:ilvl w:val="1"/>
+          <w:numId w:val="9101"/>
+        </w:numPr>
+      </w:pPr>
+      <w:r>
+        <w:rPr>
+          <w:rFonts w:ascii="Arial" w:hAnsi="Arial"/>
+          <w:b w:val="0"/>
+          <w:sz w:val="24"/>
+        </w:rPr>
+        <w:t xml:space="preserve">Average Daily Cost: </w:t>
+      </w:r>
+      <w:r>
+        <w:rPr>
+          <w:rFonts w:ascii="Arial" w:hAnsi="Arial"/>
+          <w:b/>
+          <w:sz w:val="24"/>
+        </w:rPr>
+        <w:t>$175.24</w:t>
       </w:r>
     </w:p>
     <w:p>
@@ -11059,215 +11261,13 @@
     </w:p>
     <w:p>
       <w:pPr>
-        <w:spacing w:before="0" w:after="40" w:line="240" w:lineRule="auto"/>
-        <w:ind w:left="533" w:hanging="360"/>
-        <w:numPr>
-          <w:ilvl w:val="0"/>
-          <w:numId w:val="9201"/>
-        </w:numPr>
-      </w:pPr>
-      <w:r>
-        <w:rPr>
-          <w:rFonts w:ascii="Arial" w:hAnsi="Arial"/>
-          <w:b w:val="0"/>
-          <w:sz w:val="24"/>
-        </w:rPr>
-        <w:t>The costs decreased by $167.32 due to usage of following services: EC2-Instances, VPC, EC2-Other.</w:t>
-      </w:r>
-    </w:p>
-    <w:p>
-      <w:pPr>
-        <w:spacing w:before="0" w:after="120" w:line="240" w:lineRule="auto"/>
-        <w:ind w:left="533" w:hanging="360"/>
-        <w:numPr>
-          <w:ilvl w:val="0"/>
-          <w:numId w:val="9201"/>
-        </w:numPr>
-      </w:pPr>
-      <w:r>
-        <w:rPr>
-          <w:rFonts w:ascii="Arial" w:hAnsi="Arial"/>
-          <w:b/>
-          <w:sz w:val="24"/>
-        </w:rPr>
-        <w:t>No Activity performed by Operisoft in this account.</w:t>
-      </w:r>
-    </w:p>
-    <w:p>
-      <w:pPr>
-        <w:keepNext/>
-        <w:spacing w:before="0" w:after="80" w:line="240" w:lineRule="auto"/>
-      </w:pPr>
-      <w:r>
-        <w:rPr>
-          <w:rFonts w:ascii="Arial" w:hAnsi="Arial"/>
-          <w:b/>
-          <w:i w:val="0"/>
-          <w:sz w:val="28"/>
-        </w:rPr>
-        <w:t>Resource Utilization &amp; Alarms</w:t>
-      </w:r>
-    </w:p>
-    <w:p>
-      <w:pPr>
-        <w:spacing w:before="0" w:after="40" w:line="240" w:lineRule="auto"/>
-      </w:pPr>
-      <w:r>
-        <w:rPr>
-          <w:rFonts w:ascii="Arial" w:hAnsi="Arial"/>
-          <w:b w:val="0"/>
-          <w:i w:val="0"/>
-          <w:sz w:val="22"/>
-        </w:rPr>
-        <w:t>No Resource Utilization &amp; Alarms.</w:t>
-      </w:r>
-    </w:p>
-    <w:p>
-      <w:pPr>
-        <w:pageBreakBefore/>
-        <w:spacing w:before="0" w:after="40" w:line="240" w:lineRule="auto"/>
-        <w:jc w:val="center"/>
-      </w:pPr>
-      <w:r>
-        <w:rPr>
-          <w:rFonts w:ascii="Arial" w:hAnsi="Arial"/>
-          <w:b/>
-          <w:sz w:val="19"/>
-        </w:rPr>
-        <w:t xml:space="preserve">------------------------------------------------------- </w:t>
-      </w:r>
-      <w:hyperlink w:anchor="Summary" w:history="1">
-        <w:r>
-          <w:rPr>
-            <w:rFonts w:ascii="Arial" w:hAnsi="Arial"/>
-            <w:b/>
-            <w:color w:val="1F487C"/>
-            <w:sz w:val="20"/>
-            <w:u w:val="single"/>
-          </w:rPr>
-          <w:t xml:space="preserve">Summary</w:t>
-        </w:r>
-      </w:hyperlink>
-      <w:r>
-        <w:rPr>
-          <w:rFonts w:ascii="Arial" w:hAnsi="Arial"/>
-          <w:b/>
-          <w:sz w:val="19"/>
-        </w:rPr>
-        <w:t xml:space="preserve"> -------------------------------------------------------</w:t>
-      </w:r>
-    </w:p>
-    <w:p>
-      <w:pPr>
-        <w:spacing w:before="0" w:after="40" w:line="240" w:lineRule="auto"/>
-        <w:jc w:val="center"/>
-      </w:pPr>
-      <w:bookmarkStart w:id="17" w:name="_acc_377555974222"/>
-      <w:r>
-        <w:rPr>
-          <w:rFonts w:ascii="Arial" w:hAnsi="Arial"/>
-          <w:b/>
-          <w:i w:val="0"/>
-          <w:sz w:val="28"/>
-          <w:u w:val="single"/>
-        </w:rPr>
-        <w:t>Aptrack AR_VR_MAAC – 377555974222</w:t>
-      </w:r>
-      <w:bookmarkEnd w:id="17"/>
-    </w:p>
-    <w:p>
-      <w:pPr>
-        <w:spacing w:before="0" w:after="80" w:line="240" w:lineRule="auto"/>
-      </w:pPr>
-      <w:r>
-        <w:rPr>
-          <w:rFonts w:ascii="Arial" w:hAnsi="Arial"/>
-          <w:b/>
-          <w:i w:val="0"/>
-          <w:sz w:val="19"/>
-        </w:rPr>
-        <w:t>--------------------------------------------------------------------------------------------------------------------------------</w:t>
-      </w:r>
-    </w:p>
-    <w:p>
-      <w:pPr>
-        <w:spacing w:before="0" w:after="60" w:line="240" w:lineRule="auto"/>
-        <w:ind w:left="533" w:hanging="360"/>
-        <w:numPr>
-          <w:ilvl w:val="0"/>
-          <w:numId w:val="9201"/>
-        </w:numPr>
-      </w:pPr>
-      <w:r>
-        <w:rPr>
-          <w:rFonts w:ascii="Arial" w:hAnsi="Arial"/>
-          <w:b/>
-          <w:sz w:val="24"/>
-        </w:rPr>
-        <w:t>Billing and Cost Overview</w:t>
-      </w:r>
-    </w:p>
-    <w:p>
-      <w:pPr>
-        <w:spacing w:before="0" w:after="40" w:line="240" w:lineRule="auto"/>
-        <w:ind w:left="1354" w:hanging="360"/>
-        <w:numPr>
-          <w:ilvl w:val="1"/>
-          <w:numId w:val="9101"/>
-        </w:numPr>
-      </w:pPr>
-      <w:r>
-        <w:rPr>
-          <w:rFonts w:ascii="Arial" w:hAnsi="Arial"/>
-          <w:b w:val="0"/>
-          <w:sz w:val="24"/>
-        </w:rPr>
-        <w:t xml:space="preserve">Total cost for the week: </w:t>
-      </w:r>
-      <w:r>
-        <w:rPr>
-          <w:rFonts w:ascii="Arial" w:hAnsi="Arial"/>
-          <w:b/>
-          <w:sz w:val="24"/>
-        </w:rPr>
-        <w:t>$1,226.69</w:t>
-      </w:r>
-    </w:p>
-    <w:p>
-      <w:pPr>
-        <w:spacing w:before="0" w:after="80" w:line="240" w:lineRule="auto"/>
-        <w:ind w:left="1354" w:hanging="360"/>
-        <w:numPr>
-          <w:ilvl w:val="1"/>
-          <w:numId w:val="9101"/>
-        </w:numPr>
-      </w:pPr>
-      <w:r>
-        <w:rPr>
-          <w:rFonts w:ascii="Arial" w:hAnsi="Arial"/>
-          <w:b w:val="0"/>
-          <w:sz w:val="24"/>
-        </w:rPr>
-        <w:t xml:space="preserve">Average Daily Cost: </w:t>
-      </w:r>
-      <w:r>
-        <w:rPr>
-          <w:rFonts w:ascii="Arial" w:hAnsi="Arial"/>
-          <w:b/>
-          <w:sz w:val="24"/>
-        </w:rPr>
-        <w:t>$175.24</w:t>
-      </w:r>
-    </w:p>
-    <w:p>
-      <w:pPr>
         <w:spacing w:before="0" w:after="60" w:line="240" w:lineRule="auto"/>
         <w:jc w:val="center"/>
       </w:pPr>
       <w:r>
         <w:drawing>
           <wp:inline xmlns:a="http://schemas.openxmlformats.org/drawingml/2006/main" xmlns:pic="http://schemas.openxmlformats.org/drawingml/2006/picture">
-            <wp:extent cx="6309360" cy="2474259"/>
+            <wp:extent cx="6309360" cy="2313432"/>
             <wp:docPr id="35" name="Picture 35"/>
             <wp:cNvGraphicFramePr>
               <a:graphicFrameLocks noChangeAspect="1"/>
@@ -11281,46 +11281,6 @@
                   </pic:nvPicPr>
                   <pic:blipFill>
                     <a:blip r:embed="rId44"/>
-                    <a:stretch>
-                      <a:fillRect/>
-                    </a:stretch>
-                  </pic:blipFill>
-                  <pic:spPr>
-                    <a:xfrm>
-                      <a:off x="0" y="0"/>
-                      <a:ext cx="6309360" cy="2474259"/>
-                    </a:xfrm>
-                    <a:prstGeom prst="rect"/>
-                  </pic:spPr>
-                </pic:pic>
-              </a:graphicData>
-            </a:graphic>
-          </wp:inline>
-        </w:drawing>
-      </w:r>
-    </w:p>
-    <w:p>
-      <w:pPr>
-        <w:spacing w:before="0" w:after="60" w:line="240" w:lineRule="auto"/>
-        <w:jc w:val="center"/>
-      </w:pPr>
-      <w:r>
-        <w:drawing>
-          <wp:inline xmlns:a="http://schemas.openxmlformats.org/drawingml/2006/main" xmlns:pic="http://schemas.openxmlformats.org/drawingml/2006/picture">
-            <wp:extent cx="6309360" cy="2313432"/>
-            <wp:docPr id="36" name="Picture 36"/>
-            <wp:cNvGraphicFramePr>
-              <a:graphicFrameLocks noChangeAspect="1"/>
-            </wp:cNvGraphicFramePr>
-            <a:graphic>
-              <a:graphicData uri="http://schemas.openxmlformats.org/drawingml/2006/picture">
-                <pic:pic>
-                  <pic:nvPicPr>
-                    <pic:cNvPr id="0" name="image.png"/>
-                    <pic:cNvPicPr/>
-                  </pic:nvPicPr>
-                  <pic:blipFill>
-                    <a:blip r:embed="rId45"/>
                     <a:stretch>
                       <a:fillRect/>
                     </a:stretch>
@@ -11840,7 +11800,7 @@
         <w:drawing>
           <wp:inline xmlns:a="http://schemas.openxmlformats.org/drawingml/2006/main" xmlns:pic="http://schemas.openxmlformats.org/drawingml/2006/picture">
             <wp:extent cx="6309360" cy="2474259"/>
-            <wp:docPr id="37" name="Picture 37"/>
+            <wp:docPr id="36" name="Picture 36"/>
             <wp:cNvGraphicFramePr>
               <a:graphicFrameLocks noChangeAspect="1"/>
             </wp:cNvGraphicFramePr>
@@ -11852,7 +11812,7 @@
                     <pic:cNvPicPr/>
                   </pic:nvPicPr>
                   <pic:blipFill>
-                    <a:blip r:embed="rId46"/>
+                    <a:blip r:embed="rId45"/>
                     <a:stretch>
                       <a:fillRect/>
                     </a:stretch>
@@ -11880,7 +11840,7 @@
         <w:drawing>
           <wp:inline xmlns:a="http://schemas.openxmlformats.org/drawingml/2006/main" xmlns:pic="http://schemas.openxmlformats.org/drawingml/2006/picture">
             <wp:extent cx="6309360" cy="1830952"/>
-            <wp:docPr id="38" name="Picture 38"/>
+            <wp:docPr id="37" name="Picture 37"/>
             <wp:cNvGraphicFramePr>
               <a:graphicFrameLocks noChangeAspect="1"/>
             </wp:cNvGraphicFramePr>
@@ -11892,7 +11852,7 @@
                     <pic:cNvPicPr/>
                   </pic:nvPicPr>
                   <pic:blipFill>
-                    <a:blip r:embed="rId47"/>
+                    <a:blip r:embed="rId46"/>
                     <a:stretch>
                       <a:fillRect/>
                     </a:stretch>
@@ -12438,7 +12398,7 @@
         <w:drawing>
           <wp:inline xmlns:a="http://schemas.openxmlformats.org/drawingml/2006/main" xmlns:pic="http://schemas.openxmlformats.org/drawingml/2006/picture">
             <wp:extent cx="6309360" cy="2474259"/>
-            <wp:docPr id="39" name="Picture 39"/>
+            <wp:docPr id="38" name="Picture 38"/>
             <wp:cNvGraphicFramePr>
               <a:graphicFrameLocks noChangeAspect="1"/>
             </wp:cNvGraphicFramePr>
@@ -12450,7 +12410,7 @@
                     <pic:cNvPicPr/>
                   </pic:nvPicPr>
                   <pic:blipFill>
-                    <a:blip r:embed="rId48"/>
+                    <a:blip r:embed="rId47"/>
                     <a:stretch>
                       <a:fillRect/>
                     </a:stretch>
@@ -12478,7 +12438,7 @@
         <w:drawing>
           <wp:inline xmlns:a="http://schemas.openxmlformats.org/drawingml/2006/main" xmlns:pic="http://schemas.openxmlformats.org/drawingml/2006/picture">
             <wp:extent cx="6309360" cy="1991778"/>
-            <wp:docPr id="40" name="Picture 40"/>
+            <wp:docPr id="39" name="Picture 39"/>
             <wp:cNvGraphicFramePr>
               <a:graphicFrameLocks noChangeAspect="1"/>
             </wp:cNvGraphicFramePr>
@@ -12490,7 +12450,7 @@
                     <pic:cNvPicPr/>
                   </pic:nvPicPr>
                   <pic:blipFill>
-                    <a:blip r:embed="rId49"/>
+                    <a:blip r:embed="rId48"/>
                     <a:stretch>
                       <a:fillRect/>
                     </a:stretch>
@@ -12746,7 +12706,7 @@
         <w:drawing>
           <wp:inline xmlns:a="http://schemas.openxmlformats.org/drawingml/2006/main" xmlns:pic="http://schemas.openxmlformats.org/drawingml/2006/picture">
             <wp:extent cx="6309360" cy="2474259"/>
-            <wp:docPr id="41" name="Picture 41"/>
+            <wp:docPr id="40" name="Picture 40"/>
             <wp:cNvGraphicFramePr>
               <a:graphicFrameLocks noChangeAspect="1"/>
             </wp:cNvGraphicFramePr>
@@ -12758,7 +12718,7 @@
                     <pic:cNvPicPr/>
                   </pic:nvPicPr>
                   <pic:blipFill>
-                    <a:blip r:embed="rId50"/>
+                    <a:blip r:embed="rId49"/>
                     <a:stretch>
                       <a:fillRect/>
                     </a:stretch>
@@ -12786,7 +12746,7 @@
         <w:drawing>
           <wp:inline xmlns:a="http://schemas.openxmlformats.org/drawingml/2006/main" xmlns:pic="http://schemas.openxmlformats.org/drawingml/2006/picture">
             <wp:extent cx="6309360" cy="2313432"/>
-            <wp:docPr id="42" name="Picture 42"/>
+            <wp:docPr id="41" name="Picture 41"/>
             <wp:cNvGraphicFramePr>
               <a:graphicFrameLocks noChangeAspect="1"/>
             </wp:cNvGraphicFramePr>
@@ -12798,7 +12758,7 @@
                     <pic:cNvPicPr/>
                   </pic:nvPicPr>
                   <pic:blipFill>
-                    <a:blip r:embed="rId51"/>
+                    <a:blip r:embed="rId50"/>
                     <a:stretch>
                       <a:fillRect/>
                     </a:stretch>
@@ -13261,7 +13221,7 @@
         <w:drawing>
           <wp:inline xmlns:a="http://schemas.openxmlformats.org/drawingml/2006/main" xmlns:pic="http://schemas.openxmlformats.org/drawingml/2006/picture">
             <wp:extent cx="6309360" cy="2474259"/>
-            <wp:docPr id="43" name="Picture 43"/>
+            <wp:docPr id="42" name="Picture 42"/>
             <wp:cNvGraphicFramePr>
               <a:graphicFrameLocks noChangeAspect="1"/>
             </wp:cNvGraphicFramePr>
@@ -13273,7 +13233,7 @@
                     <pic:cNvPicPr/>
                   </pic:nvPicPr>
                   <pic:blipFill>
-                    <a:blip r:embed="rId52"/>
+                    <a:blip r:embed="rId51"/>
                     <a:stretch>
                       <a:fillRect/>
                     </a:stretch>
@@ -13301,7 +13261,7 @@
         <w:drawing>
           <wp:inline xmlns:a="http://schemas.openxmlformats.org/drawingml/2006/main" xmlns:pic="http://schemas.openxmlformats.org/drawingml/2006/picture">
             <wp:extent cx="6309360" cy="2474259"/>
-            <wp:docPr id="44" name="Picture 44"/>
+            <wp:docPr id="43" name="Picture 43"/>
             <wp:cNvGraphicFramePr>
               <a:graphicFrameLocks noChangeAspect="1"/>
             </wp:cNvGraphicFramePr>
@@ -13313,7 +13273,7 @@
                     <pic:cNvPicPr/>
                   </pic:nvPicPr>
                   <pic:blipFill>
-                    <a:blip r:embed="rId53"/>
+                    <a:blip r:embed="rId52"/>
                     <a:stretch>
                       <a:fillRect/>
                     </a:stretch>

</xml_diff>

<commit_message>
Remove page-2 report title/date line to match client reference
The reference summary page starts directly at 'Cost Summary Difference of All
AWS Accounts'; the report name and date range stay only on the cover page.
Regenerate ajreport_20261004.docx/.pdf.
</commit_message>
<xml_diff>
--- a/ajreport_20261004.docx
+++ b/ajreport_20261004.docx
@@ -204,24 +204,6 @@
         <w:pageBreakBefore/>
         <w:spacing w:before="0" w:after="0" w:line="240" w:lineRule="auto"/>
       </w:pPr>
-    </w:p>
-    <w:p>
-      <w:pPr>
-        <w:spacing w:before="0" w:after="40" w:line="240" w:lineRule="auto"/>
-        <w:jc w:val="center"/>
-      </w:pPr>
-      <w:r>
-        <w:rPr>
-          <w:rFonts w:ascii="Arial" w:hAnsi="Arial"/>
-          <w:b/>
-          <w:i w:val="0"/>
-          <w:color w:val="1F487C"/>
-          <w:sz w:val="30"/>
-        </w:rPr>
-        <w:t>Aptech Limited Weekly Status Report</w:t>
-        <w:br/>
-        <w:t>(28 September to 04 October 2026)</w:t>
-      </w:r>
     </w:p>
     <w:p>
       <w:pPr>

</xml_diff>

<commit_message>
Center the 'Summary' back-link banner on account pages
Use balanced equal-length dash runs on both sides so the centered paragraph
keeps 'Summary' in the middle (previously left-heavy dashes pushed it right).
Regenerate ajreport_20261004.docx/.pdf.
</commit_message>
<xml_diff>
--- a/ajreport_20261004.docx
+++ b/ajreport_20261004.docx
@@ -3816,7 +3816,7 @@
           <w:b/>
           <w:sz w:val="19"/>
         </w:rPr>
-        <w:t xml:space="preserve">------------------------------------------------------- </w:t>
+        <w:t xml:space="preserve">-------------------------------------------- </w:t>
       </w:r>
       <w:hyperlink w:anchor="Summary" w:history="1">
         <w:r>
@@ -3836,7 +3836,7 @@
           <w:b/>
           <w:sz w:val="19"/>
         </w:rPr>
-        <w:t xml:space="preserve"> -------------------------------------------------------</w:t>
+        <w:t xml:space="preserve"> --------------------------------------------</w:t>
       </w:r>
     </w:p>
     <w:p>
@@ -4388,7 +4388,7 @@
           <w:b/>
           <w:sz w:val="19"/>
         </w:rPr>
-        <w:t xml:space="preserve">------------------------------------------------------- </w:t>
+        <w:t xml:space="preserve">-------------------------------------------- </w:t>
       </w:r>
       <w:hyperlink w:anchor="Summary" w:history="1">
         <w:r>
@@ -4408,7 +4408,7 @@
           <w:b/>
           <w:sz w:val="19"/>
         </w:rPr>
-        <w:t xml:space="preserve"> -------------------------------------------------------</w:t>
+        <w:t xml:space="preserve"> --------------------------------------------</w:t>
       </w:r>
     </w:p>
     <w:p>
@@ -5069,7 +5069,7 @@
           <w:b/>
           <w:sz w:val="19"/>
         </w:rPr>
-        <w:t xml:space="preserve">------------------------------------------------------- </w:t>
+        <w:t xml:space="preserve">-------------------------------------------- </w:t>
       </w:r>
       <w:hyperlink w:anchor="Summary" w:history="1">
         <w:r>
@@ -5089,7 +5089,7 @@
           <w:b/>
           <w:sz w:val="19"/>
         </w:rPr>
-        <w:t xml:space="preserve"> -------------------------------------------------------</w:t>
+        <w:t xml:space="preserve"> --------------------------------------------</w:t>
       </w:r>
     </w:p>
     <w:p>
@@ -5351,7 +5351,7 @@
           <w:b/>
           <w:sz w:val="19"/>
         </w:rPr>
-        <w:t xml:space="preserve">------------------------------------------------------- </w:t>
+        <w:t xml:space="preserve">-------------------------------------------- </w:t>
       </w:r>
       <w:hyperlink w:anchor="Summary" w:history="1">
         <w:r>
@@ -5371,7 +5371,7 @@
           <w:b/>
           <w:sz w:val="19"/>
         </w:rPr>
-        <w:t xml:space="preserve"> -------------------------------------------------------</w:t>
+        <w:t xml:space="preserve"> --------------------------------------------</w:t>
       </w:r>
     </w:p>
     <w:p>
@@ -5923,7 +5923,7 @@
           <w:b/>
           <w:sz w:val="19"/>
         </w:rPr>
-        <w:t xml:space="preserve">------------------------------------------------------- </w:t>
+        <w:t xml:space="preserve">-------------------------------------------- </w:t>
       </w:r>
       <w:hyperlink w:anchor="Summary" w:history="1">
         <w:r>
@@ -5943,7 +5943,7 @@
           <w:b/>
           <w:sz w:val="19"/>
         </w:rPr>
-        <w:t xml:space="preserve"> -------------------------------------------------------</w:t>
+        <w:t xml:space="preserve"> --------------------------------------------</w:t>
       </w:r>
     </w:p>
     <w:p>
@@ -6438,7 +6438,7 @@
           <w:b/>
           <w:sz w:val="19"/>
         </w:rPr>
-        <w:t xml:space="preserve">------------------------------------------------------- </w:t>
+        <w:t xml:space="preserve">-------------------------------------------- </w:t>
       </w:r>
       <w:hyperlink w:anchor="Summary" w:history="1">
         <w:r>
@@ -6458,7 +6458,7 @@
           <w:b/>
           <w:sz w:val="19"/>
         </w:rPr>
-        <w:t xml:space="preserve"> -------------------------------------------------------</w:t>
+        <w:t xml:space="preserve"> --------------------------------------------</w:t>
       </w:r>
     </w:p>
     <w:p>
@@ -6720,7 +6720,7 @@
           <w:b/>
           <w:sz w:val="19"/>
         </w:rPr>
-        <w:t xml:space="preserve">------------------------------------------------------- </w:t>
+        <w:t xml:space="preserve">-------------------------------------------- </w:t>
       </w:r>
       <w:hyperlink w:anchor="Summary" w:history="1">
         <w:r>
@@ -6740,7 +6740,7 @@
           <w:b/>
           <w:sz w:val="19"/>
         </w:rPr>
-        <w:t xml:space="preserve"> -------------------------------------------------------</w:t>
+        <w:t xml:space="preserve"> --------------------------------------------</w:t>
       </w:r>
     </w:p>
     <w:p>
@@ -7318,7 +7318,7 @@
           <w:b/>
           <w:sz w:val="19"/>
         </w:rPr>
-        <w:t xml:space="preserve">------------------------------------------------------- </w:t>
+        <w:t xml:space="preserve">-------------------------------------------- </w:t>
       </w:r>
       <w:hyperlink w:anchor="Summary" w:history="1">
         <w:r>
@@ -7338,7 +7338,7 @@
           <w:b/>
           <w:sz w:val="19"/>
         </w:rPr>
-        <w:t xml:space="preserve"> -------------------------------------------------------</w:t>
+        <w:t xml:space="preserve"> --------------------------------------------</w:t>
       </w:r>
     </w:p>
     <w:p>
@@ -7973,7 +7973,7 @@
           <w:b/>
           <w:sz w:val="19"/>
         </w:rPr>
-        <w:t xml:space="preserve">------------------------------------------------------- </w:t>
+        <w:t xml:space="preserve">-------------------------------------------- </w:t>
       </w:r>
       <w:hyperlink w:anchor="Summary" w:history="1">
         <w:r>
@@ -7993,7 +7993,7 @@
           <w:b/>
           <w:sz w:val="19"/>
         </w:rPr>
-        <w:t xml:space="preserve"> -------------------------------------------------------</w:t>
+        <w:t xml:space="preserve"> --------------------------------------------</w:t>
       </w:r>
     </w:p>
     <w:p>
@@ -8281,7 +8281,7 @@
           <w:b/>
           <w:sz w:val="19"/>
         </w:rPr>
-        <w:t xml:space="preserve">------------------------------------------------------- </w:t>
+        <w:t xml:space="preserve">-------------------------------------------- </w:t>
       </w:r>
       <w:hyperlink w:anchor="Summary" w:history="1">
         <w:r>
@@ -8301,7 +8301,7 @@
           <w:b/>
           <w:sz w:val="19"/>
         </w:rPr>
-        <w:t xml:space="preserve"> -------------------------------------------------------</w:t>
+        <w:t xml:space="preserve"> --------------------------------------------</w:t>
       </w:r>
     </w:p>
     <w:p>
@@ -8770,7 +8770,7 @@
           <w:b/>
           <w:sz w:val="19"/>
         </w:rPr>
-        <w:t xml:space="preserve">------------------------------------------------------- </w:t>
+        <w:t xml:space="preserve">-------------------------------------------- </w:t>
       </w:r>
       <w:hyperlink w:anchor="Summary" w:history="1">
         <w:r>
@@ -8790,7 +8790,7 @@
           <w:b/>
           <w:sz w:val="19"/>
         </w:rPr>
-        <w:t xml:space="preserve"> -------------------------------------------------------</w:t>
+        <w:t xml:space="preserve"> --------------------------------------------</w:t>
       </w:r>
     </w:p>
     <w:p>
@@ -9342,7 +9342,7 @@
           <w:b/>
           <w:sz w:val="19"/>
         </w:rPr>
-        <w:t xml:space="preserve">------------------------------------------------------- </w:t>
+        <w:t xml:space="preserve">-------------------------------------------- </w:t>
       </w:r>
       <w:hyperlink w:anchor="Summary" w:history="1">
         <w:r>
@@ -9362,7 +9362,7 @@
           <w:b/>
           <w:sz w:val="19"/>
         </w:rPr>
-        <w:t xml:space="preserve"> -------------------------------------------------------</w:t>
+        <w:t xml:space="preserve"> --------------------------------------------</w:t>
       </w:r>
     </w:p>
     <w:p>
@@ -9624,7 +9624,7 @@
           <w:b/>
           <w:sz w:val="19"/>
         </w:rPr>
-        <w:t xml:space="preserve">------------------------------------------------------- </w:t>
+        <w:t xml:space="preserve">-------------------------------------------- </w:t>
       </w:r>
       <w:hyperlink w:anchor="Summary" w:history="1">
         <w:r>
@@ -9644,7 +9644,7 @@
           <w:b/>
           <w:sz w:val="19"/>
         </w:rPr>
-        <w:t xml:space="preserve"> -------------------------------------------------------</w:t>
+        <w:t xml:space="preserve"> --------------------------------------------</w:t>
       </w:r>
     </w:p>
     <w:p>
@@ -10222,7 +10222,7 @@
           <w:b/>
           <w:sz w:val="19"/>
         </w:rPr>
-        <w:t xml:space="preserve">------------------------------------------------------- </w:t>
+        <w:t xml:space="preserve">-------------------------------------------- </w:t>
       </w:r>
       <w:hyperlink w:anchor="Summary" w:history="1">
         <w:r>
@@ -10242,7 +10242,7 @@
           <w:b/>
           <w:sz w:val="19"/>
         </w:rPr>
-        <w:t xml:space="preserve"> -------------------------------------------------------</w:t>
+        <w:t xml:space="preserve"> --------------------------------------------</w:t>
       </w:r>
     </w:p>
     <w:p>
@@ -10794,7 +10794,7 @@
           <w:b/>
           <w:sz w:val="19"/>
         </w:rPr>
-        <w:t xml:space="preserve">------------------------------------------------------- </w:t>
+        <w:t xml:space="preserve">-------------------------------------------- </w:t>
       </w:r>
       <w:hyperlink w:anchor="Summary" w:history="1">
         <w:r>
@@ -10814,7 +10814,7 @@
           <w:b/>
           <w:sz w:val="19"/>
         </w:rPr>
-        <w:t xml:space="preserve"> -------------------------------------------------------</w:t>
+        <w:t xml:space="preserve"> --------------------------------------------</w:t>
       </w:r>
     </w:p>
     <w:p>
@@ -11076,7 +11076,7 @@
           <w:b/>
           <w:sz w:val="19"/>
         </w:rPr>
-        <w:t xml:space="preserve">------------------------------------------------------- </w:t>
+        <w:t xml:space="preserve">-------------------------------------------- </w:t>
       </w:r>
       <w:hyperlink w:anchor="Summary" w:history="1">
         <w:r>
@@ -11096,7 +11096,7 @@
           <w:b/>
           <w:sz w:val="19"/>
         </w:rPr>
-        <w:t xml:space="preserve"> -------------------------------------------------------</w:t>
+        <w:t xml:space="preserve"> --------------------------------------------</w:t>
       </w:r>
     </w:p>
     <w:p>
@@ -11648,7 +11648,7 @@
           <w:b/>
           <w:sz w:val="19"/>
         </w:rPr>
-        <w:t xml:space="preserve">------------------------------------------------------- </w:t>
+        <w:t xml:space="preserve">-------------------------------------------- </w:t>
       </w:r>
       <w:hyperlink w:anchor="Summary" w:history="1">
         <w:r>
@@ -11668,7 +11668,7 @@
           <w:b/>
           <w:sz w:val="19"/>
         </w:rPr>
-        <w:t xml:space="preserve"> -------------------------------------------------------</w:t>
+        <w:t xml:space="preserve"> --------------------------------------------</w:t>
       </w:r>
     </w:p>
     <w:p>
@@ -12246,7 +12246,7 @@
           <w:b/>
           <w:sz w:val="19"/>
         </w:rPr>
-        <w:t xml:space="preserve">------------------------------------------------------- </w:t>
+        <w:t xml:space="preserve">-------------------------------------------- </w:t>
       </w:r>
       <w:hyperlink w:anchor="Summary" w:history="1">
         <w:r>
@@ -12266,7 +12266,7 @@
           <w:b/>
           <w:sz w:val="19"/>
         </w:rPr>
-        <w:t xml:space="preserve"> -------------------------------------------------------</w:t>
+        <w:t xml:space="preserve"> --------------------------------------------</w:t>
       </w:r>
     </w:p>
     <w:p>
@@ -12554,7 +12554,7 @@
           <w:b/>
           <w:sz w:val="19"/>
         </w:rPr>
-        <w:t xml:space="preserve">------------------------------------------------------- </w:t>
+        <w:t xml:space="preserve">-------------------------------------------- </w:t>
       </w:r>
       <w:hyperlink w:anchor="Summary" w:history="1">
         <w:r>
@@ -12574,7 +12574,7 @@
           <w:b/>
           <w:sz w:val="19"/>
         </w:rPr>
-        <w:t xml:space="preserve"> -------------------------------------------------------</w:t>
+        <w:t xml:space="preserve"> --------------------------------------------</w:t>
       </w:r>
     </w:p>
     <w:p>
@@ -13069,7 +13069,7 @@
           <w:b/>
           <w:sz w:val="19"/>
         </w:rPr>
-        <w:t xml:space="preserve">------------------------------------------------------- </w:t>
+        <w:t xml:space="preserve">-------------------------------------------- </w:t>
       </w:r>
       <w:hyperlink w:anchor="Summary" w:history="1">
         <w:r>
@@ -13089,7 +13089,7 @@
           <w:b/>
           <w:sz w:val="19"/>
         </w:rPr>
-        <w:t xml:space="preserve"> -------------------------------------------------------</w:t>
+        <w:t xml:space="preserve"> --------------------------------------------</w:t>
       </w:r>
     </w:p>
     <w:p>

</xml_diff>